<commit_message>
docs: documento de la entrega, contratos, notas y guía al día
</commit_message>
<xml_diff>
--- a/docs/entrega3/Entrega_Parcial_2_Integracion.docx
+++ b/docs/entrega3/Entrega_Parcial_2_Integracion.docx
@@ -38,8 +38,8 @@
         <w:tblLayout w:type="fixed"/>
       </w:tblPr>
       <w:tblGrid>
-        <w:gridCol w:w="2339"/>
-        <w:gridCol w:w="7073"/>
+        <w:gridCol w:w="2069"/>
+        <w:gridCol w:w="7343"/>
       </w:tblGrid>
       <w:tr>
         <w:trPr>
@@ -47,7 +47,7 @@
         </w:trPr>
         <w:tc>
           <w:tcPr>
-            <w:tcW w:type="dxa" w:w="2339"/>
+            <w:tcW w:type="dxa" w:w="2069"/>
             <w:tcBorders>
               <w:top w:val="single" w:color="BFBFBF" w:sz="4"/>
               <w:left w:val="single" w:color="BFBFBF" w:sz="4"/>
@@ -78,7 +78,7 @@
         </w:tc>
         <w:tc>
           <w:tcPr>
-            <w:tcW w:type="dxa" w:w="7073"/>
+            <w:tcW w:type="dxa" w:w="7343"/>
             <w:tcBorders>
               <w:top w:val="single" w:color="BFBFBF" w:sz="4"/>
               <w:left w:val="single" w:color="BFBFBF" w:sz="4"/>
@@ -112,7 +112,7 @@
         </w:trPr>
         <w:tc>
           <w:tcPr>
-            <w:tcW w:type="dxa" w:w="2339"/>
+            <w:tcW w:type="dxa" w:w="2069"/>
             <w:tcBorders>
               <w:top w:val="single" w:color="BFBFBF" w:sz="4"/>
               <w:left w:val="single" w:color="BFBFBF" w:sz="4"/>
@@ -143,7 +143,7 @@
         </w:tc>
         <w:tc>
           <w:tcPr>
-            <w:tcW w:type="dxa" w:w="7073"/>
+            <w:tcW w:type="dxa" w:w="7343"/>
             <w:tcBorders>
               <w:top w:val="single" w:color="BFBFBF" w:sz="4"/>
               <w:left w:val="single" w:color="BFBFBF" w:sz="4"/>
@@ -177,7 +177,7 @@
         </w:trPr>
         <w:tc>
           <w:tcPr>
-            <w:tcW w:type="dxa" w:w="2339"/>
+            <w:tcW w:type="dxa" w:w="2069"/>
             <w:tcBorders>
               <w:top w:val="single" w:color="BFBFBF" w:sz="4"/>
               <w:left w:val="single" w:color="BFBFBF" w:sz="4"/>
@@ -208,7 +208,7 @@
         </w:tc>
         <w:tc>
           <w:tcPr>
-            <w:tcW w:type="dxa" w:w="7073"/>
+            <w:tcW w:type="dxa" w:w="7343"/>
             <w:tcBorders>
               <w:top w:val="single" w:color="BFBFBF" w:sz="4"/>
               <w:left w:val="single" w:color="BFBFBF" w:sz="4"/>
@@ -242,7 +242,7 @@
         </w:trPr>
         <w:tc>
           <w:tcPr>
-            <w:tcW w:type="dxa" w:w="2339"/>
+            <w:tcW w:type="dxa" w:w="2069"/>
             <w:tcBorders>
               <w:top w:val="single" w:color="BFBFBF" w:sz="4"/>
               <w:left w:val="single" w:color="BFBFBF" w:sz="4"/>
@@ -273,25 +273,25 @@
         </w:tc>
         <w:tc>
           <w:tcPr>
-            <w:tcW w:type="dxa" w:w="7073"/>
-            <w:tcBorders>
-              <w:top w:val="single" w:color="BFBFBF" w:sz="4"/>
-              <w:left w:val="single" w:color="BFBFBF" w:sz="4"/>
-              <w:bottom w:val="single" w:color="BFBFBF" w:sz="4"/>
-              <w:right w:val="single" w:color="BFBFBF" w:sz="4"/>
-            </w:tcBorders>
-            <w:tcMar>
-              <w:top w:type="dxa" w:w="50"/>
-              <w:left w:type="dxa" w:w="90"/>
-              <w:bottom w:type="dxa" w:w="50"/>
-              <w:right w:type="dxa" w:w="90"/>
-            </w:tcMar>
-          </w:tcPr>
-          <w:p>
-            <w:pPr>
-              <w:spacing w:after="0" w:before="0"/>
-            </w:pPr>
-            <w:hyperlink w:history="1" r:id="rIdx8ibydjenlgl8p8pqntjo">
+            <w:tcW w:type="dxa" w:w="7343"/>
+            <w:tcBorders>
+              <w:top w:val="single" w:color="BFBFBF" w:sz="4"/>
+              <w:left w:val="single" w:color="BFBFBF" w:sz="4"/>
+              <w:bottom w:val="single" w:color="BFBFBF" w:sz="4"/>
+              <w:right w:val="single" w:color="BFBFBF" w:sz="4"/>
+            </w:tcBorders>
+            <w:tcMar>
+              <w:top w:type="dxa" w:w="50"/>
+              <w:left w:type="dxa" w:w="90"/>
+              <w:bottom w:type="dxa" w:w="50"/>
+              <w:right w:type="dxa" w:w="90"/>
+            </w:tcMar>
+          </w:tcPr>
+          <w:p>
+            <w:pPr>
+              <w:spacing w:after="0" w:before="0"/>
+            </w:pPr>
+            <w:hyperlink w:history="1" r:id="rIdmwudvunsqcaecbs06wspv">
               <w:r>
                 <w:rPr>
                   <w:color w:val="0563C1"/>
@@ -311,7 +311,7 @@
         </w:trPr>
         <w:tc>
           <w:tcPr>
-            <w:tcW w:type="dxa" w:w="2339"/>
+            <w:tcW w:type="dxa" w:w="2069"/>
             <w:tcBorders>
               <w:top w:val="single" w:color="BFBFBF" w:sz="4"/>
               <w:left w:val="single" w:color="BFBFBF" w:sz="4"/>
@@ -342,7 +342,7 @@
         </w:tc>
         <w:tc>
           <w:tcPr>
-            <w:tcW w:type="dxa" w:w="7073"/>
+            <w:tcW w:type="dxa" w:w="7343"/>
             <w:tcBorders>
               <w:top w:val="single" w:color="BFBFBF" w:sz="4"/>
               <w:left w:val="single" w:color="BFBFBF" w:sz="4"/>
@@ -408,7 +408,7 @@
         </w:trPr>
         <w:tc>
           <w:tcPr>
-            <w:tcW w:type="dxa" w:w="2339"/>
+            <w:tcW w:type="dxa" w:w="2069"/>
             <w:tcBorders>
               <w:top w:val="single" w:color="BFBFBF" w:sz="4"/>
               <w:left w:val="single" w:color="BFBFBF" w:sz="4"/>
@@ -439,46 +439,62 @@
         </w:tc>
         <w:tc>
           <w:tcPr>
-            <w:tcW w:type="dxa" w:w="7073"/>
-            <w:tcBorders>
-              <w:top w:val="single" w:color="BFBFBF" w:sz="4"/>
-              <w:left w:val="single" w:color="BFBFBF" w:sz="4"/>
-              <w:bottom w:val="single" w:color="BFBFBF" w:sz="4"/>
-              <w:right w:val="single" w:color="BFBFBF" w:sz="4"/>
-            </w:tcBorders>
-            <w:tcMar>
-              <w:top w:type="dxa" w:w="50"/>
-              <w:left w:type="dxa" w:w="90"/>
-              <w:bottom w:type="dxa" w:w="50"/>
-              <w:right w:type="dxa" w:w="90"/>
-            </w:tcMar>
-          </w:tcPr>
-          <w:p>
-            <w:pPr>
-              <w:spacing w:after="0" w:before="0"/>
-            </w:pPr>
-            <w:r>
-              <w:rPr>
-                <w:sz w:val="18"/>
-                <w:szCs w:val="18"/>
-              </w:rPr>
-              <w:t xml:space="preserve">El del servidor de desarrollo el 13/10/2026 a las 14:04, armado con el código de trabajo de ese día: el commit </w:t>
-            </w:r>
-            <w:r>
-              <w:rPr>
-                <w:rFonts w:ascii="Consolas" w:cs="Consolas" w:eastAsia="Consolas" w:hAnsi="Consolas"/>
-                <w:sz w:val="17"/>
-                <w:szCs w:val="17"/>
-                <w:shd w:fill="F0F0F0" w:color="auto" w:val="clear"/>
-              </w:rPr>
-              <w:t xml:space="preserve">e7c8b6f</w:t>
-            </w:r>
-            <w:r>
-              <w:rPr>
-                <w:sz w:val="18"/>
-                <w:szCs w:val="18"/>
-              </w:rPr>
-              <w:t xml:space="preserve"> más cambios que todavía no tienen commit, entre ellos la llamada de Ventas a Pagos</w:t>
+            <w:tcW w:type="dxa" w:w="7343"/>
+            <w:tcBorders>
+              <w:top w:val="single" w:color="BFBFBF" w:sz="4"/>
+              <w:left w:val="single" w:color="BFBFBF" w:sz="4"/>
+              <w:bottom w:val="single" w:color="BFBFBF" w:sz="4"/>
+              <w:right w:val="single" w:color="BFBFBF" w:sz="4"/>
+            </w:tcBorders>
+            <w:tcMar>
+              <w:top w:type="dxa" w:w="50"/>
+              <w:left w:type="dxa" w:w="90"/>
+              <w:bottom w:type="dxa" w:w="50"/>
+              <w:right w:type="dxa" w:w="90"/>
+            </w:tcMar>
+          </w:tcPr>
+          <w:p>
+            <w:pPr>
+              <w:spacing w:after="0" w:before="0"/>
+            </w:pPr>
+            <w:r>
+              <w:rPr>
+                <w:sz w:val="18"/>
+                <w:szCs w:val="18"/>
+              </w:rPr>
+              <w:t xml:space="preserve">El del servidor de desarrollo el 13/10/2026 entre las 15:45 y las 15:54. Se armó desde cero ese día a las 15:17 (</w:t>
+            </w:r>
+            <w:r>
+              <w:rPr>
+                <w:rFonts w:ascii="Consolas" w:cs="Consolas" w:eastAsia="Consolas" w:hAnsi="Consolas"/>
+                <w:sz w:val="17"/>
+                <w:szCs w:val="17"/>
+                <w:shd w:fill="F0F0F0" w:color="auto" w:val="clear"/>
+              </w:rPr>
+              <w:t xml:space="preserve">mvn clean install</w:t>
+            </w:r>
+            <w:r>
+              <w:rPr>
+                <w:sz w:val="18"/>
+                <w:szCs w:val="18"/>
+              </w:rPr>
+              <w:t xml:space="preserve">) con el código de trabajo: el commit </w:t>
+            </w:r>
+            <w:r>
+              <w:rPr>
+                <w:rFonts w:ascii="Consolas" w:cs="Consolas" w:eastAsia="Consolas" w:hAnsi="Consolas"/>
+                <w:sz w:val="17"/>
+                <w:szCs w:val="17"/>
+                <w:shd w:fill="F0F0F0" w:color="auto" w:val="clear"/>
+              </w:rPr>
+              <w:t xml:space="preserve">f267c3b</w:t>
+            </w:r>
+            <w:r>
+              <w:rPr>
+                <w:sz w:val="18"/>
+                <w:szCs w:val="18"/>
+              </w:rPr>
+              <w:t xml:space="preserve"> más cambios que en ese momento no tenían commit, entre ellos la verificación de identidad en Usuarios</w:t>
             </w:r>
           </w:p>
         </w:tc>
@@ -534,7 +550,31 @@
         <w:t xml:space="preserve">docs/entrega3/evidencia/</w:t>
       </w:r>
       <w:r>
-        <w:t xml:space="preserve"> o el comando que la respalda. Hay un solo caso sin salida guardada, la consulta de Ventas a Usuarios (sección 3.2): ahí se cita el código y se dice.</w:t>
+        <w:t xml:space="preserve"> o el comando que la respalda. Algunas afirmaciones se apoyan en </w:t>
+      </w:r>
+      <w:r>
+        <w:rPr>
+          <w:rFonts w:ascii="Consolas" w:cs="Consolas" w:eastAsia="Consolas" w:hAnsi="Consolas"/>
+          <w:sz w:val="20"/>
+          <w:szCs w:val="20"/>
+          <w:shd w:fill="F0F0F0" w:color="auto" w:val="clear"/>
+        </w:rPr>
+        <w:t xml:space="preserve">integracion-13-escenarios.txt</w:t>
+      </w:r>
+      <w:r>
+        <w:t xml:space="preserve">, la salida de una prueba de integración. Su guion es </w:t>
+      </w:r>
+      <w:r>
+        <w:rPr>
+          <w:rFonts w:ascii="Consolas" w:cs="Consolas" w:eastAsia="Consolas" w:hAnsi="Consolas"/>
+          <w:sz w:val="20"/>
+          <w:szCs w:val="20"/>
+          <w:shd w:fill="F0F0F0" w:color="auto" w:val="clear"/>
+        </w:rPr>
+        <w:t xml:space="preserve">scripts/pruebas/escenarios.mjs</w:t>
+      </w:r>
+      <w:r>
+        <w:t xml:space="preserve">, pero la salida guardada es de una versión anterior, que todavía incluía la verificación de identidad que Usuarios ya no pide: donde se la cita, se dice.</w:t>
       </w:r>
     </w:p>
     <w:p>
@@ -593,9 +633,9 @@
         <w:tblLayout w:type="fixed"/>
       </w:tblPr>
       <w:tblGrid>
-        <w:gridCol w:w="3638"/>
-        <w:gridCol w:w="1253"/>
-        <w:gridCol w:w="4521"/>
+        <w:gridCol w:w="3516"/>
+        <w:gridCol w:w="1211"/>
+        <w:gridCol w:w="4685"/>
       </w:tblGrid>
       <w:tr>
         <w:trPr>
@@ -604,7 +644,7 @@
         </w:trPr>
         <w:tc>
           <w:tcPr>
-            <w:tcW w:type="dxa" w:w="3638"/>
+            <w:tcW w:type="dxa" w:w="3516"/>
             <w:tcBorders>
               <w:top w:val="single" w:color="BFBFBF" w:sz="4"/>
               <w:left w:val="single" w:color="BFBFBF" w:sz="4"/>
@@ -636,7 +676,7 @@
         </w:tc>
         <w:tc>
           <w:tcPr>
-            <w:tcW w:type="dxa" w:w="1253"/>
+            <w:tcW w:type="dxa" w:w="1211"/>
             <w:tcBorders>
               <w:top w:val="single" w:color="BFBFBF" w:sz="4"/>
               <w:left w:val="single" w:color="BFBFBF" w:sz="4"/>
@@ -668,7 +708,7 @@
         </w:tc>
         <w:tc>
           <w:tcPr>
-            <w:tcW w:type="dxa" w:w="4521"/>
+            <w:tcW w:type="dxa" w:w="4685"/>
             <w:tcBorders>
               <w:top w:val="single" w:color="BFBFBF" w:sz="4"/>
               <w:left w:val="single" w:color="BFBFBF" w:sz="4"/>
@@ -705,7 +745,7 @@
         </w:trPr>
         <w:tc>
           <w:tcPr>
-            <w:tcW w:type="dxa" w:w="3638"/>
+            <w:tcW w:type="dxa" w:w="3516"/>
             <w:tcBorders>
               <w:top w:val="single" w:color="BFBFBF" w:sz="4"/>
               <w:left w:val="single" w:color="BFBFBF" w:sz="4"/>
@@ -734,7 +774,7 @@
         </w:tc>
         <w:tc>
           <w:tcPr>
-            <w:tcW w:type="dxa" w:w="1253"/>
+            <w:tcW w:type="dxa" w:w="1211"/>
             <w:tcBorders>
               <w:top w:val="single" w:color="BFBFBF" w:sz="4"/>
               <w:left w:val="single" w:color="BFBFBF" w:sz="4"/>
@@ -763,7 +803,7 @@
         </w:tc>
         <w:tc>
           <w:tcPr>
-            <w:tcW w:type="dxa" w:w="4521"/>
+            <w:tcW w:type="dxa" w:w="4685"/>
             <w:tcBorders>
               <w:top w:val="single" w:color="BFBFBF" w:sz="4"/>
               <w:left w:val="single" w:color="BFBFBF" w:sz="4"/>
@@ -797,7 +837,7 @@
         </w:trPr>
         <w:tc>
           <w:tcPr>
-            <w:tcW w:type="dxa" w:w="3638"/>
+            <w:tcW w:type="dxa" w:w="3516"/>
             <w:tcBorders>
               <w:top w:val="single" w:color="BFBFBF" w:sz="4"/>
               <w:left w:val="single" w:color="BFBFBF" w:sz="4"/>
@@ -826,7 +866,7 @@
         </w:tc>
         <w:tc>
           <w:tcPr>
-            <w:tcW w:type="dxa" w:w="1253"/>
+            <w:tcW w:type="dxa" w:w="1211"/>
             <w:tcBorders>
               <w:top w:val="single" w:color="BFBFBF" w:sz="4"/>
               <w:left w:val="single" w:color="BFBFBF" w:sz="4"/>
@@ -855,7 +895,7 @@
         </w:tc>
         <w:tc>
           <w:tcPr>
-            <w:tcW w:type="dxa" w:w="4521"/>
+            <w:tcW w:type="dxa" w:w="4685"/>
             <w:tcBorders>
               <w:top w:val="single" w:color="BFBFBF" w:sz="4"/>
               <w:left w:val="single" w:color="BFBFBF" w:sz="4"/>
@@ -889,7 +929,7 @@
         </w:trPr>
         <w:tc>
           <w:tcPr>
-            <w:tcW w:type="dxa" w:w="3638"/>
+            <w:tcW w:type="dxa" w:w="3516"/>
             <w:tcBorders>
               <w:top w:val="single" w:color="BFBFBF" w:sz="4"/>
               <w:left w:val="single" w:color="BFBFBF" w:sz="4"/>
@@ -918,7 +958,7 @@
         </w:tc>
         <w:tc>
           <w:tcPr>
-            <w:tcW w:type="dxa" w:w="1253"/>
+            <w:tcW w:type="dxa" w:w="1211"/>
             <w:tcBorders>
               <w:top w:val="single" w:color="BFBFBF" w:sz="4"/>
               <w:left w:val="single" w:color="BFBFBF" w:sz="4"/>
@@ -947,30 +987,30 @@
         </w:tc>
         <w:tc>
           <w:tcPr>
-            <w:tcW w:type="dxa" w:w="4521"/>
-            <w:tcBorders>
-              <w:top w:val="single" w:color="BFBFBF" w:sz="4"/>
-              <w:left w:val="single" w:color="BFBFBF" w:sz="4"/>
-              <w:bottom w:val="single" w:color="BFBFBF" w:sz="4"/>
-              <w:right w:val="single" w:color="BFBFBF" w:sz="4"/>
-            </w:tcBorders>
-            <w:tcMar>
-              <w:top w:type="dxa" w:w="50"/>
-              <w:left w:type="dxa" w:w="90"/>
-              <w:bottom w:type="dxa" w:w="50"/>
-              <w:right w:type="dxa" w:w="90"/>
-            </w:tcMar>
-          </w:tcPr>
-          <w:p>
-            <w:pPr>
-              <w:spacing w:after="0" w:before="0"/>
-            </w:pPr>
-            <w:r>
-              <w:rPr>
-                <w:sz w:val="18"/>
-                <w:szCs w:val="18"/>
-              </w:rPr>
-              <w:t xml:space="preserve">Implementado: dos procesos disparados por el mismo evento, uno por cola y otro por tópico. El cobro que dispara ese evento pasa por una pasarela simulada (sección 6.1)</w:t>
+            <w:tcW w:type="dxa" w:w="4685"/>
+            <w:tcBorders>
+              <w:top w:val="single" w:color="BFBFBF" w:sz="4"/>
+              <w:left w:val="single" w:color="BFBFBF" w:sz="4"/>
+              <w:bottom w:val="single" w:color="BFBFBF" w:sz="4"/>
+              <w:right w:val="single" w:color="BFBFBF" w:sz="4"/>
+            </w:tcBorders>
+            <w:tcMar>
+              <w:top w:type="dxa" w:w="50"/>
+              <w:left w:type="dxa" w:w="90"/>
+              <w:bottom w:type="dxa" w:w="50"/>
+              <w:right w:type="dxa" w:w="90"/>
+            </w:tcMar>
+          </w:tcPr>
+          <w:p>
+            <w:pPr>
+              <w:spacing w:after="0" w:before="0"/>
+            </w:pPr>
+            <w:r>
+              <w:rPr>
+                <w:sz w:val="18"/>
+                <w:szCs w:val="18"/>
+              </w:rPr>
+              <w:t xml:space="preserve">Implementado: un proceso de negocio (la confirmación de la compra) que usa una cola para emitir las entradas y un tópico para el aviso y la auditoría. El aviso se escribe en el log del servidor; no se envía. El cobro que dispara ese evento pasa por una pasarela simulada (sección 6.1)</w:t>
             </w:r>
           </w:p>
         </w:tc>
@@ -1271,10 +1311,10 @@
         <w:tblLayout w:type="fixed"/>
       </w:tblPr>
       <w:tblGrid>
-        <w:gridCol w:w="2142"/>
-        <w:gridCol w:w="1558"/>
-        <w:gridCol w:w="1858"/>
-        <w:gridCol w:w="3854"/>
+        <w:gridCol w:w="2066"/>
+        <w:gridCol w:w="1503"/>
+        <w:gridCol w:w="1792"/>
+        <w:gridCol w:w="4051"/>
       </w:tblGrid>
       <w:tr>
         <w:trPr>
@@ -1283,7 +1323,7 @@
         </w:trPr>
         <w:tc>
           <w:tcPr>
-            <w:tcW w:type="dxa" w:w="2142"/>
+            <w:tcW w:type="dxa" w:w="2066"/>
             <w:tcBorders>
               <w:top w:val="single" w:color="BFBFBF" w:sz="4"/>
               <w:left w:val="single" w:color="BFBFBF" w:sz="4"/>
@@ -1315,7 +1355,7 @@
         </w:tc>
         <w:tc>
           <w:tcPr>
-            <w:tcW w:type="dxa" w:w="1558"/>
+            <w:tcW w:type="dxa" w:w="1503"/>
             <w:tcBorders>
               <w:top w:val="single" w:color="BFBFBF" w:sz="4"/>
               <w:left w:val="single" w:color="BFBFBF" w:sz="4"/>
@@ -1347,7 +1387,7 @@
         </w:tc>
         <w:tc>
           <w:tcPr>
-            <w:tcW w:type="dxa" w:w="1858"/>
+            <w:tcW w:type="dxa" w:w="1792"/>
             <w:tcBorders>
               <w:top w:val="single" w:color="BFBFBF" w:sz="4"/>
               <w:left w:val="single" w:color="BFBFBF" w:sz="4"/>
@@ -1379,7 +1419,7 @@
         </w:tc>
         <w:tc>
           <w:tcPr>
-            <w:tcW w:type="dxa" w:w="3854"/>
+            <w:tcW w:type="dxa" w:w="4051"/>
             <w:tcBorders>
               <w:top w:val="single" w:color="BFBFBF" w:sz="4"/>
               <w:left w:val="single" w:color="BFBFBF" w:sz="4"/>
@@ -1416,7 +1456,7 @@
         </w:trPr>
         <w:tc>
           <w:tcPr>
-            <w:tcW w:type="dxa" w:w="2142"/>
+            <w:tcW w:type="dxa" w:w="2066"/>
             <w:tcBorders>
               <w:top w:val="single" w:color="BFBFBF" w:sz="4"/>
               <w:left w:val="single" w:color="BFBFBF" w:sz="4"/>
@@ -1454,7 +1494,7 @@
         </w:tc>
         <w:tc>
           <w:tcPr>
-            <w:tcW w:type="dxa" w:w="1558"/>
+            <w:tcW w:type="dxa" w:w="1503"/>
             <w:tcBorders>
               <w:top w:val="single" w:color="BFBFBF" w:sz="4"/>
               <w:left w:val="single" w:color="BFBFBF" w:sz="4"/>
@@ -1485,7 +1525,7 @@
         </w:tc>
         <w:tc>
           <w:tcPr>
-            <w:tcW w:type="dxa" w:w="1858"/>
+            <w:tcW w:type="dxa" w:w="1792"/>
             <w:tcBorders>
               <w:top w:val="single" w:color="BFBFBF" w:sz="4"/>
               <w:left w:val="single" w:color="BFBFBF" w:sz="4"/>
@@ -1516,7 +1556,7 @@
         </w:tc>
         <w:tc>
           <w:tcPr>
-            <w:tcW w:type="dxa" w:w="3854"/>
+            <w:tcW w:type="dxa" w:w="4051"/>
             <w:tcBorders>
               <w:top w:val="single" w:color="BFBFBF" w:sz="4"/>
               <w:left w:val="single" w:color="BFBFBF" w:sz="4"/>
@@ -1550,7 +1590,7 @@
         </w:trPr>
         <w:tc>
           <w:tcPr>
-            <w:tcW w:type="dxa" w:w="2142"/>
+            <w:tcW w:type="dxa" w:w="2066"/>
             <w:tcBorders>
               <w:top w:val="single" w:color="BFBFBF" w:sz="4"/>
               <w:left w:val="single" w:color="BFBFBF" w:sz="4"/>
@@ -1588,7 +1628,7 @@
         </w:tc>
         <w:tc>
           <w:tcPr>
-            <w:tcW w:type="dxa" w:w="1558"/>
+            <w:tcW w:type="dxa" w:w="1503"/>
             <w:tcBorders>
               <w:top w:val="single" w:color="BFBFBF" w:sz="4"/>
               <w:left w:val="single" w:color="BFBFBF" w:sz="4"/>
@@ -1619,7 +1659,7 @@
         </w:tc>
         <w:tc>
           <w:tcPr>
-            <w:tcW w:type="dxa" w:w="1858"/>
+            <w:tcW w:type="dxa" w:w="1792"/>
             <w:tcBorders>
               <w:top w:val="single" w:color="BFBFBF" w:sz="4"/>
               <w:left w:val="single" w:color="BFBFBF" w:sz="4"/>
@@ -1650,7 +1690,7 @@
         </w:tc>
         <w:tc>
           <w:tcPr>
-            <w:tcW w:type="dxa" w:w="3854"/>
+            <w:tcW w:type="dxa" w:w="4051"/>
             <w:tcBorders>
               <w:top w:val="single" w:color="BFBFBF" w:sz="4"/>
               <w:left w:val="single" w:color="BFBFBF" w:sz="4"/>
@@ -1684,7 +1724,7 @@
         </w:trPr>
         <w:tc>
           <w:tcPr>
-            <w:tcW w:type="dxa" w:w="2142"/>
+            <w:tcW w:type="dxa" w:w="2066"/>
             <w:tcBorders>
               <w:top w:val="single" w:color="BFBFBF" w:sz="4"/>
               <w:left w:val="single" w:color="BFBFBF" w:sz="4"/>
@@ -1722,7 +1762,7 @@
         </w:tc>
         <w:tc>
           <w:tcPr>
-            <w:tcW w:type="dxa" w:w="1558"/>
+            <w:tcW w:type="dxa" w:w="1503"/>
             <w:tcBorders>
               <w:top w:val="single" w:color="BFBFBF" w:sz="4"/>
               <w:left w:val="single" w:color="BFBFBF" w:sz="4"/>
@@ -1753,7 +1793,7 @@
         </w:tc>
         <w:tc>
           <w:tcPr>
-            <w:tcW w:type="dxa" w:w="1858"/>
+            <w:tcW w:type="dxa" w:w="1792"/>
             <w:tcBorders>
               <w:top w:val="single" w:color="BFBFBF" w:sz="4"/>
               <w:left w:val="single" w:color="BFBFBF" w:sz="4"/>
@@ -1784,30 +1824,30 @@
         </w:tc>
         <w:tc>
           <w:tcPr>
-            <w:tcW w:type="dxa" w:w="3854"/>
-            <w:tcBorders>
-              <w:top w:val="single" w:color="BFBFBF" w:sz="4"/>
-              <w:left w:val="single" w:color="BFBFBF" w:sz="4"/>
-              <w:bottom w:val="single" w:color="BFBFBF" w:sz="4"/>
-              <w:right w:val="single" w:color="BFBFBF" w:sz="4"/>
-            </w:tcBorders>
-            <w:tcMar>
-              <w:top w:type="dxa" w:w="50"/>
-              <w:left w:type="dxa" w:w="90"/>
-              <w:bottom w:type="dxa" w:w="50"/>
-              <w:right w:type="dxa" w:w="90"/>
-            </w:tcMar>
-          </w:tcPr>
-          <w:p>
-            <w:pPr>
-              <w:spacing w:after="0" w:before="0"/>
-            </w:pPr>
-            <w:r>
-              <w:rPr>
-                <w:sz w:val="18"/>
-                <w:szCs w:val="18"/>
-              </w:rPr>
-              <w:t xml:space="preserve">Compra en dos llamadas (abrir con reserva de cupo y pagar), consulta, cancelación y consulta de la entrada. Publica el evento de pago confirmado y emite las entradas. Para cobrar llama a </w:t>
+            <w:tcW w:type="dxa" w:w="4051"/>
+            <w:tcBorders>
+              <w:top w:val="single" w:color="BFBFBF" w:sz="4"/>
+              <w:left w:val="single" w:color="BFBFBF" w:sz="4"/>
+              <w:bottom w:val="single" w:color="BFBFBF" w:sz="4"/>
+              <w:right w:val="single" w:color="BFBFBF" w:sz="4"/>
+            </w:tcBorders>
+            <w:tcMar>
+              <w:top w:type="dxa" w:w="50"/>
+              <w:left w:type="dxa" w:w="90"/>
+              <w:bottom w:type="dxa" w:w="50"/>
+              <w:right w:type="dxa" w:w="90"/>
+            </w:tcMar>
+          </w:tcPr>
+          <w:p>
+            <w:pPr>
+              <w:spacing w:after="0" w:before="0"/>
+            </w:pPr>
+            <w:r>
+              <w:rPr>
+                <w:sz w:val="18"/>
+                <w:szCs w:val="18"/>
+              </w:rPr>
+              <w:t xml:space="preserve">Compra en dos llamadas (abrir con reserva de cupo y pagar), consulta de una venta y de las compras propias, cancelación y consulta de la entrada. Publica el evento de pago confirmado y emite las entradas. Para cobrar llama a </w:t>
             </w:r>
             <w:r>
               <w:rPr>
@@ -1827,7 +1867,7 @@
         </w:trPr>
         <w:tc>
           <w:tcPr>
-            <w:tcW w:type="dxa" w:w="2142"/>
+            <w:tcW w:type="dxa" w:w="2066"/>
             <w:tcBorders>
               <w:top w:val="single" w:color="BFBFBF" w:sz="4"/>
               <w:left w:val="single" w:color="BFBFBF" w:sz="4"/>
@@ -1865,7 +1905,7 @@
         </w:tc>
         <w:tc>
           <w:tcPr>
-            <w:tcW w:type="dxa" w:w="1558"/>
+            <w:tcW w:type="dxa" w:w="1503"/>
             <w:tcBorders>
               <w:top w:val="single" w:color="BFBFBF" w:sz="4"/>
               <w:left w:val="single" w:color="BFBFBF" w:sz="4"/>
@@ -1896,7 +1936,7 @@
         </w:tc>
         <w:tc>
           <w:tcPr>
-            <w:tcW w:type="dxa" w:w="1858"/>
+            <w:tcW w:type="dxa" w:w="1792"/>
             <w:tcBorders>
               <w:top w:val="single" w:color="BFBFBF" w:sz="4"/>
               <w:left w:val="single" w:color="BFBFBF" w:sz="4"/>
@@ -1927,7 +1967,7 @@
         </w:tc>
         <w:tc>
           <w:tcPr>
-            <w:tcW w:type="dxa" w:w="3854"/>
+            <w:tcW w:type="dxa" w:w="4051"/>
             <w:tcBorders>
               <w:top w:val="single" w:color="BFBFBF" w:sz="4"/>
               <w:left w:val="single" w:color="BFBFBF" w:sz="4"/>
@@ -1993,7 +2033,7 @@
         </w:trPr>
         <w:tc>
           <w:tcPr>
-            <w:tcW w:type="dxa" w:w="2142"/>
+            <w:tcW w:type="dxa" w:w="2066"/>
             <w:tcBorders>
               <w:top w:val="single" w:color="BFBFBF" w:sz="4"/>
               <w:left w:val="single" w:color="BFBFBF" w:sz="4"/>
@@ -2031,7 +2071,7 @@
         </w:tc>
         <w:tc>
           <w:tcPr>
-            <w:tcW w:type="dxa" w:w="1558"/>
+            <w:tcW w:type="dxa" w:w="1503"/>
             <w:tcBorders>
               <w:top w:val="single" w:color="BFBFBF" w:sz="4"/>
               <w:left w:val="single" w:color="BFBFBF" w:sz="4"/>
@@ -2078,7 +2118,7 @@
         </w:tc>
         <w:tc>
           <w:tcPr>
-            <w:tcW w:type="dxa" w:w="1858"/>
+            <w:tcW w:type="dxa" w:w="1792"/>
             <w:tcBorders>
               <w:top w:val="single" w:color="BFBFBF" w:sz="4"/>
               <w:left w:val="single" w:color="BFBFBF" w:sz="4"/>
@@ -2109,7 +2149,7 @@
         </w:tc>
         <w:tc>
           <w:tcPr>
-            <w:tcW w:type="dxa" w:w="3854"/>
+            <w:tcW w:type="dxa" w:w="4051"/>
             <w:tcBorders>
               <w:top w:val="single" w:color="BFBFBF" w:sz="4"/>
               <w:left w:val="single" w:color="BFBFBF" w:sz="4"/>
@@ -2143,7 +2183,7 @@
         </w:trPr>
         <w:tc>
           <w:tcPr>
-            <w:tcW w:type="dxa" w:w="2142"/>
+            <w:tcW w:type="dxa" w:w="2066"/>
             <w:tcBorders>
               <w:top w:val="single" w:color="BFBFBF" w:sz="4"/>
               <w:left w:val="single" w:color="BFBFBF" w:sz="4"/>
@@ -2206,7 +2246,7 @@
         </w:tc>
         <w:tc>
           <w:tcPr>
-            <w:tcW w:type="dxa" w:w="1558"/>
+            <w:tcW w:type="dxa" w:w="1503"/>
             <w:tcBorders>
               <w:top w:val="single" w:color="BFBFBF" w:sz="4"/>
               <w:left w:val="single" w:color="BFBFBF" w:sz="4"/>
@@ -2235,7 +2275,7 @@
         </w:tc>
         <w:tc>
           <w:tcPr>
-            <w:tcW w:type="dxa" w:w="1858"/>
+            <w:tcW w:type="dxa" w:w="1792"/>
             <w:tcBorders>
               <w:top w:val="single" w:color="BFBFBF" w:sz="4"/>
               <w:left w:val="single" w:color="BFBFBF" w:sz="4"/>
@@ -2298,7 +2338,7 @@
         </w:tc>
         <w:tc>
           <w:tcPr>
-            <w:tcW w:type="dxa" w:w="3854"/>
+            <w:tcW w:type="dxa" w:w="4051"/>
             <w:tcBorders>
               <w:top w:val="single" w:color="BFBFBF" w:sz="4"/>
               <w:left w:val="single" w:color="BFBFBF" w:sz="4"/>
@@ -3036,7 +3076,7 @@
         <w:t xml:space="preserve">GET /api/usuarios/yo</w:t>
       </w:r>
       <w:r>
-        <w:t xml:space="preserve"> con el token del comprador, para saber si tiene la identidad verificada antes de abrirle una compra (flecha S1).</w:t>
+        <w:t xml:space="preserve"> con el token del comprador, para obtener sus datos antes de abrirle una compra (flecha S1).</w:t>
       </w:r>
     </w:p>
     <w:p>
@@ -3229,11 +3269,11 @@
       </w:tblPr>
       <w:tblGrid>
         <w:gridCol w:w="620"/>
-        <w:gridCol w:w="1362"/>
-        <w:gridCol w:w="1355"/>
-        <w:gridCol w:w="2343"/>
-        <w:gridCol w:w="2192"/>
-        <w:gridCol w:w="1540"/>
+        <w:gridCol w:w="1356"/>
+        <w:gridCol w:w="1349"/>
+        <w:gridCol w:w="2374"/>
+        <w:gridCol w:w="2181"/>
+        <w:gridCol w:w="1532"/>
       </w:tblGrid>
       <w:tr>
         <w:trPr>
@@ -3274,7 +3314,7 @@
         </w:tc>
         <w:tc>
           <w:tcPr>
-            <w:tcW w:type="dxa" w:w="1362"/>
+            <w:tcW w:type="dxa" w:w="1356"/>
             <w:tcBorders>
               <w:top w:val="single" w:color="BFBFBF" w:sz="4"/>
               <w:left w:val="single" w:color="BFBFBF" w:sz="4"/>
@@ -3306,7 +3346,7 @@
         </w:tc>
         <w:tc>
           <w:tcPr>
-            <w:tcW w:type="dxa" w:w="1355"/>
+            <w:tcW w:type="dxa" w:w="1349"/>
             <w:tcBorders>
               <w:top w:val="single" w:color="BFBFBF" w:sz="4"/>
               <w:left w:val="single" w:color="BFBFBF" w:sz="4"/>
@@ -3338,7 +3378,7 @@
         </w:tc>
         <w:tc>
           <w:tcPr>
-            <w:tcW w:type="dxa" w:w="2343"/>
+            <w:tcW w:type="dxa" w:w="2374"/>
             <w:tcBorders>
               <w:top w:val="single" w:color="BFBFBF" w:sz="4"/>
               <w:left w:val="single" w:color="BFBFBF" w:sz="4"/>
@@ -3370,7 +3410,7 @@
         </w:tc>
         <w:tc>
           <w:tcPr>
-            <w:tcW w:type="dxa" w:w="2192"/>
+            <w:tcW w:type="dxa" w:w="2181"/>
             <w:tcBorders>
               <w:top w:val="single" w:color="BFBFBF" w:sz="4"/>
               <w:left w:val="single" w:color="BFBFBF" w:sz="4"/>
@@ -3402,7 +3442,7 @@
         </w:tc>
         <w:tc>
           <w:tcPr>
-            <w:tcW w:type="dxa" w:w="1540"/>
+            <w:tcW w:type="dxa" w:w="1532"/>
             <w:tcBorders>
               <w:top w:val="single" w:color="BFBFBF" w:sz="4"/>
               <w:left w:val="single" w:color="BFBFBF" w:sz="4"/>
@@ -3468,7 +3508,7 @@
         </w:tc>
         <w:tc>
           <w:tcPr>
-            <w:tcW w:type="dxa" w:w="1362"/>
+            <w:tcW w:type="dxa" w:w="1356"/>
             <w:tcBorders>
               <w:top w:val="single" w:color="BFBFBF" w:sz="4"/>
               <w:left w:val="single" w:color="BFBFBF" w:sz="4"/>
@@ -3497,7 +3537,7 @@
         </w:tc>
         <w:tc>
           <w:tcPr>
-            <w:tcW w:type="dxa" w:w="1355"/>
+            <w:tcW w:type="dxa" w:w="1349"/>
             <w:tcBorders>
               <w:top w:val="single" w:color="BFBFBF" w:sz="4"/>
               <w:left w:val="single" w:color="BFBFBF" w:sz="4"/>
@@ -3526,36 +3566,36 @@
         </w:tc>
         <w:tc>
           <w:tcPr>
-            <w:tcW w:type="dxa" w:w="2343"/>
-            <w:tcBorders>
-              <w:top w:val="single" w:color="BFBFBF" w:sz="4"/>
-              <w:left w:val="single" w:color="BFBFBF" w:sz="4"/>
-              <w:bottom w:val="single" w:color="BFBFBF" w:sz="4"/>
-              <w:right w:val="single" w:color="BFBFBF" w:sz="4"/>
-            </w:tcBorders>
-            <w:tcMar>
-              <w:top w:type="dxa" w:w="50"/>
-              <w:left w:type="dxa" w:w="90"/>
-              <w:bottom w:type="dxa" w:w="50"/>
-              <w:right w:type="dxa" w:w="90"/>
-            </w:tcMar>
-          </w:tcPr>
-          <w:p>
-            <w:pPr>
-              <w:spacing w:after="0" w:before="0"/>
-            </w:pPr>
-            <w:r>
-              <w:rPr>
-                <w:sz w:val="18"/>
-                <w:szCs w:val="18"/>
-              </w:rPr>
-              <w:t xml:space="preserve">La persona espera la respuesta en pantalla: necesita saber en el momento si hay lugar y si el pago pasó. Es también la API de consumo externo que pide la consigna</w:t>
-            </w:r>
-          </w:p>
-        </w:tc>
-        <w:tc>
-          <w:tcPr>
-            <w:tcW w:type="dxa" w:w="2192"/>
+            <w:tcW w:type="dxa" w:w="2374"/>
+            <w:tcBorders>
+              <w:top w:val="single" w:color="BFBFBF" w:sz="4"/>
+              <w:left w:val="single" w:color="BFBFBF" w:sz="4"/>
+              <w:bottom w:val="single" w:color="BFBFBF" w:sz="4"/>
+              <w:right w:val="single" w:color="BFBFBF" w:sz="4"/>
+            </w:tcBorders>
+            <w:tcMar>
+              <w:top w:type="dxa" w:w="50"/>
+              <w:left w:type="dxa" w:w="90"/>
+              <w:bottom w:type="dxa" w:w="50"/>
+              <w:right w:type="dxa" w:w="90"/>
+            </w:tcMar>
+          </w:tcPr>
+          <w:p>
+            <w:pPr>
+              <w:spacing w:after="0" w:before="0"/>
+            </w:pPr>
+            <w:r>
+              <w:rPr>
+                <w:sz w:val="18"/>
+                <w:szCs w:val="18"/>
+              </w:rPr>
+              <w:t xml:space="preserve">La persona espera la respuesta en pantalla: necesita saber en el momento si hay lugar y si el pago pasó. Es una API REST propia, consumida por el frontend y descripta en OpenAPI y Postman para terceros. Todavía no tiene un consumidor externo y el contrato OpenAPI no está al día (sección 5)</w:t>
+            </w:r>
+          </w:p>
+        </w:tc>
+        <w:tc>
+          <w:tcPr>
+            <w:tcW w:type="dxa" w:w="2181"/>
             <w:tcBorders>
               <w:top w:val="single" w:color="BFBFBF" w:sz="4"/>
               <w:left w:val="single" w:color="BFBFBF" w:sz="4"/>
@@ -3600,7 +3640,7 @@
         </w:tc>
         <w:tc>
           <w:tcPr>
-            <w:tcW w:type="dxa" w:w="1540"/>
+            <w:tcW w:type="dxa" w:w="1532"/>
             <w:tcBorders>
               <w:top w:val="single" w:color="BFBFBF" w:sz="4"/>
               <w:left w:val="single" w:color="BFBFBF" w:sz="4"/>
@@ -3688,7 +3728,7 @@
         </w:tc>
         <w:tc>
           <w:tcPr>
-            <w:tcW w:type="dxa" w:w="1362"/>
+            <w:tcW w:type="dxa" w:w="1356"/>
             <w:tcBorders>
               <w:top w:val="single" w:color="BFBFBF" w:sz="4"/>
               <w:left w:val="single" w:color="BFBFBF" w:sz="4"/>
@@ -3726,7 +3766,7 @@
         </w:tc>
         <w:tc>
           <w:tcPr>
-            <w:tcW w:type="dxa" w:w="1355"/>
+            <w:tcW w:type="dxa" w:w="1349"/>
             <w:tcBorders>
               <w:top w:val="single" w:color="BFBFBF" w:sz="4"/>
               <w:left w:val="single" w:color="BFBFBF" w:sz="4"/>
@@ -3755,7 +3795,7 @@
         </w:tc>
         <w:tc>
           <w:tcPr>
-            <w:tcW w:type="dxa" w:w="2343"/>
+            <w:tcW w:type="dxa" w:w="2374"/>
             <w:tcBorders>
               <w:top w:val="single" w:color="BFBFBF" w:sz="4"/>
               <w:left w:val="single" w:color="BFBFBF" w:sz="4"/>
@@ -3784,7 +3824,7 @@
         </w:tc>
         <w:tc>
           <w:tcPr>
-            <w:tcW w:type="dxa" w:w="2192"/>
+            <w:tcW w:type="dxa" w:w="2181"/>
             <w:tcBorders>
               <w:top w:val="single" w:color="BFBFBF" w:sz="4"/>
               <w:left w:val="single" w:color="BFBFBF" w:sz="4"/>
@@ -3813,7 +3853,7 @@
         </w:tc>
         <w:tc>
           <w:tcPr>
-            <w:tcW w:type="dxa" w:w="1540"/>
+            <w:tcW w:type="dxa" w:w="1532"/>
             <w:tcBorders>
               <w:top w:val="single" w:color="BFBFBF" w:sz="4"/>
               <w:left w:val="single" w:color="BFBFBF" w:sz="4"/>
@@ -3910,7 +3950,7 @@
         </w:tc>
         <w:tc>
           <w:tcPr>
-            <w:tcW w:type="dxa" w:w="1362"/>
+            <w:tcW w:type="dxa" w:w="1356"/>
             <w:tcBorders>
               <w:top w:val="single" w:color="BFBFBF" w:sz="4"/>
               <w:left w:val="single" w:color="BFBFBF" w:sz="4"/>
@@ -3955,7 +3995,7 @@
         </w:tc>
         <w:tc>
           <w:tcPr>
-            <w:tcW w:type="dxa" w:w="1355"/>
+            <w:tcW w:type="dxa" w:w="1349"/>
             <w:tcBorders>
               <w:top w:val="single" w:color="BFBFBF" w:sz="4"/>
               <w:left w:val="single" w:color="BFBFBF" w:sz="4"/>
@@ -3984,7 +4024,7 @@
         </w:tc>
         <w:tc>
           <w:tcPr>
-            <w:tcW w:type="dxa" w:w="2343"/>
+            <w:tcW w:type="dxa" w:w="2374"/>
             <w:tcBorders>
               <w:top w:val="single" w:color="BFBFBF" w:sz="4"/>
               <w:left w:val="single" w:color="BFBFBF" w:sz="4"/>
@@ -4013,7 +4053,7 @@
         </w:tc>
         <w:tc>
           <w:tcPr>
-            <w:tcW w:type="dxa" w:w="2192"/>
+            <w:tcW w:type="dxa" w:w="2181"/>
             <w:tcBorders>
               <w:top w:val="single" w:color="BFBFBF" w:sz="4"/>
               <w:left w:val="single" w:color="BFBFBF" w:sz="4"/>
@@ -4042,7 +4082,7 @@
         </w:tc>
         <w:tc>
           <w:tcPr>
-            <w:tcW w:type="dxa" w:w="1540"/>
+            <w:tcW w:type="dxa" w:w="1532"/>
             <w:tcBorders>
               <w:top w:val="single" w:color="BFBFBF" w:sz="4"/>
               <w:left w:val="single" w:color="BFBFBF" w:sz="4"/>
@@ -4114,7 +4154,7 @@
         </w:tc>
         <w:tc>
           <w:tcPr>
-            <w:tcW w:type="dxa" w:w="1362"/>
+            <w:tcW w:type="dxa" w:w="1356"/>
             <w:tcBorders>
               <w:top w:val="single" w:color="BFBFBF" w:sz="4"/>
               <w:left w:val="single" w:color="BFBFBF" w:sz="4"/>
@@ -4152,7 +4192,7 @@
         </w:tc>
         <w:tc>
           <w:tcPr>
-            <w:tcW w:type="dxa" w:w="1355"/>
+            <w:tcW w:type="dxa" w:w="1349"/>
             <w:tcBorders>
               <w:top w:val="single" w:color="BFBFBF" w:sz="4"/>
               <w:left w:val="single" w:color="BFBFBF" w:sz="4"/>
@@ -4190,7 +4230,7 @@
         </w:tc>
         <w:tc>
           <w:tcPr>
-            <w:tcW w:type="dxa" w:w="2343"/>
+            <w:tcW w:type="dxa" w:w="2374"/>
             <w:tcBorders>
               <w:top w:val="single" w:color="BFBFBF" w:sz="4"/>
               <w:left w:val="single" w:color="BFBFBF" w:sz="4"/>
@@ -4219,7 +4259,7 @@
         </w:tc>
         <w:tc>
           <w:tcPr>
-            <w:tcW w:type="dxa" w:w="2192"/>
+            <w:tcW w:type="dxa" w:w="2181"/>
             <w:tcBorders>
               <w:top w:val="single" w:color="BFBFBF" w:sz="4"/>
               <w:left w:val="single" w:color="BFBFBF" w:sz="4"/>
@@ -4248,7 +4288,7 @@
         </w:tc>
         <w:tc>
           <w:tcPr>
-            <w:tcW w:type="dxa" w:w="1540"/>
+            <w:tcW w:type="dxa" w:w="1532"/>
             <w:tcBorders>
               <w:top w:val="single" w:color="BFBFBF" w:sz="4"/>
               <w:left w:val="single" w:color="BFBFBF" w:sz="4"/>
@@ -4345,7 +4385,7 @@
         </w:tc>
         <w:tc>
           <w:tcPr>
-            <w:tcW w:type="dxa" w:w="1362"/>
+            <w:tcW w:type="dxa" w:w="1356"/>
             <w:tcBorders>
               <w:top w:val="single" w:color="BFBFBF" w:sz="4"/>
               <w:left w:val="single" w:color="BFBFBF" w:sz="4"/>
@@ -4408,7 +4448,7 @@
         </w:tc>
         <w:tc>
           <w:tcPr>
-            <w:tcW w:type="dxa" w:w="1355"/>
+            <w:tcW w:type="dxa" w:w="1349"/>
             <w:tcBorders>
               <w:top w:val="single" w:color="BFBFBF" w:sz="4"/>
               <w:left w:val="single" w:color="BFBFBF" w:sz="4"/>
@@ -4437,7 +4477,7 @@
         </w:tc>
         <w:tc>
           <w:tcPr>
-            <w:tcW w:type="dxa" w:w="2343"/>
+            <w:tcW w:type="dxa" w:w="2374"/>
             <w:tcBorders>
               <w:top w:val="single" w:color="BFBFBF" w:sz="4"/>
               <w:left w:val="single" w:color="BFBFBF" w:sz="4"/>
@@ -4466,7 +4506,7 @@
         </w:tc>
         <w:tc>
           <w:tcPr>
-            <w:tcW w:type="dxa" w:w="2192"/>
+            <w:tcW w:type="dxa" w:w="2181"/>
             <w:tcBorders>
               <w:top w:val="single" w:color="BFBFBF" w:sz="4"/>
               <w:left w:val="single" w:color="BFBFBF" w:sz="4"/>
@@ -4495,7 +4535,7 @@
         </w:tc>
         <w:tc>
           <w:tcPr>
-            <w:tcW w:type="dxa" w:w="1540"/>
+            <w:tcW w:type="dxa" w:w="1532"/>
             <w:tcBorders>
               <w:top w:val="single" w:color="BFBFBF" w:sz="4"/>
               <w:left w:val="single" w:color="BFBFBF" w:sz="4"/>
@@ -4567,7 +4607,7 @@
         </w:tc>
         <w:tc>
           <w:tcPr>
-            <w:tcW w:type="dxa" w:w="1362"/>
+            <w:tcW w:type="dxa" w:w="1356"/>
             <w:tcBorders>
               <w:top w:val="single" w:color="BFBFBF" w:sz="4"/>
               <w:left w:val="single" w:color="BFBFBF" w:sz="4"/>
@@ -4646,7 +4686,7 @@
         </w:tc>
         <w:tc>
           <w:tcPr>
-            <w:tcW w:type="dxa" w:w="1355"/>
+            <w:tcW w:type="dxa" w:w="1349"/>
             <w:tcBorders>
               <w:top w:val="single" w:color="BFBFBF" w:sz="4"/>
               <w:left w:val="single" w:color="BFBFBF" w:sz="4"/>
@@ -4675,7 +4715,7 @@
         </w:tc>
         <w:tc>
           <w:tcPr>
-            <w:tcW w:type="dxa" w:w="2343"/>
+            <w:tcW w:type="dxa" w:w="2374"/>
             <w:tcBorders>
               <w:top w:val="single" w:color="BFBFBF" w:sz="4"/>
               <w:left w:val="single" w:color="BFBFBF" w:sz="4"/>
@@ -4704,7 +4744,7 @@
         </w:tc>
         <w:tc>
           <w:tcPr>
-            <w:tcW w:type="dxa" w:w="2192"/>
+            <w:tcW w:type="dxa" w:w="2181"/>
             <w:tcBorders>
               <w:top w:val="single" w:color="BFBFBF" w:sz="4"/>
               <w:left w:val="single" w:color="BFBFBF" w:sz="4"/>
@@ -4733,7 +4773,7 @@
         </w:tc>
         <w:tc>
           <w:tcPr>
-            <w:tcW w:type="dxa" w:w="1540"/>
+            <w:tcW w:type="dxa" w:w="1532"/>
             <w:tcBorders>
               <w:top w:val="single" w:color="BFBFBF" w:sz="4"/>
               <w:left w:val="single" w:color="BFBFBF" w:sz="4"/>
@@ -4817,9 +4857,9 @@
       </w:tblPr>
       <w:tblGrid>
         <w:gridCol w:w="620"/>
-        <w:gridCol w:w="2440"/>
-        <w:gridCol w:w="1776"/>
-        <w:gridCol w:w="4576"/>
+        <w:gridCol w:w="2420"/>
+        <w:gridCol w:w="1834"/>
+        <w:gridCol w:w="4538"/>
       </w:tblGrid>
       <w:tr>
         <w:trPr>
@@ -4860,7 +4900,7 @@
         </w:tc>
         <w:tc>
           <w:tcPr>
-            <w:tcW w:type="dxa" w:w="2440"/>
+            <w:tcW w:type="dxa" w:w="2420"/>
             <w:tcBorders>
               <w:top w:val="single" w:color="BFBFBF" w:sz="4"/>
               <w:left w:val="single" w:color="BFBFBF" w:sz="4"/>
@@ -4892,7 +4932,7 @@
         </w:tc>
         <w:tc>
           <w:tcPr>
-            <w:tcW w:type="dxa" w:w="1776"/>
+            <w:tcW w:type="dxa" w:w="1834"/>
             <w:tcBorders>
               <w:top w:val="single" w:color="BFBFBF" w:sz="4"/>
               <w:left w:val="single" w:color="BFBFBF" w:sz="4"/>
@@ -4924,7 +4964,7 @@
         </w:tc>
         <w:tc>
           <w:tcPr>
-            <w:tcW w:type="dxa" w:w="4576"/>
+            <w:tcW w:type="dxa" w:w="4538"/>
             <w:tcBorders>
               <w:top w:val="single" w:color="BFBFBF" w:sz="4"/>
               <w:left w:val="single" w:color="BFBFBF" w:sz="4"/>
@@ -4990,7 +5030,7 @@
         </w:tc>
         <w:tc>
           <w:tcPr>
-            <w:tcW w:type="dxa" w:w="2440"/>
+            <w:tcW w:type="dxa" w:w="2420"/>
             <w:tcBorders>
               <w:top w:val="single" w:color="BFBFBF" w:sz="4"/>
               <w:left w:val="single" w:color="BFBFBF" w:sz="4"/>
@@ -5044,7 +5084,7 @@
         </w:tc>
         <w:tc>
           <w:tcPr>
-            <w:tcW w:type="dxa" w:w="1776"/>
+            <w:tcW w:type="dxa" w:w="1834"/>
             <w:tcBorders>
               <w:top w:val="single" w:color="BFBFBF" w:sz="4"/>
               <w:left w:val="single" w:color="BFBFBF" w:sz="4"/>
@@ -5073,7 +5113,7 @@
         </w:tc>
         <w:tc>
           <w:tcPr>
-            <w:tcW w:type="dxa" w:w="4576"/>
+            <w:tcW w:type="dxa" w:w="4538"/>
             <w:tcBorders>
               <w:top w:val="single" w:color="BFBFBF" w:sz="4"/>
               <w:left w:val="single" w:color="BFBFBF" w:sz="4"/>
@@ -5121,7 +5161,7 @@
                 <w:sz w:val="18"/>
                 <w:szCs w:val="18"/>
               </w:rPr>
-              <w:t xml:space="preserve">, paso 10: al abrir una compra de 1 entrada las vendidas del sector pasaron de 1635 a 1636, y al cancelarla volvieron a 1635. El vencimiento está en </w:t>
+              <w:t xml:space="preserve">, paso 10: al abrir una compra de 1 entrada las vendidas del sector pasaron de 1444 a 1445, y al cancelarla volvieron a 1444. El vencimiento está en </w:t>
             </w:r>
             <w:r>
               <w:rPr>
@@ -5137,7 +5177,7 @@
                 <w:sz w:val="18"/>
                 <w:szCs w:val="18"/>
               </w:rPr>
-              <w:t xml:space="preserve">: una compra sin pagar pasó a </w:t>
+              <w:t xml:space="preserve">, un resumen de la prueba sin los comandos ni la salida completa: una compra sin pagar pasó a </w:t>
             </w:r>
             <w:r>
               <w:rPr>
@@ -5193,7 +5233,7 @@
         </w:tc>
         <w:tc>
           <w:tcPr>
-            <w:tcW w:type="dxa" w:w="2440"/>
+            <w:tcW w:type="dxa" w:w="2420"/>
             <w:tcBorders>
               <w:top w:val="single" w:color="BFBFBF" w:sz="4"/>
               <w:left w:val="single" w:color="BFBFBF" w:sz="4"/>
@@ -5231,36 +5271,36 @@
         </w:tc>
         <w:tc>
           <w:tcPr>
-            <w:tcW w:type="dxa" w:w="1776"/>
-            <w:tcBorders>
-              <w:top w:val="single" w:color="BFBFBF" w:sz="4"/>
-              <w:left w:val="single" w:color="BFBFBF" w:sz="4"/>
-              <w:bottom w:val="single" w:color="BFBFBF" w:sz="4"/>
-              <w:right w:val="single" w:color="BFBFBF" w:sz="4"/>
-            </w:tcBorders>
-            <w:tcMar>
-              <w:top w:type="dxa" w:w="50"/>
-              <w:left w:type="dxa" w:w="90"/>
-              <w:bottom w:type="dxa" w:w="50"/>
-              <w:right w:type="dxa" w:w="90"/>
-            </w:tcMar>
-          </w:tcPr>
-          <w:p>
-            <w:pPr>
-              <w:spacing w:after="0" w:before="0"/>
-            </w:pPr>
-            <w:r>
-              <w:rPr>
-                <w:sz w:val="18"/>
-                <w:szCs w:val="18"/>
-              </w:rPr>
-              <w:t xml:space="preserve">Exigir identidad verificada para comprar</w:t>
-            </w:r>
-          </w:p>
-        </w:tc>
-        <w:tc>
-          <w:tcPr>
-            <w:tcW w:type="dxa" w:w="4576"/>
+            <w:tcW w:type="dxa" w:w="1834"/>
+            <w:tcBorders>
+              <w:top w:val="single" w:color="BFBFBF" w:sz="4"/>
+              <w:left w:val="single" w:color="BFBFBF" w:sz="4"/>
+              <w:bottom w:val="single" w:color="BFBFBF" w:sz="4"/>
+              <w:right w:val="single" w:color="BFBFBF" w:sz="4"/>
+            </w:tcBorders>
+            <w:tcMar>
+              <w:top w:type="dxa" w:w="50"/>
+              <w:left w:type="dxa" w:w="90"/>
+              <w:bottom w:type="dxa" w:w="50"/>
+              <w:right w:type="dxa" w:w="90"/>
+            </w:tcMar>
+          </w:tcPr>
+          <w:p>
+            <w:pPr>
+              <w:spacing w:after="0" w:before="0"/>
+            </w:pPr>
+            <w:r>
+              <w:rPr>
+                <w:sz w:val="18"/>
+                <w:szCs w:val="18"/>
+              </w:rPr>
+              <w:t xml:space="preserve">Consultar los datos del comprador, con su token, antes de abrirle una compra</w:t>
+            </w:r>
+          </w:p>
+        </w:tc>
+        <w:tc>
+          <w:tcPr>
+            <w:tcW w:type="dxa" w:w="4538"/>
             <w:tcBorders>
               <w:top w:val="single" w:color="BFBFBF" w:sz="4"/>
               <w:left w:val="single" w:color="BFBFBF" w:sz="4"/>
@@ -5285,7 +5325,7 @@
                 <w:sz w:val="18"/>
                 <w:szCs w:val="18"/>
               </w:rPr>
-              <w:t xml:space="preserve">Implementado, sin salida guardada.</w:t>
+              <w:t xml:space="preserve">Implementado.</w:t>
             </w:r>
             <w:r>
               <w:rPr>
@@ -5340,7 +5380,55 @@
                 <w:sz w:val="18"/>
                 <w:szCs w:val="18"/>
               </w:rPr>
-              <w:t xml:space="preserve">). La cuenta de comprador de prueba ya tiene la identidad verificada, así que la evidencia no muestra el rechazo</w:t>
+              <w:t xml:space="preserve">). Toda cuenta que completa el registro puede comprar. </w:t>
+            </w:r>
+            <w:r>
+              <w:rPr>
+                <w:rFonts w:ascii="Consolas" w:cs="Consolas" w:eastAsia="Consolas" w:hAnsi="Consolas"/>
+                <w:sz w:val="17"/>
+                <w:szCs w:val="17"/>
+                <w:shd w:fill="F0F0F0" w:color="auto" w:val="clear"/>
+              </w:rPr>
+              <w:t xml:space="preserve">reproduccion.​txt</w:t>
+            </w:r>
+            <w:r>
+              <w:rPr>
+                <w:sz w:val="18"/>
+                <w:szCs w:val="18"/>
+              </w:rPr>
+              <w:t xml:space="preserve">, pasos 1 a 4, muestra una compra que pasa por esa consulta. El escenario 5 de </w:t>
+            </w:r>
+            <w:r>
+              <w:rPr>
+                <w:rFonts w:ascii="Consolas" w:cs="Consolas" w:eastAsia="Consolas" w:hAnsi="Consolas"/>
+                <w:sz w:val="17"/>
+                <w:szCs w:val="17"/>
+                <w:shd w:fill="F0F0F0" w:color="auto" w:val="clear"/>
+              </w:rPr>
+              <w:t xml:space="preserve">integracion-​13-​escenarios.​txt</w:t>
+            </w:r>
+            <w:r>
+              <w:rPr>
+                <w:sz w:val="18"/>
+                <w:szCs w:val="18"/>
+              </w:rPr>
+              <w:t xml:space="preserve"> muestra un rechazo 403 </w:t>
+            </w:r>
+            <w:r>
+              <w:rPr>
+                <w:rFonts w:ascii="Consolas" w:cs="Consolas" w:eastAsia="Consolas" w:hAnsi="Consolas"/>
+                <w:sz w:val="17"/>
+                <w:szCs w:val="17"/>
+                <w:shd w:fill="F0F0F0" w:color="auto" w:val="clear"/>
+              </w:rPr>
+              <w:t xml:space="preserve">identidad-​no-​verificada</w:t>
+            </w:r>
+            <w:r>
+              <w:rPr>
+                <w:sz w:val="18"/>
+                <w:szCs w:val="18"/>
+              </w:rPr>
+              <w:t xml:space="preserve"> que ya no existe: esa salida es de una versión anterior de Usuarios</w:t>
             </w:r>
           </w:p>
         </w:tc>
@@ -5380,7 +5468,7 @@
         </w:tc>
         <w:tc>
           <w:tcPr>
-            <w:tcW w:type="dxa" w:w="2440"/>
+            <w:tcW w:type="dxa" w:w="2420"/>
             <w:tcBorders>
               <w:top w:val="single" w:color="BFBFBF" w:sz="4"/>
               <w:left w:val="single" w:color="BFBFBF" w:sz="4"/>
@@ -5434,7 +5522,7 @@
         </w:tc>
         <w:tc>
           <w:tcPr>
-            <w:tcW w:type="dxa" w:w="1776"/>
+            <w:tcW w:type="dxa" w:w="1834"/>
             <w:tcBorders>
               <w:top w:val="single" w:color="BFBFBF" w:sz="4"/>
               <w:left w:val="single" w:color="BFBFBF" w:sz="4"/>
@@ -5463,7 +5551,7 @@
         </w:tc>
         <w:tc>
           <w:tcPr>
-            <w:tcW w:type="dxa" w:w="4576"/>
+            <w:tcW w:type="dxa" w:w="4538"/>
             <w:tcBorders>
               <w:top w:val="single" w:color="BFBFBF" w:sz="4"/>
               <w:left w:val="single" w:color="BFBFBF" w:sz="4"/>
@@ -5527,7 +5615,7 @@
                 <w:sz w:val="18"/>
                 <w:szCs w:val="18"/>
               </w:rPr>
-              <w:t xml:space="preserve"> dice "Pago P-436c4e46 de la venta V-e9ee3ad1: APROBADO (pasarela fake)" y Ventas confirma la compra con ese pago. La llamada la hace </w:t>
+              <w:t xml:space="preserve"> dice "Pago P-6d48cf81 de la venta V-3c150ebb: APROBADO (pasarela fake)" y Ventas confirma la compra con ese pago. La llamada la hace </w:t>
             </w:r>
             <w:r>
               <w:rPr>
@@ -5679,7 +5767,7 @@
         </w:tc>
         <w:tc>
           <w:tcPr>
-            <w:tcW w:type="dxa" w:w="2440"/>
+            <w:tcW w:type="dxa" w:w="2420"/>
             <w:tcBorders>
               <w:top w:val="single" w:color="BFBFBF" w:sz="4"/>
               <w:left w:val="single" w:color="BFBFBF" w:sz="4"/>
@@ -5708,7 +5796,7 @@
         </w:tc>
         <w:tc>
           <w:tcPr>
-            <w:tcW w:type="dxa" w:w="1776"/>
+            <w:tcW w:type="dxa" w:w="1834"/>
             <w:tcBorders>
               <w:top w:val="single" w:color="BFBFBF" w:sz="4"/>
               <w:left w:val="single" w:color="BFBFBF" w:sz="4"/>
@@ -5737,7 +5825,7 @@
         </w:tc>
         <w:tc>
           <w:tcPr>
-            <w:tcW w:type="dxa" w:w="4576"/>
+            <w:tcW w:type="dxa" w:w="4538"/>
             <w:tcBorders>
               <w:top w:val="single" w:color="BFBFBF" w:sz="4"/>
               <w:left w:val="single" w:color="BFBFBF" w:sz="4"/>
@@ -5825,7 +5913,7 @@
         </w:tc>
         <w:tc>
           <w:tcPr>
-            <w:tcW w:type="dxa" w:w="2440"/>
+            <w:tcW w:type="dxa" w:w="2420"/>
             <w:tcBorders>
               <w:top w:val="single" w:color="BFBFBF" w:sz="4"/>
               <w:left w:val="single" w:color="BFBFBF" w:sz="4"/>
@@ -5854,7 +5942,7 @@
         </w:tc>
         <w:tc>
           <w:tcPr>
-            <w:tcW w:type="dxa" w:w="1776"/>
+            <w:tcW w:type="dxa" w:w="1834"/>
             <w:tcBorders>
               <w:top w:val="single" w:color="BFBFBF" w:sz="4"/>
               <w:left w:val="single" w:color="BFBFBF" w:sz="4"/>
@@ -5883,7 +5971,7 @@
         </w:tc>
         <w:tc>
           <w:tcPr>
-            <w:tcW w:type="dxa" w:w="4576"/>
+            <w:tcW w:type="dxa" w:w="4538"/>
             <w:tcBorders>
               <w:top w:val="single" w:color="BFBFBF" w:sz="4"/>
               <w:left w:val="single" w:color="BFBFBF" w:sz="4"/>
@@ -5987,7 +6075,7 @@
         <w:t xml:space="preserve">ServicioDePagos</w:t>
       </w:r>
       <w:r>
-        <w:t xml:space="preserve">, con una pasarela simulada que no mueve plata (sección 6.1). Ese único evento dispara dos procesos:</w:t>
+        <w:t xml:space="preserve">, con una pasarela simulada que no mueve plata (sección 6.1). Ese único evento tiene dos destinos:</w:t>
       </w:r>
     </w:p>
     <w:p>
@@ -7725,7 +7813,7 @@
           <w:szCs w:val="20"/>
           <w:shd w:fill="F0F0F0" w:color="auto" w:val="clear"/>
         </w:rPr>
-        <w:t xml:space="preserve">V-e9ee3ad1</w:t>
+        <w:t xml:space="preserve">V-3c150ebb</w:t>
       </w:r>
       <w:r>
         <w:t xml:space="preserve">, del 13/10/2026 (</w:t>
@@ -7757,7 +7845,7 @@
           <w:b/>
           <w:bCs/>
         </w:rPr>
-        <w:t xml:space="preserve">14:04:34,696.</w:t>
+        <w:t xml:space="preserve">15:46:20,548.</w:t>
       </w:r>
       <w:r>
         <w:t xml:space="preserve"> El comprador abre la compra con </w:t>
@@ -7801,7 +7889,7 @@
           <w:b/>
           <w:bCs/>
         </w:rPr>
-        <w:t xml:space="preserve">14:04:35,578.</w:t>
+        <w:t xml:space="preserve">15:46:21,519.</w:t>
       </w:r>
       <w:r>
         <w:t xml:space="preserve"> El comprador paga con </w:t>
@@ -7813,7 +7901,7 @@
           <w:szCs w:val="20"/>
           <w:shd w:fill="F0F0F0" w:color="auto" w:val="clear"/>
         </w:rPr>
-        <w:t xml:space="preserve">POST /api/v1/ventas/V-e9ee3ad1/pagos</w:t>
+        <w:t xml:space="preserve">POST /api/v1/ventas/V-3c150ebb/pagos</w:t>
       </w:r>
       <w:r>
         <w:t xml:space="preserve">. Ventas llama a </w:t>
@@ -7837,7 +7925,7 @@
           <w:szCs w:val="20"/>
           <w:shd w:fill="F0F0F0" w:color="auto" w:val="clear"/>
         </w:rPr>
-        <w:t xml:space="preserve">P-436c4e46</w:t>
+        <w:t xml:space="preserve">P-6d48cf81</w:t>
       </w:r>
       <w:r>
         <w:t xml:space="preserve">.</w:t>
@@ -7857,7 +7945,7 @@
           <w:b/>
           <w:bCs/>
         </w:rPr>
-        <w:t xml:space="preserve">14:04:35,590.</w:t>
+        <w:t xml:space="preserve">15:46:21,559.</w:t>
       </w:r>
       <w:r>
         <w:t xml:space="preserve"> Ventas pasa la venta a </w:t>
@@ -7896,7 +7984,7 @@
         <w:t xml:space="preserve">PAGO_CONFIRMADO</w:t>
       </w:r>
       <w:r>
-        <w:t xml:space="preserve">. El log dice: "Compra V-e9ee3ad1 confirmada con el pago P-436c4e46. Entradas creadas: 2. PAGO_CONFIRMADO publicado en la misma transacción". Responde 201 al comprador con las entradas todavía sin emitir.</w:t>
+        <w:t xml:space="preserve">. El log dice: "Compra V-3c150ebb confirmada con el pago P-6d48cf81. Entradas creadas: 2. PAGO_CONFIRMADO publicado en la misma transacción". Responde 201 al comprador con las entradas todavía sin emitir.</w:t>
       </w:r>
     </w:p>
     <w:p>
@@ -7913,7 +8001,7 @@
           <w:b/>
           <w:bCs/>
         </w:rPr>
-        <w:t xml:space="preserve">14:04:35,612.</w:t>
+        <w:t xml:space="preserve">15:46:21,594 y 15:46:21,607.</w:t>
       </w:r>
       <w:r>
         <w:t xml:space="preserve"> </w:t>
@@ -7940,7 +8028,7 @@
         <w:t xml:space="preserve">AuditoriaDeComprasMDB</w:t>
       </w:r>
       <w:r>
-        <w:t xml:space="preserve"> procesan su copia del tópico.</w:t>
+        <w:t xml:space="preserve"> procesan su copia del tópico. El aviso se escribe en el log del servidor y no se envía, aunque la línea guardada en la evidencia dice "aviso enviado".</w:t>
       </w:r>
     </w:p>
     <w:p>
@@ -7957,7 +8045,7 @@
           <w:b/>
           <w:bCs/>
         </w:rPr>
-        <w:t xml:space="preserve">14:04:35,614.</w:t>
+        <w:t xml:space="preserve">15:46:21,624.</w:t>
       </w:r>
       <w:r>
         <w:t xml:space="preserve"> </w:t>
@@ -7972,7 +8060,7 @@
         <w:t xml:space="preserve">EmisionDeEntradasMDB</w:t>
       </w:r>
       <w:r>
-        <w:t xml:space="preserve"> procesa el mensaje de la cola: "Entradas emitidas: 2. La venta pasó a EMITIDA". Son 24 milisegundos después de la confirmación.</w:t>
+        <w:t xml:space="preserve"> procesa el mensaje de la cola: "Entradas emitidas: 2. La venta pasó a EMITIDA". Son 65 milisegundos después de la confirmación.</w:t>
       </w:r>
     </w:p>
     <w:p>
@@ -7985,7 +8073,7 @@
         <w:spacing w:after="60" w:before="0"/>
       </w:pPr>
       <w:r>
-        <w:t xml:space="preserve">Tres segundos después, </w:t>
+        <w:t xml:space="preserve">Unos segundos después, </w:t>
       </w:r>
       <w:r>
         <w:rPr>
@@ -7994,7 +8082,7 @@
           <w:szCs w:val="20"/>
           <w:shd w:fill="F0F0F0" w:color="auto" w:val="clear"/>
         </w:rPr>
-        <w:t xml:space="preserve">GET /api/v1/ventas/V-e9ee3ad1</w:t>
+        <w:t xml:space="preserve">GET /api/v1/ventas/V-3c150ebb</w:t>
       </w:r>
       <w:r>
         <w:t xml:space="preserve"> devuelve </w:t>
@@ -8018,7 +8106,7 @@
           <w:szCs w:val="20"/>
           <w:shd w:fill="F0F0F0" w:color="auto" w:val="clear"/>
         </w:rPr>
-        <w:t xml:space="preserve">GET /api/v1/entradas/T-92208d45</w:t>
+        <w:t xml:space="preserve">GET /api/v1/entradas/T-364f302b</w:t>
       </w:r>
       <w:r>
         <w:t xml:space="preserve"> devuelve </w:t>
@@ -8088,7 +8176,7 @@
           <w:szCs w:val="20"/>
           <w:shd w:fill="F0F0F0" w:color="auto" w:val="clear"/>
         </w:rPr>
-        <w:t xml:space="preserve">default task-275</w:t>
+        <w:t xml:space="preserve">default task-2</w:t>
       </w:r>
       <w:r>
         <w:t xml:space="preserve">) y los tres consumidores, en hilos del cliente del broker (</w:t>
@@ -8100,10 +8188,10 @@
           <w:szCs w:val="20"/>
           <w:shd w:fill="F0F0F0" w:color="auto" w:val="clear"/>
         </w:rPr>
-        <w:t xml:space="preserve">Thread-228</w:t>
-      </w:r>
-      <w:r>
-        <w:t xml:space="preserve">, </w:t>
+        <w:t xml:space="preserve">Thread-0</w:t>
+      </w:r>
+      <w:r>
+        <w:t xml:space="preserve"> y </w:t>
       </w:r>
       <w:r>
         <w:rPr>
@@ -8112,10 +8200,10 @@
           <w:szCs w:val="20"/>
           <w:shd w:fill="F0F0F0" w:color="auto" w:val="clear"/>
         </w:rPr>
-        <w:t xml:space="preserve">Thread-229</w:t>
-      </w:r>
-      <w:r>
-        <w:t xml:space="preserve"> y </w:t>
+        <w:t xml:space="preserve">Thread-1 (activemq-client-global)</w:t>
+      </w:r>
+      <w:r>
+        <w:t xml:space="preserve">). El cobro corre en otro hilo de pedidos HTTP (</w:t>
       </w:r>
       <w:r>
         <w:rPr>
@@ -8124,19 +8212,7 @@
           <w:szCs w:val="20"/>
           <w:shd w:fill="F0F0F0" w:color="auto" w:val="clear"/>
         </w:rPr>
-        <w:t xml:space="preserve">Thread-230 (activemq-client-global)</w:t>
-      </w:r>
-      <w:r>
-        <w:t xml:space="preserve">). El cobro corre en otro hilo de pedidos HTTP (</w:t>
-      </w:r>
-      <w:r>
-        <w:rPr>
-          <w:rFonts w:ascii="Consolas" w:cs="Consolas" w:eastAsia="Consolas" w:hAnsi="Consolas"/>
-          <w:sz w:val="20"/>
-          <w:szCs w:val="20"/>
-          <w:shd w:fill="F0F0F0" w:color="auto" w:val="clear"/>
-        </w:rPr>
-        <w:t xml:space="preserve">default task-267</w:t>
+        <w:t xml:space="preserve">default task-3</w:t>
       </w:r>
       <w:r>
         <w:t xml:space="preserve">), porque es una llamada REST de un WAR a otro.</w:t>
@@ -8212,7 +8288,7 @@
           <w:szCs w:val="20"/>
           <w:shd w:fill="F0F0F0" w:color="auto" w:val="clear"/>
         </w:rPr>
-        <w:t xml:space="preserve">ID:2acd1ab7-c728-11f1-8599-0a0027000009</w:t>
+        <w:t xml:space="preserve">ID:623e08e5-c736-11f1-9d59-0a0027000009</w:t>
       </w:r>
       <w:r>
         <w:t xml:space="preserve">).</w:t>
@@ -8228,7 +8304,7 @@
         <w:spacing w:after="120" w:before="0"/>
       </w:pPr>
       <w:r>
-        <w:t xml:space="preserve">La primera toma de evidencia, de las 10:40 del mismo día, muestra el mismo recorrido de mensajes con la venta </w:t>
+        <w:t xml:space="preserve">Un minuto antes, la primera compra del servidor recién reiniciado muestra el mismo recorrido, paso por paso y con el comando de cada uno: venta </w:t>
       </w:r>
       <w:r>
         <w:rPr>
@@ -8237,7 +8313,43 @@
           <w:szCs w:val="20"/>
           <w:shd w:fill="F0F0F0" w:color="auto" w:val="clear"/>
         </w:rPr>
-        <w:t xml:space="preserve">V-be1e5e8e</w:t>
+        <w:t xml:space="preserve">V-91934f4a</w:t>
+      </w:r>
+      <w:r>
+        <w:t xml:space="preserve">, pago </w:t>
+      </w:r>
+      <w:r>
+        <w:rPr>
+          <w:rFonts w:ascii="Consolas" w:cs="Consolas" w:eastAsia="Consolas" w:hAnsi="Consolas"/>
+          <w:sz w:val="20"/>
+          <w:szCs w:val="20"/>
+          <w:shd w:fill="F0F0F0" w:color="auto" w:val="clear"/>
+        </w:rPr>
+        <w:t xml:space="preserve">P-8c25143c</w:t>
+      </w:r>
+      <w:r>
+        <w:t xml:space="preserve"> y entradas </w:t>
+      </w:r>
+      <w:r>
+        <w:rPr>
+          <w:rFonts w:ascii="Consolas" w:cs="Consolas" w:eastAsia="Consolas" w:hAnsi="Consolas"/>
+          <w:sz w:val="20"/>
+          <w:szCs w:val="20"/>
+          <w:shd w:fill="F0F0F0" w:color="auto" w:val="clear"/>
+        </w:rPr>
+        <w:t xml:space="preserve">T-3b438461</w:t>
+      </w:r>
+      <w:r>
+        <w:t xml:space="preserve"> y </w:t>
+      </w:r>
+      <w:r>
+        <w:rPr>
+          <w:rFonts w:ascii="Consolas" w:cs="Consolas" w:eastAsia="Consolas" w:hAnsi="Consolas"/>
+          <w:sz w:val="20"/>
+          <w:szCs w:val="20"/>
+          <w:shd w:fill="F0F0F0" w:color="auto" w:val="clear"/>
+        </w:rPr>
+        <w:t xml:space="preserve">T-50e62a72</w:t>
       </w:r>
       <w:r>
         <w:t xml:space="preserve"> (</w:t>
@@ -8324,19 +8436,7 @@
         <w:t xml:space="preserve">auditoria.txt</w:t>
       </w:r>
       <w:r>
-        <w:t xml:space="preserve">). En esa toma Ventas todavía cobraba con su simulador local, </w:t>
-      </w:r>
-      <w:r>
-        <w:rPr>
-          <w:rFonts w:ascii="Consolas" w:cs="Consolas" w:eastAsia="Consolas" w:hAnsi="Consolas"/>
-          <w:sz w:val="20"/>
-          <w:szCs w:val="20"/>
-          <w:shd w:fill="F0F0F0" w:color="auto" w:val="clear"/>
-        </w:rPr>
-        <w:t xml:space="preserve">CobrosFake</w:t>
-      </w:r>
-      <w:r>
-        <w:t xml:space="preserve">: la llamada a Pagos quedó desplegada a las 13:54.</w:t>
+        <w:t xml:space="preserve">). En esa toma la cola y el tópico arrancan en 0 y terminan en 1 y 2.</w:t>
       </w:r>
     </w:p>
     <w:p>
@@ -8489,9 +8589,9 @@
         <w:tblLayout w:type="fixed"/>
       </w:tblPr>
       <w:tblGrid>
-        <w:gridCol w:w="2099"/>
-        <w:gridCol w:w="3676"/>
-        <w:gridCol w:w="3637"/>
+        <w:gridCol w:w="1434"/>
+        <w:gridCol w:w="3826"/>
+        <w:gridCol w:w="4152"/>
       </w:tblGrid>
       <w:tr>
         <w:trPr>
@@ -8500,7 +8600,7 @@
         </w:trPr>
         <w:tc>
           <w:tcPr>
-            <w:tcW w:type="dxa" w:w="2099"/>
+            <w:tcW w:type="dxa" w:w="1434"/>
             <w:tcBorders>
               <w:top w:val="single" w:color="BFBFBF" w:sz="4"/>
               <w:left w:val="single" w:color="BFBFBF" w:sz="4"/>
@@ -8532,7 +8632,7 @@
         </w:tc>
         <w:tc>
           <w:tcPr>
-            <w:tcW w:type="dxa" w:w="3676"/>
+            <w:tcW w:type="dxa" w:w="3826"/>
             <w:tcBorders>
               <w:top w:val="single" w:color="BFBFBF" w:sz="4"/>
               <w:left w:val="single" w:color="BFBFBF" w:sz="4"/>
@@ -8564,7 +8664,7 @@
         </w:tc>
         <w:tc>
           <w:tcPr>
-            <w:tcW w:type="dxa" w:w="3637"/>
+            <w:tcW w:type="dxa" w:w="4152"/>
             <w:tcBorders>
               <w:top w:val="single" w:color="BFBFBF" w:sz="4"/>
               <w:left w:val="single" w:color="BFBFBF" w:sz="4"/>
@@ -8601,7 +8701,7 @@
         </w:trPr>
         <w:tc>
           <w:tcPr>
-            <w:tcW w:type="dxa" w:w="2099"/>
+            <w:tcW w:type="dxa" w:w="1434"/>
             <w:tcBorders>
               <w:top w:val="single" w:color="BFBFBF" w:sz="4"/>
               <w:left w:val="single" w:color="BFBFBF" w:sz="4"/>
@@ -8630,7 +8730,7 @@
         </w:tc>
         <w:tc>
           <w:tcPr>
-            <w:tcW w:type="dxa" w:w="3676"/>
+            <w:tcW w:type="dxa" w:w="3826"/>
             <w:tcBorders>
               <w:top w:val="single" w:color="BFBFBF" w:sz="4"/>
               <w:left w:val="single" w:color="BFBFBF" w:sz="4"/>
@@ -8659,7 +8759,7 @@
         </w:tc>
         <w:tc>
           <w:tcPr>
-            <w:tcW w:type="dxa" w:w="3637"/>
+            <w:tcW w:type="dxa" w:w="4152"/>
             <w:tcBorders>
               <w:top w:val="single" w:color="BFBFBF" w:sz="4"/>
               <w:left w:val="single" w:color="BFBFBF" w:sz="4"/>
@@ -8691,7 +8791,39 @@
                 <w:sz w:val="18"/>
                 <w:szCs w:val="18"/>
               </w:rPr>
-              <w:t xml:space="preserve">, paso 8. Un endpoint de prueba publica con el publicador real y después lanza un error: responde 409, los contadores no cambian y ningún consumidor escribe en el log</w:t>
+              <w:t xml:space="preserve">, paso 8. Se probó con un endpoint de prueba de Notificaciones (</w:t>
+            </w:r>
+            <w:r>
+              <w:rPr>
+                <w:rFonts w:ascii="Consolas" w:cs="Consolas" w:eastAsia="Consolas" w:hAnsi="Consolas"/>
+                <w:sz w:val="17"/>
+                <w:szCs w:val="17"/>
+                <w:shd w:fill="F0F0F0" w:color="auto" w:val="clear"/>
+              </w:rPr>
+              <w:t xml:space="preserve">PruebasDeMensajeria</w:t>
+            </w:r>
+            <w:r>
+              <w:rPr>
+                <w:sz w:val="18"/>
+                <w:szCs w:val="18"/>
+              </w:rPr>
+              <w:t xml:space="preserve">) que el publicador no publica si la transacción de quien lo llama se deshace: responde 409, los contadores no cambian y ningún consumidor escribe en el log. Una falla dentro de </w:t>
+            </w:r>
+            <w:r>
+              <w:rPr>
+                <w:rFonts w:ascii="Consolas" w:cs="Consolas" w:eastAsia="Consolas" w:hAnsi="Consolas"/>
+                <w:sz w:val="17"/>
+                <w:szCs w:val="17"/>
+                <w:shd w:fill="F0F0F0" w:color="auto" w:val="clear"/>
+              </w:rPr>
+              <w:t xml:space="preserve">confirmarCompra</w:t>
+            </w:r>
+            <w:r>
+              <w:rPr>
+                <w:sz w:val="18"/>
+                <w:szCs w:val="18"/>
+              </w:rPr>
+              <w:t xml:space="preserve"> no se probó en vivo</w:t>
             </w:r>
           </w:p>
         </w:tc>
@@ -8702,7 +8834,7 @@
         </w:trPr>
         <w:tc>
           <w:tcPr>
-            <w:tcW w:type="dxa" w:w="2099"/>
+            <w:tcW w:type="dxa" w:w="1434"/>
             <w:tcBorders>
               <w:top w:val="single" w:color="BFBFBF" w:sz="4"/>
               <w:left w:val="single" w:color="BFBFBF" w:sz="4"/>
@@ -8731,7 +8863,7 @@
         </w:tc>
         <w:tc>
           <w:tcPr>
-            <w:tcW w:type="dxa" w:w="3676"/>
+            <w:tcW w:type="dxa" w:w="3826"/>
             <w:tcBorders>
               <w:top w:val="single" w:color="BFBFBF" w:sz="4"/>
               <w:left w:val="single" w:color="BFBFBF" w:sz="4"/>
@@ -8760,7 +8892,7 @@
         </w:tc>
         <w:tc>
           <w:tcPr>
-            <w:tcW w:type="dxa" w:w="3637"/>
+            <w:tcW w:type="dxa" w:w="4152"/>
             <w:tcBorders>
               <w:top w:val="single" w:color="BFBFBF" w:sz="4"/>
               <w:left w:val="single" w:color="BFBFBF" w:sz="4"/>
@@ -8792,7 +8924,32 @@
                 <w:sz w:val="18"/>
                 <w:szCs w:val="18"/>
               </w:rPr>
-              <w:t xml:space="preserve">. Había 64 mensajes pendientes y ningún consumidor; al desplegarlo quedaron 0, con 39 ventas emitidas y 25 mensajes de prueba descartados</w:t>
+              <w:t xml:space="preserve">. Había 64 mensajes pendientes y ningún consumidor; al desplegarlo quedaron 0, con 39 ventas emitidas y 25 mensajes de prueba descartados. Con el servidor de la tarde, el escenario 10 de </w:t>
+            </w:r>
+            <w:r>
+              <w:rPr>
+                <w:rFonts w:ascii="Consolas" w:cs="Consolas" w:eastAsia="Consolas" w:hAnsi="Consolas"/>
+                <w:sz w:val="17"/>
+                <w:szCs w:val="17"/>
+                <w:shd w:fill="F0F0F0" w:color="auto" w:val="clear"/>
+              </w:rPr>
+              <w:t xml:space="preserve">integracion-​13-​escenarios.​txt</w:t>
+            </w:r>
+            <w:r>
+              <w:rPr>
+                <w:sz w:val="18"/>
+                <w:szCs w:val="18"/>
+              </w:rPr>
+              <w:t xml:space="preserve"> lo repite deteniendo y reanudando </w:t>
+            </w:r>
+            <w:r>
+              <w:rPr>
+                <w:rFonts w:ascii="Consolas" w:cs="Consolas" w:eastAsia="Consolas" w:hAnsi="Consolas"/>
+                <w:sz w:val="17"/>
+                <w:szCs w:val="17"/>
+                <w:shd w:fill="F0F0F0" w:color="auto" w:val="clear"/>
+              </w:rPr>
+              <w:t xml:space="preserve">EmisionDeEntradasMDB</w:t>
             </w:r>
           </w:p>
         </w:tc>
@@ -8803,7 +8960,7 @@
         </w:trPr>
         <w:tc>
           <w:tcPr>
-            <w:tcW w:type="dxa" w:w="2099"/>
+            <w:tcW w:type="dxa" w:w="1434"/>
             <w:tcBorders>
               <w:top w:val="single" w:color="BFBFBF" w:sz="4"/>
               <w:left w:val="single" w:color="BFBFBF" w:sz="4"/>
@@ -8832,7 +8989,7 @@
         </w:tc>
         <w:tc>
           <w:tcPr>
-            <w:tcW w:type="dxa" w:w="3676"/>
+            <w:tcW w:type="dxa" w:w="3826"/>
             <w:tcBorders>
               <w:top w:val="single" w:color="BFBFBF" w:sz="4"/>
               <w:left w:val="single" w:color="BFBFBF" w:sz="4"/>
@@ -8893,24 +9050,88 @@
         </w:tc>
         <w:tc>
           <w:tcPr>
-            <w:tcW w:type="dxa" w:w="3637"/>
-            <w:tcBorders>
-              <w:top w:val="single" w:color="BFBFBF" w:sz="4"/>
-              <w:left w:val="single" w:color="BFBFBF" w:sz="4"/>
-              <w:bottom w:val="single" w:color="BFBFBF" w:sz="4"/>
-              <w:right w:val="single" w:color="BFBFBF" w:sz="4"/>
-            </w:tcBorders>
-            <w:tcMar>
-              <w:top w:type="dxa" w:w="50"/>
-              <w:left w:type="dxa" w:w="90"/>
-              <w:bottom w:type="dxa" w:w="50"/>
-              <w:right w:type="dxa" w:w="90"/>
-            </w:tcMar>
-          </w:tcPr>
-          <w:p>
-            <w:pPr>
-              <w:spacing w:after="0" w:before="0"/>
-            </w:pPr>
+            <w:tcW w:type="dxa" w:w="4152"/>
+            <w:tcBorders>
+              <w:top w:val="single" w:color="BFBFBF" w:sz="4"/>
+              <w:left w:val="single" w:color="BFBFBF" w:sz="4"/>
+              <w:bottom w:val="single" w:color="BFBFBF" w:sz="4"/>
+              <w:right w:val="single" w:color="BFBFBF" w:sz="4"/>
+            </w:tcBorders>
+            <w:tcMar>
+              <w:top w:type="dxa" w:w="50"/>
+              <w:left w:type="dxa" w:w="90"/>
+              <w:bottom w:type="dxa" w:w="50"/>
+              <w:right w:type="dxa" w:w="90"/>
+            </w:tcMar>
+          </w:tcPr>
+          <w:p>
+            <w:pPr>
+              <w:spacing w:after="0" w:before="0"/>
+            </w:pPr>
+            <w:r>
+              <w:rPr>
+                <w:rFonts w:ascii="Consolas" w:cs="Consolas" w:eastAsia="Consolas" w:hAnsi="Consolas"/>
+                <w:sz w:val="17"/>
+                <w:szCs w:val="17"/>
+                <w:shd w:fill="F0F0F0" w:color="auto" w:val="clear"/>
+              </w:rPr>
+              <w:t xml:space="preserve">integracion-​13-​escenarios.​txt</w:t>
+            </w:r>
+            <w:r>
+              <w:rPr>
+                <w:sz w:val="18"/>
+                <w:szCs w:val="18"/>
+              </w:rPr>
+              <w:t xml:space="preserve">, escenario 8, con el código entregado y repetible con </w:t>
+            </w:r>
+            <w:r>
+              <w:rPr>
+                <w:rFonts w:ascii="Consolas" w:cs="Consolas" w:eastAsia="Consolas" w:hAnsi="Consolas"/>
+                <w:sz w:val="17"/>
+                <w:szCs w:val="17"/>
+                <w:shd w:fill="F0F0F0" w:color="auto" w:val="clear"/>
+              </w:rPr>
+              <w:t xml:space="preserve">node scripts/​pruebas/​escenarios.​mjs 8</w:t>
+            </w:r>
+            <w:r>
+              <w:rPr>
+                <w:sz w:val="18"/>
+                <w:szCs w:val="18"/>
+              </w:rPr>
+              <w:t xml:space="preserve">: la copia del mensaje que esperaba en la suscripción de auditoría se pasa con </w:t>
+            </w:r>
+            <w:r>
+              <w:rPr>
+                <w:rFonts w:ascii="Consolas" w:cs="Consolas" w:eastAsia="Consolas" w:hAnsi="Consolas"/>
+                <w:sz w:val="17"/>
+                <w:szCs w:val="17"/>
+                <w:shd w:fill="F0F0F0" w:color="auto" w:val="clear"/>
+              </w:rPr>
+              <w:t xml:space="preserve">move-​messages</w:t>
+            </w:r>
+            <w:r>
+              <w:rPr>
+                <w:sz w:val="18"/>
+                <w:szCs w:val="18"/>
+              </w:rPr>
+              <w:t xml:space="preserve"> a la cola, el consumidor la reconoce como repetida y los códigos, las fechas de emisión y la </w:t>
+            </w:r>
+            <w:r>
+              <w:rPr>
+                <w:rFonts w:ascii="Consolas" w:cs="Consolas" w:eastAsia="Consolas" w:hAnsi="Consolas"/>
+                <w:sz w:val="17"/>
+                <w:szCs w:val="17"/>
+                <w:shd w:fill="F0F0F0" w:color="auto" w:val="clear"/>
+              </w:rPr>
+              <w:t xml:space="preserve">DLQ</w:t>
+            </w:r>
+            <w:r>
+              <w:rPr>
+                <w:sz w:val="18"/>
+                <w:szCs w:val="18"/>
+              </w:rPr>
+              <w:t xml:space="preserve"> no cambian. Como complemento, </w:t>
+            </w:r>
             <w:r>
               <w:rPr>
                 <w:rFonts w:ascii="Consolas" w:cs="Consolas" w:eastAsia="Consolas" w:hAnsi="Consolas"/>
@@ -8925,7 +9146,7 @@
                 <w:sz w:val="18"/>
                 <w:szCs w:val="18"/>
               </w:rPr>
-              <w:t xml:space="preserve">, partes A y B. Con 8 copias a la vez hubo una emisión y 7 mensajes reconocidos como repetidos</w:t>
+              <w:t xml:space="preserve">, partes A y B, con una versión modificada del servicio que no está en el repositorio: con 8 copias a la vez hubo una emisión y 7 mensajes reconocidos como repetidos</w:t>
             </w:r>
           </w:p>
         </w:tc>
@@ -8936,7 +9157,7 @@
         </w:trPr>
         <w:tc>
           <w:tcPr>
-            <w:tcW w:type="dxa" w:w="2099"/>
+            <w:tcW w:type="dxa" w:w="1434"/>
             <w:tcBorders>
               <w:top w:val="single" w:color="BFBFBF" w:sz="4"/>
               <w:left w:val="single" w:color="BFBFBF" w:sz="4"/>
@@ -8965,7 +9186,7 @@
         </w:tc>
         <w:tc>
           <w:tcPr>
-            <w:tcW w:type="dxa" w:w="3676"/>
+            <w:tcW w:type="dxa" w:w="3826"/>
             <w:tcBorders>
               <w:top w:val="single" w:color="BFBFBF" w:sz="4"/>
               <w:left w:val="single" w:color="BFBFBF" w:sz="4"/>
@@ -9015,34 +9236,194 @@
               </w:rPr>
               <w:t xml:space="preserve">CONFIRMADA</w:t>
             </w:r>
-          </w:p>
-        </w:tc>
-        <w:tc>
-          <w:tcPr>
-            <w:tcW w:type="dxa" w:w="3637"/>
-            <w:tcBorders>
-              <w:top w:val="single" w:color="BFBFBF" w:sz="4"/>
-              <w:left w:val="single" w:color="BFBFBF" w:sz="4"/>
-              <w:bottom w:val="single" w:color="BFBFBF" w:sz="4"/>
-              <w:right w:val="single" w:color="BFBFBF" w:sz="4"/>
-            </w:tcBorders>
-            <w:tcMar>
-              <w:top w:type="dxa" w:w="50"/>
-              <w:left w:type="dxa" w:w="90"/>
-              <w:bottom w:type="dxa" w:w="50"/>
-              <w:right w:type="dxa" w:w="90"/>
-            </w:tcMar>
-          </w:tcPr>
-          <w:p>
-            <w:pPr>
-              <w:spacing w:after="0" w:before="0"/>
-            </w:pPr>
-            <w:r>
-              <w:rPr>
-                <w:sz w:val="18"/>
-                <w:szCs w:val="18"/>
-              </w:rPr>
-              <w:t xml:space="preserve">El mismo archivo, partes D y E</w:t>
+            <w:r>
+              <w:rPr>
+                <w:sz w:val="18"/>
+                <w:szCs w:val="18"/>
+              </w:rPr>
+              <w:t xml:space="preserve">, con sus entradas </w:t>
+            </w:r>
+            <w:r>
+              <w:rPr>
+                <w:rFonts w:ascii="Consolas" w:cs="Consolas" w:eastAsia="Consolas" w:hAnsi="Consolas"/>
+                <w:sz w:val="17"/>
+                <w:szCs w:val="17"/>
+                <w:shd w:fill="F0F0F0" w:color="auto" w:val="clear"/>
+              </w:rPr>
+              <w:t xml:space="preserve">PENDIENTE_​EMISION</w:t>
+            </w:r>
+            <w:r>
+              <w:rPr>
+                <w:sz w:val="18"/>
+                <w:szCs w:val="18"/>
+              </w:rPr>
+              <w:t xml:space="preserve">. Para recuperarla se revisa la causa, se la corrige y se mueve el mensaje de la </w:t>
+            </w:r>
+            <w:r>
+              <w:rPr>
+                <w:rFonts w:ascii="Consolas" w:cs="Consolas" w:eastAsia="Consolas" w:hAnsi="Consolas"/>
+                <w:sz w:val="17"/>
+                <w:szCs w:val="17"/>
+                <w:shd w:fill="F0F0F0" w:color="auto" w:val="clear"/>
+              </w:rPr>
+              <w:t xml:space="preserve">DLQ</w:t>
+            </w:r>
+            <w:r>
+              <w:rPr>
+                <w:sz w:val="18"/>
+                <w:szCs w:val="18"/>
+              </w:rPr>
+              <w:t xml:space="preserve"> a </w:t>
+            </w:r>
+            <w:r>
+              <w:rPr>
+                <w:rFonts w:ascii="Consolas" w:cs="Consolas" w:eastAsia="Consolas" w:hAnsi="Consolas"/>
+                <w:sz w:val="17"/>
+                <w:szCs w:val="17"/>
+                <w:shd w:fill="F0F0F0" w:color="auto" w:val="clear"/>
+              </w:rPr>
+              <w:t xml:space="preserve">cola.​emision-​entradas</w:t>
+            </w:r>
+            <w:r>
+              <w:rPr>
+                <w:sz w:val="18"/>
+                <w:szCs w:val="18"/>
+              </w:rPr>
+              <w:t xml:space="preserve"> con </w:t>
+            </w:r>
+            <w:r>
+              <w:rPr>
+                <w:rFonts w:ascii="Consolas" w:cs="Consolas" w:eastAsia="Consolas" w:hAnsi="Consolas"/>
+                <w:sz w:val="17"/>
+                <w:szCs w:val="17"/>
+                <w:shd w:fill="F0F0F0" w:color="auto" w:val="clear"/>
+              </w:rPr>
+              <w:t xml:space="preserve">move-​messages</w:t>
+            </w:r>
+            <w:r>
+              <w:rPr>
+                <w:sz w:val="18"/>
+                <w:szCs w:val="18"/>
+              </w:rPr>
+              <w:t xml:space="preserve">, filtrando por la cola de origen; es seguro porque la emisión es idempotente (procedimiento en </w:t>
+            </w:r>
+            <w:r>
+              <w:rPr>
+                <w:rFonts w:ascii="Consolas" w:cs="Consolas" w:eastAsia="Consolas" w:hAnsi="Consolas"/>
+                <w:sz w:val="17"/>
+                <w:szCs w:val="17"/>
+                <w:shd w:fill="F0F0F0" w:color="auto" w:val="clear"/>
+              </w:rPr>
+              <w:t xml:space="preserve">docs/​notas/​mensajeria.​md</w:t>
+            </w:r>
+            <w:r>
+              <w:rPr>
+                <w:sz w:val="18"/>
+                <w:szCs w:val="18"/>
+              </w:rPr>
+              <w:t xml:space="preserve">)</w:t>
+            </w:r>
+          </w:p>
+        </w:tc>
+        <w:tc>
+          <w:tcPr>
+            <w:tcW w:type="dxa" w:w="4152"/>
+            <w:tcBorders>
+              <w:top w:val="single" w:color="BFBFBF" w:sz="4"/>
+              <w:left w:val="single" w:color="BFBFBF" w:sz="4"/>
+              <w:bottom w:val="single" w:color="BFBFBF" w:sz="4"/>
+              <w:right w:val="single" w:color="BFBFBF" w:sz="4"/>
+            </w:tcBorders>
+            <w:tcMar>
+              <w:top w:type="dxa" w:w="50"/>
+              <w:left w:type="dxa" w:w="90"/>
+              <w:bottom w:type="dxa" w:w="50"/>
+              <w:right w:type="dxa" w:w="90"/>
+            </w:tcMar>
+          </w:tcPr>
+          <w:p>
+            <w:pPr>
+              <w:spacing w:after="0" w:before="0"/>
+            </w:pPr>
+            <w:r>
+              <w:rPr>
+                <w:rFonts w:ascii="Consolas" w:cs="Consolas" w:eastAsia="Consolas" w:hAnsi="Consolas"/>
+                <w:sz w:val="17"/>
+                <w:szCs w:val="17"/>
+                <w:shd w:fill="F0F0F0" w:color="auto" w:val="clear"/>
+              </w:rPr>
+              <w:t xml:space="preserve">integracion-​13-​escenarios.​txt</w:t>
+            </w:r>
+            <w:r>
+              <w:rPr>
+                <w:sz w:val="18"/>
+                <w:szCs w:val="18"/>
+              </w:rPr>
+              <w:t xml:space="preserve">, escenario 12, con el código entregado y repetible con </w:t>
+            </w:r>
+            <w:r>
+              <w:rPr>
+                <w:rFonts w:ascii="Consolas" w:cs="Consolas" w:eastAsia="Consolas" w:hAnsi="Consolas"/>
+                <w:sz w:val="17"/>
+                <w:szCs w:val="17"/>
+                <w:shd w:fill="F0F0F0" w:color="auto" w:val="clear"/>
+              </w:rPr>
+              <w:t xml:space="preserve">node scripts/​pruebas/​escenarios.​mjs 12</w:t>
+            </w:r>
+            <w:r>
+              <w:rPr>
+                <w:sz w:val="18"/>
+                <w:szCs w:val="18"/>
+              </w:rPr>
+              <w:t xml:space="preserve">: el consumidor de la cola devuelve un mensaje que no puede procesar 5 veces, el mensaje vuelve a la </w:t>
+            </w:r>
+            <w:r>
+              <w:rPr>
+                <w:rFonts w:ascii="Consolas" w:cs="Consolas" w:eastAsia="Consolas" w:hAnsi="Consolas"/>
+                <w:sz w:val="17"/>
+                <w:szCs w:val="17"/>
+                <w:shd w:fill="F0F0F0" w:color="auto" w:val="clear"/>
+              </w:rPr>
+              <w:t xml:space="preserve">DLQ</w:t>
+            </w:r>
+            <w:r>
+              <w:rPr>
+                <w:sz w:val="18"/>
+                <w:szCs w:val="18"/>
+              </w:rPr>
+              <w:t xml:space="preserve"> y las compras hechas mientras tanto se emiten igual. Como complemento, </w:t>
+            </w:r>
+            <w:r>
+              <w:rPr>
+                <w:rFonts w:ascii="Consolas" w:cs="Consolas" w:eastAsia="Consolas" w:hAnsi="Consolas"/>
+                <w:sz w:val="17"/>
+                <w:szCs w:val="17"/>
+                <w:shd w:fill="F0F0F0" w:color="auto" w:val="clear"/>
+              </w:rPr>
+              <w:t xml:space="preserve">mensaje-​repetido-​y-​reintentos.​txt</w:t>
+            </w:r>
+            <w:r>
+              <w:rPr>
+                <w:sz w:val="18"/>
+                <w:szCs w:val="18"/>
+              </w:rPr>
+              <w:t xml:space="preserve">, partes D y E, con una versión modificada del servicio que fuerza la falla después de emitir: no quedan entradas emitidas a medias, la venta queda </w:t>
+            </w:r>
+            <w:r>
+              <w:rPr>
+                <w:rFonts w:ascii="Consolas" w:cs="Consolas" w:eastAsia="Consolas" w:hAnsi="Consolas"/>
+                <w:sz w:val="17"/>
+                <w:szCs w:val="17"/>
+                <w:shd w:fill="F0F0F0" w:color="auto" w:val="clear"/>
+              </w:rPr>
+              <w:t xml:space="preserve">CONFIRMADA</w:t>
+            </w:r>
+            <w:r>
+              <w:rPr>
+                <w:sz w:val="18"/>
+                <w:szCs w:val="18"/>
+              </w:rPr>
+              <w:t xml:space="preserve"> y, devuelto el mensaje a la cola, se emite</w:t>
             </w:r>
           </w:p>
         </w:tc>
@@ -9053,7 +9434,7 @@
         </w:trPr>
         <w:tc>
           <w:tcPr>
-            <w:tcW w:type="dxa" w:w="2099"/>
+            <w:tcW w:type="dxa" w:w="1434"/>
             <w:tcBorders>
               <w:top w:val="single" w:color="BFBFBF" w:sz="4"/>
               <w:left w:val="single" w:color="BFBFBF" w:sz="4"/>
@@ -9091,7 +9472,7 @@
         </w:tc>
         <w:tc>
           <w:tcPr>
-            <w:tcW w:type="dxa" w:w="3676"/>
+            <w:tcW w:type="dxa" w:w="3826"/>
             <w:tcBorders>
               <w:top w:val="single" w:color="BFBFBF" w:sz="4"/>
               <w:left w:val="single" w:color="BFBFBF" w:sz="4"/>
@@ -9136,7 +9517,7 @@
         </w:tc>
         <w:tc>
           <w:tcPr>
-            <w:tcW w:type="dxa" w:w="3637"/>
+            <w:tcW w:type="dxa" w:w="4152"/>
             <w:tcBorders>
               <w:top w:val="single" w:color="BFBFBF" w:sz="4"/>
               <w:left w:val="single" w:color="BFBFBF" w:sz="4"/>
@@ -9170,7 +9551,7 @@
         </w:trPr>
         <w:tc>
           <w:tcPr>
-            <w:tcW w:type="dxa" w:w="2099"/>
+            <w:tcW w:type="dxa" w:w="1434"/>
             <w:tcBorders>
               <w:top w:val="single" w:color="BFBFBF" w:sz="4"/>
               <w:left w:val="single" w:color="BFBFBF" w:sz="4"/>
@@ -9199,7 +9580,7 @@
         </w:tc>
         <w:tc>
           <w:tcPr>
-            <w:tcW w:type="dxa" w:w="3676"/>
+            <w:tcW w:type="dxa" w:w="3826"/>
             <w:tcBorders>
               <w:top w:val="single" w:color="BFBFBF" w:sz="4"/>
               <w:left w:val="single" w:color="BFBFBF" w:sz="4"/>
@@ -9237,7 +9618,7 @@
         </w:tc>
         <w:tc>
           <w:tcPr>
-            <w:tcW w:type="dxa" w:w="3637"/>
+            <w:tcW w:type="dxa" w:w="4152"/>
             <w:tcBorders>
               <w:top w:val="single" w:color="BFBFBF" w:sz="4"/>
               <w:left w:val="single" w:color="BFBFBF" w:sz="4"/>
@@ -9273,113 +9654,177 @@
         </w:trPr>
         <w:tc>
           <w:tcPr>
-            <w:tcW w:type="dxa" w:w="2099"/>
-            <w:tcBorders>
-              <w:top w:val="single" w:color="BFBFBF" w:sz="4"/>
-              <w:left w:val="single" w:color="BFBFBF" w:sz="4"/>
-              <w:bottom w:val="single" w:color="BFBFBF" w:sz="4"/>
-              <w:right w:val="single" w:color="BFBFBF" w:sz="4"/>
-            </w:tcBorders>
-            <w:tcMar>
-              <w:top w:type="dxa" w:w="50"/>
-              <w:left w:type="dxa" w:w="90"/>
-              <w:bottom w:type="dxa" w:w="50"/>
-              <w:right w:type="dxa" w:w="90"/>
-            </w:tcMar>
-          </w:tcPr>
-          <w:p>
-            <w:pPr>
-              <w:spacing w:after="0" w:before="0"/>
-            </w:pPr>
-            <w:r>
-              <w:rPr>
-                <w:sz w:val="18"/>
-                <w:szCs w:val="18"/>
-              </w:rPr>
-              <w:t xml:space="preserve">Notificaciones está caído durante una compra</w:t>
-            </w:r>
-          </w:p>
-        </w:tc>
-        <w:tc>
-          <w:tcPr>
-            <w:tcW w:type="dxa" w:w="3676"/>
-            <w:tcBorders>
-              <w:top w:val="single" w:color="BFBFBF" w:sz="4"/>
-              <w:left w:val="single" w:color="BFBFBF" w:sz="4"/>
-              <w:bottom w:val="single" w:color="BFBFBF" w:sz="4"/>
-              <w:right w:val="single" w:color="BFBFBF" w:sz="4"/>
-            </w:tcBorders>
-            <w:tcMar>
-              <w:top w:type="dxa" w:w="50"/>
-              <w:left w:type="dxa" w:w="90"/>
-              <w:bottom w:type="dxa" w:w="50"/>
-              <w:right w:type="dxa" w:w="90"/>
-            </w:tcMar>
-          </w:tcPr>
-          <w:p>
-            <w:pPr>
-              <w:spacing w:after="0" w:before="0"/>
-            </w:pPr>
-            <w:r>
-              <w:rPr>
-                <w:sz w:val="18"/>
-                <w:szCs w:val="18"/>
-              </w:rPr>
-              <w:t xml:space="preserve">Lo esperado: la compra no se entera, auditoría recibe lo pendiente al volver y el aviso de ese rato se pierde</w:t>
-            </w:r>
-          </w:p>
-        </w:tc>
-        <w:tc>
-          <w:tcPr>
-            <w:tcW w:type="dxa" w:w="3637"/>
-            <w:tcBorders>
-              <w:top w:val="single" w:color="BFBFBF" w:sz="4"/>
-              <w:left w:val="single" w:color="BFBFBF" w:sz="4"/>
-              <w:bottom w:val="single" w:color="BFBFBF" w:sz="4"/>
-              <w:right w:val="single" w:color="BFBFBF" w:sz="4"/>
-            </w:tcBorders>
-            <w:tcMar>
-              <w:top w:type="dxa" w:w="50"/>
-              <w:left w:type="dxa" w:w="90"/>
-              <w:bottom w:type="dxa" w:w="50"/>
-              <w:right w:type="dxa" w:w="90"/>
-            </w:tcMar>
-          </w:tcPr>
-          <w:p>
-            <w:pPr>
-              <w:spacing w:after="0" w:before="0"/>
-            </w:pPr>
-            <w:r>
-              <w:rPr>
-                <w:b/>
-                <w:bCs/>
-                <w:sz w:val="18"/>
-                <w:szCs w:val="18"/>
-              </w:rPr>
-              <w:t xml:space="preserve">Configurado y no probado para este documento.</w:t>
-            </w:r>
-            <w:r>
-              <w:rPr>
-                <w:sz w:val="18"/>
-                <w:szCs w:val="18"/>
-              </w:rPr>
-              <w:t xml:space="preserve"> La suscripción durable está en el broker (</w:t>
-            </w:r>
-            <w:r>
-              <w:rPr>
-                <w:rFonts w:ascii="Consolas" w:cs="Consolas" w:eastAsia="Consolas" w:hAnsi="Consolas"/>
-                <w:sz w:val="17"/>
-                <w:szCs w:val="17"/>
-                <w:shd w:fill="F0F0F0" w:color="auto" w:val="clear"/>
-              </w:rPr>
-              <w:t xml:space="preserve">reproduccion.​txt</w:t>
-            </w:r>
-            <w:r>
-              <w:rPr>
-                <w:sz w:val="18"/>
-                <w:szCs w:val="18"/>
-              </w:rPr>
-              <w:t xml:space="preserve">, paso 0), pero no hay salida guardada de una prueba con el suscriptor detenido</w:t>
+            <w:tcW w:type="dxa" w:w="1434"/>
+            <w:tcBorders>
+              <w:top w:val="single" w:color="BFBFBF" w:sz="4"/>
+              <w:left w:val="single" w:color="BFBFBF" w:sz="4"/>
+              <w:bottom w:val="single" w:color="BFBFBF" w:sz="4"/>
+              <w:right w:val="single" w:color="BFBFBF" w:sz="4"/>
+            </w:tcBorders>
+            <w:tcMar>
+              <w:top w:type="dxa" w:w="50"/>
+              <w:left w:type="dxa" w:w="90"/>
+              <w:bottom w:type="dxa" w:w="50"/>
+              <w:right w:type="dxa" w:w="90"/>
+            </w:tcMar>
+          </w:tcPr>
+          <w:p>
+            <w:pPr>
+              <w:spacing w:after="0" w:before="0"/>
+            </w:pPr>
+            <w:r>
+              <w:rPr>
+                <w:sz w:val="18"/>
+                <w:szCs w:val="18"/>
+              </w:rPr>
+              <w:t xml:space="preserve">El suscriptor durable (auditoría) está detenido durante una compra</w:t>
+            </w:r>
+          </w:p>
+        </w:tc>
+        <w:tc>
+          <w:tcPr>
+            <w:tcW w:type="dxa" w:w="3826"/>
+            <w:tcBorders>
+              <w:top w:val="single" w:color="BFBFBF" w:sz="4"/>
+              <w:left w:val="single" w:color="BFBFBF" w:sz="4"/>
+              <w:bottom w:val="single" w:color="BFBFBF" w:sz="4"/>
+              <w:right w:val="single" w:color="BFBFBF" w:sz="4"/>
+            </w:tcBorders>
+            <w:tcMar>
+              <w:top w:type="dxa" w:w="50"/>
+              <w:left w:type="dxa" w:w="90"/>
+              <w:bottom w:type="dxa" w:w="50"/>
+              <w:right w:type="dxa" w:w="90"/>
+            </w:tcMar>
+          </w:tcPr>
+          <w:p>
+            <w:pPr>
+              <w:spacing w:after="0" w:before="0"/>
+            </w:pPr>
+            <w:r>
+              <w:rPr>
+                <w:sz w:val="18"/>
+                <w:szCs w:val="18"/>
+              </w:rPr>
+              <w:t xml:space="preserve">La compra no se entera y el broker le guarda los mensajes a auditoría hasta que vuelve. El aviso, que no es durable, sigue recibiendo su copia; si el que estuviera caído fuera el aviso, ese aviso se perdería</w:t>
+            </w:r>
+          </w:p>
+        </w:tc>
+        <w:tc>
+          <w:tcPr>
+            <w:tcW w:type="dxa" w:w="4152"/>
+            <w:tcBorders>
+              <w:top w:val="single" w:color="BFBFBF" w:sz="4"/>
+              <w:left w:val="single" w:color="BFBFBF" w:sz="4"/>
+              <w:bottom w:val="single" w:color="BFBFBF" w:sz="4"/>
+              <w:right w:val="single" w:color="BFBFBF" w:sz="4"/>
+            </w:tcBorders>
+            <w:tcMar>
+              <w:top w:type="dxa" w:w="50"/>
+              <w:left w:type="dxa" w:w="90"/>
+              <w:bottom w:type="dxa" w:w="50"/>
+              <w:right w:type="dxa" w:w="90"/>
+            </w:tcMar>
+          </w:tcPr>
+          <w:p>
+            <w:pPr>
+              <w:spacing w:after="0" w:before="0"/>
+            </w:pPr>
+            <w:r>
+              <w:rPr>
+                <w:rFonts w:ascii="Consolas" w:cs="Consolas" w:eastAsia="Consolas" w:hAnsi="Consolas"/>
+                <w:sz w:val="17"/>
+                <w:szCs w:val="17"/>
+                <w:shd w:fill="F0F0F0" w:color="auto" w:val="clear"/>
+              </w:rPr>
+              <w:t xml:space="preserve">suscriptor-​durable.​txt</w:t>
+            </w:r>
+            <w:r>
+              <w:rPr>
+                <w:sz w:val="18"/>
+                <w:szCs w:val="18"/>
+              </w:rPr>
+              <w:t xml:space="preserve">. Con </w:t>
+            </w:r>
+            <w:r>
+              <w:rPr>
+                <w:rFonts w:ascii="Consolas" w:cs="Consolas" w:eastAsia="Consolas" w:hAnsi="Consolas"/>
+                <w:sz w:val="17"/>
+                <w:szCs w:val="17"/>
+                <w:shd w:fill="F0F0F0" w:color="auto" w:val="clear"/>
+              </w:rPr>
+              <w:t xml:space="preserve">AuditoriaDeComprasMDB</w:t>
+            </w:r>
+            <w:r>
+              <w:rPr>
+                <w:sz w:val="18"/>
+                <w:szCs w:val="18"/>
+              </w:rPr>
+              <w:t xml:space="preserve"> detenido (</w:t>
+            </w:r>
+            <w:r>
+              <w:rPr>
+                <w:rFonts w:ascii="Consolas" w:cs="Consolas" w:eastAsia="Consolas" w:hAnsi="Consolas"/>
+                <w:sz w:val="17"/>
+                <w:szCs w:val="17"/>
+                <w:shd w:fill="F0F0F0" w:color="auto" w:val="clear"/>
+              </w:rPr>
+              <w:t xml:space="preserve">stop-​delivery</w:t>
+            </w:r>
+            <w:r>
+              <w:rPr>
+                <w:sz w:val="18"/>
+                <w:szCs w:val="18"/>
+              </w:rPr>
+              <w:t xml:space="preserve">) se publicaron una compra real (</w:t>
+            </w:r>
+            <w:r>
+              <w:rPr>
+                <w:rFonts w:ascii="Consolas" w:cs="Consolas" w:eastAsia="Consolas" w:hAnsi="Consolas"/>
+                <w:sz w:val="17"/>
+                <w:szCs w:val="17"/>
+                <w:shd w:fill="F0F0F0" w:color="auto" w:val="clear"/>
+              </w:rPr>
+              <w:t xml:space="preserve">V-​95a3a988</w:t>
+            </w:r>
+            <w:r>
+              <w:rPr>
+                <w:sz w:val="18"/>
+                <w:szCs w:val="18"/>
+              </w:rPr>
+              <w:t xml:space="preserve">) y un mensaje de prueba: la suscripción durable guardó 2 mensajes pendientes y no hubo filas de auditoría, mientras el aviso recibió sus dos copias y las escribió en el log del servidor (la línea dice "aviso enviado", pero no se envía nada) y la venta quedó </w:t>
+            </w:r>
+            <w:r>
+              <w:rPr>
+                <w:rFonts w:ascii="Consolas" w:cs="Consolas" w:eastAsia="Consolas" w:hAnsi="Consolas"/>
+                <w:sz w:val="17"/>
+                <w:szCs w:val="17"/>
+                <w:shd w:fill="F0F0F0" w:color="auto" w:val="clear"/>
+              </w:rPr>
+              <w:t xml:space="preserve">EMITIDA</w:t>
+            </w:r>
+            <w:r>
+              <w:rPr>
+                <w:sz w:val="18"/>
+                <w:szCs w:val="18"/>
+              </w:rPr>
+              <w:t xml:space="preserve">. Al reanudarlo (</w:t>
+            </w:r>
+            <w:r>
+              <w:rPr>
+                <w:rFonts w:ascii="Consolas" w:cs="Consolas" w:eastAsia="Consolas" w:hAnsi="Consolas"/>
+                <w:sz w:val="17"/>
+                <w:szCs w:val="17"/>
+                <w:shd w:fill="F0F0F0" w:color="auto" w:val="clear"/>
+              </w:rPr>
+              <w:t xml:space="preserve">start-​delivery</w:t>
+            </w:r>
+            <w:r>
+              <w:rPr>
+                <w:sz w:val="18"/>
+                <w:szCs w:val="18"/>
+              </w:rPr>
+              <w:t xml:space="preserve">) aparecieron las 2 filas y no quedó nada pendiente. Se detuvo ese MDB, no el WAR entero de Notificaciones; la pérdida del aviso no se probó</w:t>
             </w:r>
           </w:p>
         </w:tc>
@@ -9390,7 +9835,7 @@
         </w:trPr>
         <w:tc>
           <w:tcPr>
-            <w:tcW w:type="dxa" w:w="2099"/>
+            <w:tcW w:type="dxa" w:w="1434"/>
             <w:tcBorders>
               <w:top w:val="single" w:color="BFBFBF" w:sz="4"/>
               <w:left w:val="single" w:color="BFBFBF" w:sz="4"/>
@@ -9419,7 +9864,7 @@
         </w:tc>
         <w:tc>
           <w:tcPr>
-            <w:tcW w:type="dxa" w:w="3676"/>
+            <w:tcW w:type="dxa" w:w="3826"/>
             <w:tcBorders>
               <w:top w:val="single" w:color="BFBFBF" w:sz="4"/>
               <w:left w:val="single" w:color="BFBFBF" w:sz="4"/>
@@ -9480,7 +9925,7 @@
         </w:tc>
         <w:tc>
           <w:tcPr>
-            <w:tcW w:type="dxa" w:w="3637"/>
+            <w:tcW w:type="dxa" w:w="4152"/>
             <w:tcBorders>
               <w:top w:val="single" w:color="BFBFBF" w:sz="4"/>
               <w:left w:val="single" w:color="BFBFBF" w:sz="4"/>
@@ -9540,7 +9985,7 @@
         <w:t xml:space="preserve">mensaje-repetido-y-reintentos.txt</w:t>
       </w:r>
       <w:r>
-        <w:t xml:space="preserve"> no se pueden repetir solo con el repositorio: se corrieron con una copia temporal del servicio que permite reenviar un mensaje y forzar una falla. El archivo lo explica y muestra que después se restauró el servicio original.</w:t>
+        <w:t xml:space="preserve"> complementan los escenarios 8 y 12 y no se pueden repetir solo con el repositorio: se corrieron con una copia temporal del servicio que permite reenviar un mensaje y forzar una falla. El archivo lo explica y muestra que después se restauró el servicio original.</w:t>
       </w:r>
     </w:p>
     <w:p>
@@ -9548,7 +9993,7 @@
         <w:spacing w:after="120" w:before="0"/>
       </w:pPr>
       <w:r>
-        <w:t xml:space="preserve">La transacción cubre el tercer paso de la compra. Los dos anteriores se protegen de otra forma: la reserva de cupo es una llamada REST que Ventas compensa devolviendo el cupo si algo falla después, y el cobro, que es otra llamada REST, se protege con la clave de idempotencia, que Ventas le pasa a Pagos. Entre Ventas y Pagos no hay transacción compartida: el pago queda guardado en Pagos aunque después falle la confirmación en Ventas, y ese caso no lo probamos. La tabla completa de fallas del flujo es parte de la entrega del 13/11.</w:t>
+        <w:t xml:space="preserve">La transacción cubre el tercer paso de la compra. Los dos anteriores se protegen de otra forma: la reserva de cupo es una llamada REST que Ventas compensa devolviendo el cupo si algo falla después, y el cobro, que es otra llamada REST, se protege con la clave de idempotencia, que Ventas le pasa a Pagos. Entre Ventas y Pagos no hay transacción compartida: el pago queda guardado en Pagos aunque después falle la confirmación en Ventas, y ese caso no lo probamos. Las dos protecciones tienen un límite conocido, que describimos en la sección 6.2: un cobro sin resultado cuya compra ya no tiene instancia queda retenido con su cupo, y una devolución de cupo que Eventos no contesta no se reintenta. La tabla completa de fallas del flujo es parte de la entrega del 13/11.</w:t>
       </w:r>
     </w:p>
     <w:p>
@@ -9627,7 +10072,7 @@
         <w:t xml:space="preserve">node</w:t>
       </w:r>
       <w:r>
-        <w:t xml:space="preserve"> y un JDK. No detiene servicios ni vacía colas. Su salida del 13/10 a las 14:04 está en </w:t>
+        <w:t xml:space="preserve"> y un JDK. No detiene servicios ni vacía colas. Su salida del 13/10 a las 15:46 está en </w:t>
       </w:r>
       <w:r>
         <w:rPr>
@@ -9647,7 +10092,7 @@
         <w:spacing w:after="120" w:before="0"/>
       </w:pPr>
       <w:r>
-        <w:t xml:space="preserve">Los contadores del broker son acumulados e incluyen pruebas anteriores: lo que se compara es la diferencia entre antes y después. Los 5 mensajes que figuran en la </w:t>
+        <w:t xml:space="preserve">Los contadores del broker son acumulados desde que arrancó el servidor e incluyen las compras anteriores: lo que se compara es la diferencia entre antes y después. En esa corrida la </w:t>
       </w:r>
       <w:r>
         <w:rPr>
@@ -9659,7 +10104,7 @@
         <w:t xml:space="preserve">DLQ</w:t>
       </w:r>
       <w:r>
-        <w:t xml:space="preserve"> son restos de pruebas de mensajes inválidos; su origen es la suscripción de auditoría.</w:t>
+        <w:t xml:space="preserve"> está en 0, porque el servidor estaba recién armado.</w:t>
       </w:r>
     </w:p>
     <w:p>
@@ -9718,9 +10163,9 @@
         <w:tblLayout w:type="fixed"/>
       </w:tblPr>
       <w:tblGrid>
-        <w:gridCol w:w="3246"/>
-        <w:gridCol w:w="3769"/>
-        <w:gridCol w:w="2397"/>
+        <w:gridCol w:w="2548"/>
+        <w:gridCol w:w="3659"/>
+        <w:gridCol w:w="3205"/>
       </w:tblGrid>
       <w:tr>
         <w:trPr>
@@ -9729,7 +10174,7 @@
         </w:trPr>
         <w:tc>
           <w:tcPr>
-            <w:tcW w:type="dxa" w:w="3246"/>
+            <w:tcW w:type="dxa" w:w="2548"/>
             <w:tcBorders>
               <w:top w:val="single" w:color="BFBFBF" w:sz="4"/>
               <w:left w:val="single" w:color="BFBFBF" w:sz="4"/>
@@ -9761,7 +10206,7 @@
         </w:tc>
         <w:tc>
           <w:tcPr>
-            <w:tcW w:type="dxa" w:w="3769"/>
+            <w:tcW w:type="dxa" w:w="3659"/>
             <w:tcBorders>
               <w:top w:val="single" w:color="BFBFBF" w:sz="4"/>
               <w:left w:val="single" w:color="BFBFBF" w:sz="4"/>
@@ -9793,7 +10238,7 @@
         </w:tc>
         <w:tc>
           <w:tcPr>
-            <w:tcW w:type="dxa" w:w="2397"/>
+            <w:tcW w:type="dxa" w:w="3205"/>
             <w:tcBorders>
               <w:top w:val="single" w:color="BFBFBF" w:sz="4"/>
               <w:left w:val="single" w:color="BFBFBF" w:sz="4"/>
@@ -9830,7 +10275,7 @@
         </w:trPr>
         <w:tc>
           <w:tcPr>
-            <w:tcW w:type="dxa" w:w="3246"/>
+            <w:tcW w:type="dxa" w:w="2548"/>
             <w:tcBorders>
               <w:top w:val="single" w:color="BFBFBF" w:sz="4"/>
               <w:left w:val="single" w:color="BFBFBF" w:sz="4"/>
@@ -9877,7 +10322,7 @@
         </w:tc>
         <w:tc>
           <w:tcPr>
-            <w:tcW w:type="dxa" w:w="3769"/>
+            <w:tcW w:type="dxa" w:w="3659"/>
             <w:tcBorders>
               <w:top w:val="single" w:color="BFBFBF" w:sz="4"/>
               <w:left w:val="single" w:color="BFBFBF" w:sz="4"/>
@@ -9906,7 +10351,7 @@
         </w:tc>
         <w:tc>
           <w:tcPr>
-            <w:tcW w:type="dxa" w:w="2397"/>
+            <w:tcW w:type="dxa" w:w="3205"/>
             <w:tcBorders>
               <w:top w:val="single" w:color="BFBFBF" w:sz="4"/>
               <w:left w:val="single" w:color="BFBFBF" w:sz="4"/>
@@ -9940,7 +10385,7 @@
         </w:trPr>
         <w:tc>
           <w:tcPr>
-            <w:tcW w:type="dxa" w:w="3246"/>
+            <w:tcW w:type="dxa" w:w="2548"/>
             <w:tcBorders>
               <w:top w:val="single" w:color="BFBFBF" w:sz="4"/>
               <w:left w:val="single" w:color="BFBFBF" w:sz="4"/>
@@ -10067,45 +10512,61 @@
         </w:tc>
         <w:tc>
           <w:tcPr>
-            <w:tcW w:type="dxa" w:w="3769"/>
-            <w:tcBorders>
-              <w:top w:val="single" w:color="BFBFBF" w:sz="4"/>
-              <w:left w:val="single" w:color="BFBFBF" w:sz="4"/>
-              <w:bottom w:val="single" w:color="BFBFBF" w:sz="4"/>
-              <w:right w:val="single" w:color="BFBFBF" w:sz="4"/>
-            </w:tcBorders>
-            <w:tcMar>
-              <w:top w:type="dxa" w:w="50"/>
-              <w:left w:type="dxa" w:w="90"/>
-              <w:bottom w:type="dxa" w:w="50"/>
-              <w:right w:type="dxa" w:w="90"/>
-            </w:tcMar>
-          </w:tcPr>
-          <w:p>
-            <w:pPr>
-              <w:spacing w:after="0" w:before="0"/>
-            </w:pPr>
-            <w:r>
-              <w:rPr>
-                <w:sz w:val="18"/>
-                <w:szCs w:val="18"/>
-              </w:rPr>
-              <w:t xml:space="preserve">La primera toma del proceso, paso por paso, cuando Ventas cobraba con </w:t>
-            </w:r>
-            <w:r>
-              <w:rPr>
-                <w:rFonts w:ascii="Consolas" w:cs="Consolas" w:eastAsia="Consolas" w:hAnsi="Consolas"/>
-                <w:sz w:val="17"/>
-                <w:szCs w:val="17"/>
-                <w:shd w:fill="F0F0F0" w:color="auto" w:val="clear"/>
-              </w:rPr>
-              <w:t xml:space="preserve">CobrosFake</w:t>
-            </w:r>
-          </w:p>
-        </w:tc>
-        <w:tc>
-          <w:tcPr>
-            <w:tcW w:type="dxa" w:w="2397"/>
+            <w:tcW w:type="dxa" w:w="3659"/>
+            <w:tcBorders>
+              <w:top w:val="single" w:color="BFBFBF" w:sz="4"/>
+              <w:left w:val="single" w:color="BFBFBF" w:sz="4"/>
+              <w:bottom w:val="single" w:color="BFBFBF" w:sz="4"/>
+              <w:right w:val="single" w:color="BFBFBF" w:sz="4"/>
+            </w:tcBorders>
+            <w:tcMar>
+              <w:top w:type="dxa" w:w="50"/>
+              <w:left w:type="dxa" w:w="90"/>
+              <w:bottom w:type="dxa" w:w="50"/>
+              <w:right w:type="dxa" w:w="90"/>
+            </w:tcMar>
+          </w:tcPr>
+          <w:p>
+            <w:pPr>
+              <w:spacing w:after="0" w:before="0"/>
+            </w:pPr>
+            <w:r>
+              <w:rPr>
+                <w:sz w:val="18"/>
+                <w:szCs w:val="18"/>
+              </w:rPr>
+              <w:t xml:space="preserve">La primera compra del servidor recién reiniciado, paso por paso, con el cobro en </w:t>
+            </w:r>
+            <w:r>
+              <w:rPr>
+                <w:rFonts w:ascii="Consolas" w:cs="Consolas" w:eastAsia="Consolas" w:hAnsi="Consolas"/>
+                <w:sz w:val="17"/>
+                <w:szCs w:val="17"/>
+                <w:shd w:fill="F0F0F0" w:color="auto" w:val="clear"/>
+              </w:rPr>
+              <w:t xml:space="preserve">ServicioDePagos</w:t>
+            </w:r>
+            <w:r>
+              <w:rPr>
+                <w:sz w:val="18"/>
+                <w:szCs w:val="18"/>
+              </w:rPr>
+              <w:t xml:space="preserve">. Se repite con </w:t>
+            </w:r>
+            <w:r>
+              <w:rPr>
+                <w:rFonts w:ascii="Consolas" w:cs="Consolas" w:eastAsia="Consolas" w:hAnsi="Consolas"/>
+                <w:sz w:val="17"/>
+                <w:szCs w:val="17"/>
+                <w:shd w:fill="F0F0F0" w:color="auto" w:val="clear"/>
+              </w:rPr>
+              <w:t xml:space="preserve">tomar-​evidencia.​sh</w:t>
+            </w:r>
+          </w:p>
+        </w:tc>
+        <w:tc>
+          <w:tcPr>
+            <w:tcW w:type="dxa" w:w="3205"/>
             <w:tcBorders>
               <w:top w:val="single" w:color="BFBFBF" w:sz="4"/>
               <w:left w:val="single" w:color="BFBFBF" w:sz="4"/>
@@ -10139,90 +10600,106 @@
         </w:trPr>
         <w:tc>
           <w:tcPr>
-            <w:tcW w:type="dxa" w:w="3246"/>
-            <w:tcBorders>
-              <w:top w:val="single" w:color="BFBFBF" w:sz="4"/>
-              <w:left w:val="single" w:color="BFBFBF" w:sz="4"/>
-              <w:bottom w:val="single" w:color="BFBFBF" w:sz="4"/>
-              <w:right w:val="single" w:color="BFBFBF" w:sz="4"/>
-            </w:tcBorders>
-            <w:tcMar>
-              <w:top w:type="dxa" w:w="50"/>
-              <w:left w:type="dxa" w:w="90"/>
-              <w:bottom w:type="dxa" w:w="50"/>
-              <w:right w:type="dxa" w:w="90"/>
-            </w:tcMar>
-          </w:tcPr>
-          <w:p>
-            <w:pPr>
-              <w:spacing w:after="0" w:before="0"/>
-            </w:pPr>
-            <w:r>
-              <w:rPr>
-                <w:rFonts w:ascii="Consolas" w:cs="Consolas" w:eastAsia="Consolas" w:hAnsi="Consolas"/>
-                <w:sz w:val="17"/>
-                <w:szCs w:val="17"/>
-                <w:shd w:fill="F0F0F0" w:color="auto" w:val="clear"/>
-              </w:rPr>
-              <w:t xml:space="preserve">venta-​inexistente.​txt</w:t>
-            </w:r>
-          </w:p>
-        </w:tc>
-        <w:tc>
-          <w:tcPr>
-            <w:tcW w:type="dxa" w:w="3769"/>
-            <w:tcBorders>
-              <w:top w:val="single" w:color="BFBFBF" w:sz="4"/>
-              <w:left w:val="single" w:color="BFBFBF" w:sz="4"/>
-              <w:bottom w:val="single" w:color="BFBFBF" w:sz="4"/>
-              <w:right w:val="single" w:color="BFBFBF" w:sz="4"/>
-            </w:tcBorders>
-            <w:tcMar>
-              <w:top w:type="dxa" w:w="50"/>
-              <w:left w:type="dxa" w:w="90"/>
-              <w:bottom w:type="dxa" w:w="50"/>
-              <w:right w:type="dxa" w:w="90"/>
-            </w:tcMar>
-          </w:tcPr>
-          <w:p>
-            <w:pPr>
-              <w:spacing w:after="0" w:before="0"/>
-            </w:pPr>
-            <w:r>
-              <w:rPr>
-                <w:sz w:val="18"/>
-                <w:szCs w:val="18"/>
-              </w:rPr>
-              <w:t xml:space="preserve">Qué hace el consumidor con un mensaje de una venta que no existe</w:t>
-            </w:r>
-          </w:p>
-        </w:tc>
-        <w:tc>
-          <w:tcPr>
-            <w:tcW w:type="dxa" w:w="2397"/>
-            <w:tcBorders>
-              <w:top w:val="single" w:color="BFBFBF" w:sz="4"/>
-              <w:left w:val="single" w:color="BFBFBF" w:sz="4"/>
-              <w:bottom w:val="single" w:color="BFBFBF" w:sz="4"/>
-              <w:right w:val="single" w:color="BFBFBF" w:sz="4"/>
-            </w:tcBorders>
-            <w:tcMar>
-              <w:top w:type="dxa" w:w="50"/>
-              <w:left w:type="dxa" w:w="90"/>
-              <w:bottom w:type="dxa" w:w="50"/>
-              <w:right w:type="dxa" w:w="90"/>
-            </w:tcMar>
-          </w:tcPr>
-          <w:p>
-            <w:pPr>
-              <w:spacing w:after="0" w:before="0"/>
-            </w:pPr>
-            <w:r>
-              <w:rPr>
-                <w:sz w:val="18"/>
-                <w:szCs w:val="18"/>
-              </w:rPr>
-              <w:t xml:space="preserve">Fecha, comando exacto y salida</w:t>
+            <w:tcW w:type="dxa" w:w="2548"/>
+            <w:tcBorders>
+              <w:top w:val="single" w:color="BFBFBF" w:sz="4"/>
+              <w:left w:val="single" w:color="BFBFBF" w:sz="4"/>
+              <w:bottom w:val="single" w:color="BFBFBF" w:sz="4"/>
+              <w:right w:val="single" w:color="BFBFBF" w:sz="4"/>
+            </w:tcBorders>
+            <w:tcMar>
+              <w:top w:type="dxa" w:w="50"/>
+              <w:left w:type="dxa" w:w="90"/>
+              <w:bottom w:type="dxa" w:w="50"/>
+              <w:right w:type="dxa" w:w="90"/>
+            </w:tcMar>
+          </w:tcPr>
+          <w:p>
+            <w:pPr>
+              <w:spacing w:after="0" w:before="0"/>
+            </w:pPr>
+            <w:r>
+              <w:rPr>
+                <w:rFonts w:ascii="Consolas" w:cs="Consolas" w:eastAsia="Consolas" w:hAnsi="Consolas"/>
+                <w:sz w:val="17"/>
+                <w:szCs w:val="17"/>
+                <w:shd w:fill="F0F0F0" w:color="auto" w:val="clear"/>
+              </w:rPr>
+              <w:t xml:space="preserve">suscriptor-​durable.​sh</w:t>
+            </w:r>
+            <w:r>
+              <w:rPr>
+                <w:sz w:val="18"/>
+                <w:szCs w:val="18"/>
+              </w:rPr>
+              <w:t xml:space="preserve"> y </w:t>
+            </w:r>
+            <w:r>
+              <w:rPr>
+                <w:rFonts w:ascii="Consolas" w:cs="Consolas" w:eastAsia="Consolas" w:hAnsi="Consolas"/>
+                <w:sz w:val="17"/>
+                <w:szCs w:val="17"/>
+                <w:shd w:fill="F0F0F0" w:color="auto" w:val="clear"/>
+              </w:rPr>
+              <w:t xml:space="preserve">suscriptor-​durable.​txt</w:t>
+            </w:r>
+          </w:p>
+        </w:tc>
+        <w:tc>
+          <w:tcPr>
+            <w:tcW w:type="dxa" w:w="3659"/>
+            <w:tcBorders>
+              <w:top w:val="single" w:color="BFBFBF" w:sz="4"/>
+              <w:left w:val="single" w:color="BFBFBF" w:sz="4"/>
+              <w:bottom w:val="single" w:color="BFBFBF" w:sz="4"/>
+              <w:right w:val="single" w:color="BFBFBF" w:sz="4"/>
+            </w:tcBorders>
+            <w:tcMar>
+              <w:top w:type="dxa" w:w="50"/>
+              <w:left w:type="dxa" w:w="90"/>
+              <w:bottom w:type="dxa" w:w="50"/>
+              <w:right w:type="dxa" w:w="90"/>
+            </w:tcMar>
+          </w:tcPr>
+          <w:p>
+            <w:pPr>
+              <w:spacing w:after="0" w:before="0"/>
+            </w:pPr>
+            <w:r>
+              <w:rPr>
+                <w:sz w:val="18"/>
+                <w:szCs w:val="18"/>
+              </w:rPr>
+              <w:t xml:space="preserve">Con el suscriptor durable de auditoría detenido el broker guarda los mensajes y se los entrega al reanudarlo</w:t>
+            </w:r>
+          </w:p>
+        </w:tc>
+        <w:tc>
+          <w:tcPr>
+            <w:tcW w:type="dxa" w:w="3205"/>
+            <w:tcBorders>
+              <w:top w:val="single" w:color="BFBFBF" w:sz="4"/>
+              <w:left w:val="single" w:color="BFBFBF" w:sz="4"/>
+              <w:bottom w:val="single" w:color="BFBFBF" w:sz="4"/>
+              <w:right w:val="single" w:color="BFBFBF" w:sz="4"/>
+            </w:tcBorders>
+            <w:tcMar>
+              <w:top w:type="dxa" w:w="50"/>
+              <w:left w:type="dxa" w:w="90"/>
+              <w:bottom w:type="dxa" w:w="50"/>
+              <w:right w:type="dxa" w:w="90"/>
+            </w:tcMar>
+          </w:tcPr>
+          <w:p>
+            <w:pPr>
+              <w:spacing w:after="0" w:before="0"/>
+            </w:pPr>
+            <w:r>
+              <w:rPr>
+                <w:sz w:val="18"/>
+                <w:szCs w:val="18"/>
+              </w:rPr>
+              <w:t xml:space="preserve">El guion y su salida completa, con la fecha de cada paso</w:t>
             </w:r>
           </w:p>
         </w:tc>
@@ -10233,90 +10710,106 @@
         </w:trPr>
         <w:tc>
           <w:tcPr>
-            <w:tcW w:type="dxa" w:w="3246"/>
-            <w:tcBorders>
-              <w:top w:val="single" w:color="BFBFBF" w:sz="4"/>
-              <w:left w:val="single" w:color="BFBFBF" w:sz="4"/>
-              <w:bottom w:val="single" w:color="BFBFBF" w:sz="4"/>
-              <w:right w:val="single" w:color="BFBFBF" w:sz="4"/>
-            </w:tcBorders>
-            <w:tcMar>
-              <w:top w:type="dxa" w:w="50"/>
-              <w:left w:type="dxa" w:w="90"/>
-              <w:bottom w:type="dxa" w:w="50"/>
-              <w:right w:type="dxa" w:w="90"/>
-            </w:tcMar>
-          </w:tcPr>
-          <w:p>
-            <w:pPr>
-              <w:spacing w:after="0" w:before="0"/>
-            </w:pPr>
-            <w:r>
-              <w:rPr>
-                <w:rFonts w:ascii="Consolas" w:cs="Consolas" w:eastAsia="Consolas" w:hAnsi="Consolas"/>
-                <w:sz w:val="17"/>
-                <w:szCs w:val="17"/>
-                <w:shd w:fill="F0F0F0" w:color="auto" w:val="clear"/>
-              </w:rPr>
-              <w:t xml:space="preserve">mensajes-​pendientes.​txt</w:t>
-            </w:r>
-          </w:p>
-        </w:tc>
-        <w:tc>
-          <w:tcPr>
-            <w:tcW w:type="dxa" w:w="3769"/>
-            <w:tcBorders>
-              <w:top w:val="single" w:color="BFBFBF" w:sz="4"/>
-              <w:left w:val="single" w:color="BFBFBF" w:sz="4"/>
-              <w:bottom w:val="single" w:color="BFBFBF" w:sz="4"/>
-              <w:right w:val="single" w:color="BFBFBF" w:sz="4"/>
-            </w:tcBorders>
-            <w:tcMar>
-              <w:top w:type="dxa" w:w="50"/>
-              <w:left w:type="dxa" w:w="90"/>
-              <w:bottom w:type="dxa" w:w="50"/>
-              <w:right w:type="dxa" w:w="90"/>
-            </w:tcMar>
-          </w:tcPr>
-          <w:p>
-            <w:pPr>
-              <w:spacing w:after="0" w:before="0"/>
-            </w:pPr>
-            <w:r>
-              <w:rPr>
-                <w:sz w:val="18"/>
-                <w:szCs w:val="18"/>
-              </w:rPr>
-              <w:t xml:space="preserve">Los mensajes esperan en la cola mientras no hay consumidor</w:t>
-            </w:r>
-          </w:p>
-        </w:tc>
-        <w:tc>
-          <w:tcPr>
-            <w:tcW w:type="dxa" w:w="2397"/>
-            <w:tcBorders>
-              <w:top w:val="single" w:color="BFBFBF" w:sz="4"/>
-              <w:left w:val="single" w:color="BFBFBF" w:sz="4"/>
-              <w:bottom w:val="single" w:color="BFBFBF" w:sz="4"/>
-              <w:right w:val="single" w:color="BFBFBF" w:sz="4"/>
-            </w:tcBorders>
-            <w:tcMar>
-              <w:top w:type="dxa" w:w="50"/>
-              <w:left w:type="dxa" w:w="90"/>
-              <w:bottom w:type="dxa" w:w="50"/>
-              <w:right w:type="dxa" w:w="90"/>
-            </w:tcMar>
-          </w:tcPr>
-          <w:p>
-            <w:pPr>
-              <w:spacing w:after="0" w:before="0"/>
-            </w:pPr>
-            <w:r>
-              <w:rPr>
-                <w:sz w:val="18"/>
-                <w:szCs w:val="18"/>
-              </w:rPr>
-              <w:t xml:space="preserve">Fecha, comando y salida; la del paso 3 está resumida</w:t>
+            <w:tcW w:type="dxa" w:w="2548"/>
+            <w:tcBorders>
+              <w:top w:val="single" w:color="BFBFBF" w:sz="4"/>
+              <w:left w:val="single" w:color="BFBFBF" w:sz="4"/>
+              <w:bottom w:val="single" w:color="BFBFBF" w:sz="4"/>
+              <w:right w:val="single" w:color="BFBFBF" w:sz="4"/>
+            </w:tcBorders>
+            <w:tcMar>
+              <w:top w:type="dxa" w:w="50"/>
+              <w:left w:type="dxa" w:w="90"/>
+              <w:bottom w:type="dxa" w:w="50"/>
+              <w:right w:type="dxa" w:w="90"/>
+            </w:tcMar>
+          </w:tcPr>
+          <w:p>
+            <w:pPr>
+              <w:spacing w:after="0" w:before="0"/>
+            </w:pPr>
+            <w:r>
+              <w:rPr>
+                <w:rFonts w:ascii="Consolas" w:cs="Consolas" w:eastAsia="Consolas" w:hAnsi="Consolas"/>
+                <w:sz w:val="17"/>
+                <w:szCs w:val="17"/>
+                <w:shd w:fill="F0F0F0" w:color="auto" w:val="clear"/>
+              </w:rPr>
+              <w:t xml:space="preserve">integracion-​13-​escenarios.​txt</w:t>
+            </w:r>
+          </w:p>
+        </w:tc>
+        <w:tc>
+          <w:tcPr>
+            <w:tcW w:type="dxa" w:w="3659"/>
+            <w:tcBorders>
+              <w:top w:val="single" w:color="BFBFBF" w:sz="4"/>
+              <w:left w:val="single" w:color="BFBFBF" w:sz="4"/>
+              <w:bottom w:val="single" w:color="BFBFBF" w:sz="4"/>
+              <w:right w:val="single" w:color="BFBFBF" w:sz="4"/>
+            </w:tcBorders>
+            <w:tcMar>
+              <w:top w:type="dxa" w:w="50"/>
+              <w:left w:type="dxa" w:w="90"/>
+              <w:bottom w:type="dxa" w:w="50"/>
+              <w:right w:type="dxa" w:w="90"/>
+            </w:tcMar>
+          </w:tcPr>
+          <w:p>
+            <w:pPr>
+              <w:spacing w:after="0" w:before="0"/>
+            </w:pPr>
+            <w:r>
+              <w:rPr>
+                <w:sz w:val="18"/>
+                <w:szCs w:val="18"/>
+              </w:rPr>
+              <w:t xml:space="preserve">La compra completa, la idempotencia, el pago rechazado, las reglas de negocio, la seguridad, la cancelación y la mensajería, en 13 escenarios con 181 comprobaciones</w:t>
+            </w:r>
+          </w:p>
+        </w:tc>
+        <w:tc>
+          <w:tcPr>
+            <w:tcW w:type="dxa" w:w="3205"/>
+            <w:tcBorders>
+              <w:top w:val="single" w:color="BFBFBF" w:sz="4"/>
+              <w:left w:val="single" w:color="BFBFBF" w:sz="4"/>
+              <w:bottom w:val="single" w:color="BFBFBF" w:sz="4"/>
+              <w:right w:val="single" w:color="BFBFBF" w:sz="4"/>
+            </w:tcBorders>
+            <w:tcMar>
+              <w:top w:type="dxa" w:w="50"/>
+              <w:left w:type="dxa" w:w="90"/>
+              <w:bottom w:type="dxa" w:w="50"/>
+              <w:right w:type="dxa" w:w="90"/>
+            </w:tcMar>
+          </w:tcPr>
+          <w:p>
+            <w:pPr>
+              <w:spacing w:after="0" w:before="0"/>
+            </w:pPr>
+            <w:r>
+              <w:rPr>
+                <w:sz w:val="18"/>
+                <w:szCs w:val="18"/>
+              </w:rPr>
+              <w:t xml:space="preserve">La salida completa de una versión anterior de </w:t>
+            </w:r>
+            <w:r>
+              <w:rPr>
+                <w:rFonts w:ascii="Consolas" w:cs="Consolas" w:eastAsia="Consolas" w:hAnsi="Consolas"/>
+                <w:sz w:val="17"/>
+                <w:szCs w:val="17"/>
+                <w:shd w:fill="F0F0F0" w:color="auto" w:val="clear"/>
+              </w:rPr>
+              <w:t xml:space="preserve">scripts/​pruebas/​escenarios.​mjs</w:t>
+            </w:r>
+            <w:r>
+              <w:rPr>
+                <w:sz w:val="18"/>
+                <w:szCs w:val="18"/>
+              </w:rPr>
+              <w:t xml:space="preserve">. El escenario 5 de esa salida todavía pasa por la verificación de identidad, que Usuarios ya no pide</w:t>
             </w:r>
           </w:p>
         </w:tc>
@@ -10327,99 +10820,106 @@
         </w:trPr>
         <w:tc>
           <w:tcPr>
-            <w:tcW w:type="dxa" w:w="3246"/>
-            <w:tcBorders>
-              <w:top w:val="single" w:color="BFBFBF" w:sz="4"/>
-              <w:left w:val="single" w:color="BFBFBF" w:sz="4"/>
-              <w:bottom w:val="single" w:color="BFBFBF" w:sz="4"/>
-              <w:right w:val="single" w:color="BFBFBF" w:sz="4"/>
-            </w:tcBorders>
-            <w:tcMar>
-              <w:top w:type="dxa" w:w="50"/>
-              <w:left w:type="dxa" w:w="90"/>
-              <w:bottom w:type="dxa" w:w="50"/>
-              <w:right w:type="dxa" w:w="90"/>
-            </w:tcMar>
-          </w:tcPr>
-          <w:p>
-            <w:pPr>
-              <w:spacing w:after="0" w:before="0"/>
-            </w:pPr>
-            <w:r>
-              <w:rPr>
-                <w:rFonts w:ascii="Consolas" w:cs="Consolas" w:eastAsia="Consolas" w:hAnsi="Consolas"/>
-                <w:sz w:val="17"/>
-                <w:szCs w:val="17"/>
-                <w:shd w:fill="F0F0F0" w:color="auto" w:val="clear"/>
-              </w:rPr>
-              <w:t xml:space="preserve">mensaje-​repetido-​y-​reintentos.​txt</w:t>
-            </w:r>
-          </w:p>
-        </w:tc>
-        <w:tc>
-          <w:tcPr>
-            <w:tcW w:type="dxa" w:w="3769"/>
-            <w:tcBorders>
-              <w:top w:val="single" w:color="BFBFBF" w:sz="4"/>
-              <w:left w:val="single" w:color="BFBFBF" w:sz="4"/>
-              <w:bottom w:val="single" w:color="BFBFBF" w:sz="4"/>
-              <w:right w:val="single" w:color="BFBFBF" w:sz="4"/>
-            </w:tcBorders>
-            <w:tcMar>
-              <w:top w:type="dxa" w:w="50"/>
-              <w:left w:type="dxa" w:w="90"/>
-              <w:bottom w:type="dxa" w:w="50"/>
-              <w:right w:type="dxa" w:w="90"/>
-            </w:tcMar>
-          </w:tcPr>
-          <w:p>
-            <w:pPr>
-              <w:spacing w:after="0" w:before="0"/>
-            </w:pPr>
-            <w:r>
-              <w:rPr>
-                <w:sz w:val="18"/>
-                <w:szCs w:val="18"/>
-              </w:rPr>
-              <w:t xml:space="preserve">Entregas repetidas, reintentos y </w:t>
-            </w:r>
-            <w:r>
-              <w:rPr>
-                <w:rFonts w:ascii="Consolas" w:cs="Consolas" w:eastAsia="Consolas" w:hAnsi="Consolas"/>
-                <w:sz w:val="17"/>
-                <w:szCs w:val="17"/>
-                <w:shd w:fill="F0F0F0" w:color="auto" w:val="clear"/>
-              </w:rPr>
-              <w:t xml:space="preserve">DLQ</w:t>
-            </w:r>
-          </w:p>
-        </w:tc>
-        <w:tc>
-          <w:tcPr>
-            <w:tcW w:type="dxa" w:w="2397"/>
-            <w:tcBorders>
-              <w:top w:val="single" w:color="BFBFBF" w:sz="4"/>
-              <w:left w:val="single" w:color="BFBFBF" w:sz="4"/>
-              <w:bottom w:val="single" w:color="BFBFBF" w:sz="4"/>
-              <w:right w:val="single" w:color="BFBFBF" w:sz="4"/>
-            </w:tcBorders>
-            <w:tcMar>
-              <w:top w:type="dxa" w:w="50"/>
-              <w:left w:type="dxa" w:w="90"/>
-              <w:bottom w:type="dxa" w:w="50"/>
-              <w:right w:type="dxa" w:w="90"/>
-            </w:tcMar>
-          </w:tcPr>
-          <w:p>
-            <w:pPr>
-              <w:spacing w:after="0" w:before="0"/>
-            </w:pPr>
-            <w:r>
-              <w:rPr>
-                <w:sz w:val="18"/>
-                <w:szCs w:val="18"/>
-              </w:rPr>
-              <w:t xml:space="preserve">La salida de un guion de prueba que no está en el repositorio</w:t>
+            <w:tcW w:type="dxa" w:w="2548"/>
+            <w:tcBorders>
+              <w:top w:val="single" w:color="BFBFBF" w:sz="4"/>
+              <w:left w:val="single" w:color="BFBFBF" w:sz="4"/>
+              <w:bottom w:val="single" w:color="BFBFBF" w:sz="4"/>
+              <w:right w:val="single" w:color="BFBFBF" w:sz="4"/>
+            </w:tcBorders>
+            <w:tcMar>
+              <w:top w:type="dxa" w:w="50"/>
+              <w:left w:type="dxa" w:w="90"/>
+              <w:bottom w:type="dxa" w:w="50"/>
+              <w:right w:type="dxa" w:w="90"/>
+            </w:tcMar>
+          </w:tcPr>
+          <w:p>
+            <w:pPr>
+              <w:spacing w:after="0" w:before="0"/>
+            </w:pPr>
+            <w:r>
+              <w:rPr>
+                <w:rFonts w:ascii="Consolas" w:cs="Consolas" w:eastAsia="Consolas" w:hAnsi="Consolas"/>
+                <w:sz w:val="17"/>
+                <w:szCs w:val="17"/>
+                <w:shd w:fill="F0F0F0" w:color="auto" w:val="clear"/>
+              </w:rPr>
+              <w:t xml:space="preserve">compras-​simultaneas.​mjs</w:t>
+            </w:r>
+            <w:r>
+              <w:rPr>
+                <w:sz w:val="18"/>
+                <w:szCs w:val="18"/>
+              </w:rPr>
+              <w:t xml:space="preserve"> y </w:t>
+            </w:r>
+            <w:r>
+              <w:rPr>
+                <w:rFonts w:ascii="Consolas" w:cs="Consolas" w:eastAsia="Consolas" w:hAnsi="Consolas"/>
+                <w:sz w:val="17"/>
+                <w:szCs w:val="17"/>
+                <w:shd w:fill="F0F0F0" w:color="auto" w:val="clear"/>
+              </w:rPr>
+              <w:t xml:space="preserve">compras-​simultaneas.​txt</w:t>
+            </w:r>
+          </w:p>
+        </w:tc>
+        <w:tc>
+          <w:tcPr>
+            <w:tcW w:type="dxa" w:w="3659"/>
+            <w:tcBorders>
+              <w:top w:val="single" w:color="BFBFBF" w:sz="4"/>
+              <w:left w:val="single" w:color="BFBFBF" w:sz="4"/>
+              <w:bottom w:val="single" w:color="BFBFBF" w:sz="4"/>
+              <w:right w:val="single" w:color="BFBFBF" w:sz="4"/>
+            </w:tcBorders>
+            <w:tcMar>
+              <w:top w:type="dxa" w:w="50"/>
+              <w:left w:type="dxa" w:w="90"/>
+              <w:bottom w:type="dxa" w:w="50"/>
+              <w:right w:type="dxa" w:w="90"/>
+            </w:tcMar>
+          </w:tcPr>
+          <w:p>
+            <w:pPr>
+              <w:spacing w:after="0" w:before="0"/>
+            </w:pPr>
+            <w:r>
+              <w:rPr>
+                <w:sz w:val="18"/>
+                <w:szCs w:val="18"/>
+              </w:rPr>
+              <w:t xml:space="preserve">80 compras, 20 pedidos con la misma clave de idempotencia y 30 pagos a la vez, sin pedidos sin respuesta. No es parte del proceso asincrónico</w:t>
+            </w:r>
+          </w:p>
+        </w:tc>
+        <w:tc>
+          <w:tcPr>
+            <w:tcW w:type="dxa" w:w="3205"/>
+            <w:tcBorders>
+              <w:top w:val="single" w:color="BFBFBF" w:sz="4"/>
+              <w:left w:val="single" w:color="BFBFBF" w:sz="4"/>
+              <w:bottom w:val="single" w:color="BFBFBF" w:sz="4"/>
+              <w:right w:val="single" w:color="BFBFBF" w:sz="4"/>
+            </w:tcBorders>
+            <w:tcMar>
+              <w:top w:type="dxa" w:w="50"/>
+              <w:left w:type="dxa" w:w="90"/>
+              <w:bottom w:type="dxa" w:w="50"/>
+              <w:right w:type="dxa" w:w="90"/>
+            </w:tcMar>
+          </w:tcPr>
+          <w:p>
+            <w:pPr>
+              <w:spacing w:after="0" w:before="0"/>
+            </w:pPr>
+            <w:r>
+              <w:rPr>
+                <w:sz w:val="18"/>
+                <w:szCs w:val="18"/>
+              </w:rPr>
+              <w:t xml:space="preserve">El guion y su salida</w:t>
             </w:r>
           </w:p>
         </w:tc>
@@ -10430,7 +10930,321 @@
         </w:trPr>
         <w:tc>
           <w:tcPr>
-            <w:tcW w:type="dxa" w:w="3246"/>
+            <w:tcW w:type="dxa" w:w="2548"/>
+            <w:tcBorders>
+              <w:top w:val="single" w:color="BFBFBF" w:sz="4"/>
+              <w:left w:val="single" w:color="BFBFBF" w:sz="4"/>
+              <w:bottom w:val="single" w:color="BFBFBF" w:sz="4"/>
+              <w:right w:val="single" w:color="BFBFBF" w:sz="4"/>
+            </w:tcBorders>
+            <w:tcMar>
+              <w:top w:type="dxa" w:w="50"/>
+              <w:left w:type="dxa" w:w="90"/>
+              <w:bottom w:type="dxa" w:w="50"/>
+              <w:right w:type="dxa" w:w="90"/>
+            </w:tcMar>
+          </w:tcPr>
+          <w:p>
+            <w:pPr>
+              <w:spacing w:after="0" w:before="0"/>
+            </w:pPr>
+            <w:r>
+              <w:rPr>
+                <w:rFonts w:ascii="Consolas" w:cs="Consolas" w:eastAsia="Consolas" w:hAnsi="Consolas"/>
+                <w:sz w:val="17"/>
+                <w:szCs w:val="17"/>
+                <w:shd w:fill="F0F0F0" w:color="auto" w:val="clear"/>
+              </w:rPr>
+              <w:t xml:space="preserve">venta-​inexistente.​txt</w:t>
+            </w:r>
+          </w:p>
+        </w:tc>
+        <w:tc>
+          <w:tcPr>
+            <w:tcW w:type="dxa" w:w="3659"/>
+            <w:tcBorders>
+              <w:top w:val="single" w:color="BFBFBF" w:sz="4"/>
+              <w:left w:val="single" w:color="BFBFBF" w:sz="4"/>
+              <w:bottom w:val="single" w:color="BFBFBF" w:sz="4"/>
+              <w:right w:val="single" w:color="BFBFBF" w:sz="4"/>
+            </w:tcBorders>
+            <w:tcMar>
+              <w:top w:type="dxa" w:w="50"/>
+              <w:left w:type="dxa" w:w="90"/>
+              <w:bottom w:type="dxa" w:w="50"/>
+              <w:right w:type="dxa" w:w="90"/>
+            </w:tcMar>
+          </w:tcPr>
+          <w:p>
+            <w:pPr>
+              <w:spacing w:after="0" w:before="0"/>
+            </w:pPr>
+            <w:r>
+              <w:rPr>
+                <w:sz w:val="18"/>
+                <w:szCs w:val="18"/>
+              </w:rPr>
+              <w:t xml:space="preserve">Qué hace el consumidor con un mensaje de una venta que no existe</w:t>
+            </w:r>
+          </w:p>
+        </w:tc>
+        <w:tc>
+          <w:tcPr>
+            <w:tcW w:type="dxa" w:w="3205"/>
+            <w:tcBorders>
+              <w:top w:val="single" w:color="BFBFBF" w:sz="4"/>
+              <w:left w:val="single" w:color="BFBFBF" w:sz="4"/>
+              <w:bottom w:val="single" w:color="BFBFBF" w:sz="4"/>
+              <w:right w:val="single" w:color="BFBFBF" w:sz="4"/>
+            </w:tcBorders>
+            <w:tcMar>
+              <w:top w:type="dxa" w:w="50"/>
+              <w:left w:type="dxa" w:w="90"/>
+              <w:bottom w:type="dxa" w:w="50"/>
+              <w:right w:type="dxa" w:w="90"/>
+            </w:tcMar>
+          </w:tcPr>
+          <w:p>
+            <w:pPr>
+              <w:spacing w:after="0" w:before="0"/>
+            </w:pPr>
+            <w:r>
+              <w:rPr>
+                <w:sz w:val="18"/>
+                <w:szCs w:val="18"/>
+              </w:rPr>
+              <w:t xml:space="preserve">Fecha, comando exacto y salida</w:t>
+            </w:r>
+          </w:p>
+        </w:tc>
+      </w:tr>
+      <w:tr>
+        <w:trPr>
+          <w:cantSplit/>
+        </w:trPr>
+        <w:tc>
+          <w:tcPr>
+            <w:tcW w:type="dxa" w:w="2548"/>
+            <w:tcBorders>
+              <w:top w:val="single" w:color="BFBFBF" w:sz="4"/>
+              <w:left w:val="single" w:color="BFBFBF" w:sz="4"/>
+              <w:bottom w:val="single" w:color="BFBFBF" w:sz="4"/>
+              <w:right w:val="single" w:color="BFBFBF" w:sz="4"/>
+            </w:tcBorders>
+            <w:tcMar>
+              <w:top w:type="dxa" w:w="50"/>
+              <w:left w:type="dxa" w:w="90"/>
+              <w:bottom w:type="dxa" w:w="50"/>
+              <w:right w:type="dxa" w:w="90"/>
+            </w:tcMar>
+          </w:tcPr>
+          <w:p>
+            <w:pPr>
+              <w:spacing w:after="0" w:before="0"/>
+            </w:pPr>
+            <w:r>
+              <w:rPr>
+                <w:rFonts w:ascii="Consolas" w:cs="Consolas" w:eastAsia="Consolas" w:hAnsi="Consolas"/>
+                <w:sz w:val="17"/>
+                <w:szCs w:val="17"/>
+                <w:shd w:fill="F0F0F0" w:color="auto" w:val="clear"/>
+              </w:rPr>
+              <w:t xml:space="preserve">mensajes-​pendientes.​txt</w:t>
+            </w:r>
+          </w:p>
+        </w:tc>
+        <w:tc>
+          <w:tcPr>
+            <w:tcW w:type="dxa" w:w="3659"/>
+            <w:tcBorders>
+              <w:top w:val="single" w:color="BFBFBF" w:sz="4"/>
+              <w:left w:val="single" w:color="BFBFBF" w:sz="4"/>
+              <w:bottom w:val="single" w:color="BFBFBF" w:sz="4"/>
+              <w:right w:val="single" w:color="BFBFBF" w:sz="4"/>
+            </w:tcBorders>
+            <w:tcMar>
+              <w:top w:type="dxa" w:w="50"/>
+              <w:left w:type="dxa" w:w="90"/>
+              <w:bottom w:type="dxa" w:w="50"/>
+              <w:right w:type="dxa" w:w="90"/>
+            </w:tcMar>
+          </w:tcPr>
+          <w:p>
+            <w:pPr>
+              <w:spacing w:after="0" w:before="0"/>
+            </w:pPr>
+            <w:r>
+              <w:rPr>
+                <w:sz w:val="18"/>
+                <w:szCs w:val="18"/>
+              </w:rPr>
+              <w:t xml:space="preserve">Los mensajes esperan en la cola mientras no hay consumidor</w:t>
+            </w:r>
+          </w:p>
+        </w:tc>
+        <w:tc>
+          <w:tcPr>
+            <w:tcW w:type="dxa" w:w="3205"/>
+            <w:tcBorders>
+              <w:top w:val="single" w:color="BFBFBF" w:sz="4"/>
+              <w:left w:val="single" w:color="BFBFBF" w:sz="4"/>
+              <w:bottom w:val="single" w:color="BFBFBF" w:sz="4"/>
+              <w:right w:val="single" w:color="BFBFBF" w:sz="4"/>
+            </w:tcBorders>
+            <w:tcMar>
+              <w:top w:type="dxa" w:w="50"/>
+              <w:left w:type="dxa" w:w="90"/>
+              <w:bottom w:type="dxa" w:w="50"/>
+              <w:right w:type="dxa" w:w="90"/>
+            </w:tcMar>
+          </w:tcPr>
+          <w:p>
+            <w:pPr>
+              <w:spacing w:after="0" w:before="0"/>
+            </w:pPr>
+            <w:r>
+              <w:rPr>
+                <w:sz w:val="18"/>
+                <w:szCs w:val="18"/>
+              </w:rPr>
+              <w:t xml:space="preserve">Fecha, comando y salida; la del paso 3 está resumida</w:t>
+            </w:r>
+          </w:p>
+        </w:tc>
+      </w:tr>
+      <w:tr>
+        <w:trPr>
+          <w:cantSplit/>
+        </w:trPr>
+        <w:tc>
+          <w:tcPr>
+            <w:tcW w:type="dxa" w:w="2548"/>
+            <w:tcBorders>
+              <w:top w:val="single" w:color="BFBFBF" w:sz="4"/>
+              <w:left w:val="single" w:color="BFBFBF" w:sz="4"/>
+              <w:bottom w:val="single" w:color="BFBFBF" w:sz="4"/>
+              <w:right w:val="single" w:color="BFBFBF" w:sz="4"/>
+            </w:tcBorders>
+            <w:tcMar>
+              <w:top w:type="dxa" w:w="50"/>
+              <w:left w:type="dxa" w:w="90"/>
+              <w:bottom w:type="dxa" w:w="50"/>
+              <w:right w:type="dxa" w:w="90"/>
+            </w:tcMar>
+          </w:tcPr>
+          <w:p>
+            <w:pPr>
+              <w:spacing w:after="0" w:before="0"/>
+            </w:pPr>
+            <w:r>
+              <w:rPr>
+                <w:rFonts w:ascii="Consolas" w:cs="Consolas" w:eastAsia="Consolas" w:hAnsi="Consolas"/>
+                <w:sz w:val="17"/>
+                <w:szCs w:val="17"/>
+                <w:shd w:fill="F0F0F0" w:color="auto" w:val="clear"/>
+              </w:rPr>
+              <w:t xml:space="preserve">mensaje-​repetido-​y-​reintentos.​txt</w:t>
+            </w:r>
+          </w:p>
+        </w:tc>
+        <w:tc>
+          <w:tcPr>
+            <w:tcW w:type="dxa" w:w="3659"/>
+            <w:tcBorders>
+              <w:top w:val="single" w:color="BFBFBF" w:sz="4"/>
+              <w:left w:val="single" w:color="BFBFBF" w:sz="4"/>
+              <w:bottom w:val="single" w:color="BFBFBF" w:sz="4"/>
+              <w:right w:val="single" w:color="BFBFBF" w:sz="4"/>
+            </w:tcBorders>
+            <w:tcMar>
+              <w:top w:type="dxa" w:w="50"/>
+              <w:left w:type="dxa" w:w="90"/>
+              <w:bottom w:type="dxa" w:w="50"/>
+              <w:right w:type="dxa" w:w="90"/>
+            </w:tcMar>
+          </w:tcPr>
+          <w:p>
+            <w:pPr>
+              <w:spacing w:after="0" w:before="0"/>
+            </w:pPr>
+            <w:r>
+              <w:rPr>
+                <w:sz w:val="18"/>
+                <w:szCs w:val="18"/>
+              </w:rPr>
+              <w:t xml:space="preserve">Complementa los escenarios 8 y 12 de </w:t>
+            </w:r>
+            <w:r>
+              <w:rPr>
+                <w:rFonts w:ascii="Consolas" w:cs="Consolas" w:eastAsia="Consolas" w:hAnsi="Consolas"/>
+                <w:sz w:val="17"/>
+                <w:szCs w:val="17"/>
+                <w:shd w:fill="F0F0F0" w:color="auto" w:val="clear"/>
+              </w:rPr>
+              <w:t xml:space="preserve">integracion-​13-​escenarios.​txt</w:t>
+            </w:r>
+            <w:r>
+              <w:rPr>
+                <w:sz w:val="18"/>
+                <w:szCs w:val="18"/>
+              </w:rPr>
+              <w:t xml:space="preserve">, que prueban la entrega repetida y los reintentos con la </w:t>
+            </w:r>
+            <w:r>
+              <w:rPr>
+                <w:rFonts w:ascii="Consolas" w:cs="Consolas" w:eastAsia="Consolas" w:hAnsi="Consolas"/>
+                <w:sz w:val="17"/>
+                <w:szCs w:val="17"/>
+                <w:shd w:fill="F0F0F0" w:color="auto" w:val="clear"/>
+              </w:rPr>
+              <w:t xml:space="preserve">DLQ</w:t>
+            </w:r>
+            <w:r>
+              <w:rPr>
+                <w:sz w:val="18"/>
+                <w:szCs w:val="18"/>
+              </w:rPr>
+              <w:t xml:space="preserve"> sobre el código entregado: ocho copias del mismo mensaje a la vez y una falla forzada después de emitir</w:t>
+            </w:r>
+          </w:p>
+        </w:tc>
+        <w:tc>
+          <w:tcPr>
+            <w:tcW w:type="dxa" w:w="3205"/>
+            <w:tcBorders>
+              <w:top w:val="single" w:color="BFBFBF" w:sz="4"/>
+              <w:left w:val="single" w:color="BFBFBF" w:sz="4"/>
+              <w:bottom w:val="single" w:color="BFBFBF" w:sz="4"/>
+              <w:right w:val="single" w:color="BFBFBF" w:sz="4"/>
+            </w:tcBorders>
+            <w:tcMar>
+              <w:top w:type="dxa" w:w="50"/>
+              <w:left w:type="dxa" w:w="90"/>
+              <w:bottom w:type="dxa" w:w="50"/>
+              <w:right w:type="dxa" w:w="90"/>
+            </w:tcMar>
+          </w:tcPr>
+          <w:p>
+            <w:pPr>
+              <w:spacing w:after="0" w:before="0"/>
+            </w:pPr>
+            <w:r>
+              <w:rPr>
+                <w:sz w:val="18"/>
+                <w:szCs w:val="18"/>
+              </w:rPr>
+              <w:t xml:space="preserve">La salida de un guion de prueba que no está en el repositorio, corrido con una versión modificada del servicio</w:t>
+            </w:r>
+          </w:p>
+        </w:tc>
+      </w:tr>
+      <w:tr>
+        <w:trPr>
+          <w:cantSplit/>
+        </w:trPr>
+        <w:tc>
+          <w:tcPr>
+            <w:tcW w:type="dxa" w:w="2548"/>
             <w:tcBorders>
               <w:top w:val="single" w:color="BFBFBF" w:sz="4"/>
               <w:left w:val="single" w:color="BFBFBF" w:sz="4"/>
@@ -10461,7 +11275,7 @@
         </w:tc>
         <w:tc>
           <w:tcPr>
-            <w:tcW w:type="dxa" w:w="3769"/>
+            <w:tcW w:type="dxa" w:w="3659"/>
             <w:tcBorders>
               <w:top w:val="single" w:color="BFBFBF" w:sz="4"/>
               <w:left w:val="single" w:color="BFBFBF" w:sz="4"/>
@@ -10490,30 +11304,30 @@
         </w:tc>
         <w:tc>
           <w:tcPr>
-            <w:tcW w:type="dxa" w:w="2397"/>
-            <w:tcBorders>
-              <w:top w:val="single" w:color="BFBFBF" w:sz="4"/>
-              <w:left w:val="single" w:color="BFBFBF" w:sz="4"/>
-              <w:bottom w:val="single" w:color="BFBFBF" w:sz="4"/>
-              <w:right w:val="single" w:color="BFBFBF" w:sz="4"/>
-            </w:tcBorders>
-            <w:tcMar>
-              <w:top w:type="dxa" w:w="50"/>
-              <w:left w:type="dxa" w:w="90"/>
-              <w:bottom w:type="dxa" w:w="50"/>
-              <w:right w:type="dxa" w:w="90"/>
-            </w:tcMar>
-          </w:tcPr>
-          <w:p>
-            <w:pPr>
-              <w:spacing w:after="0" w:before="0"/>
-            </w:pPr>
-            <w:r>
-              <w:rPr>
-                <w:sz w:val="18"/>
-                <w:szCs w:val="18"/>
-              </w:rPr>
-              <w:t xml:space="preserve">Un resumen de la prueba, sin los comandos</w:t>
+            <w:tcW w:type="dxa" w:w="3205"/>
+            <w:tcBorders>
+              <w:top w:val="single" w:color="BFBFBF" w:sz="4"/>
+              <w:left w:val="single" w:color="BFBFBF" w:sz="4"/>
+              <w:bottom w:val="single" w:color="BFBFBF" w:sz="4"/>
+              <w:right w:val="single" w:color="BFBFBF" w:sz="4"/>
+            </w:tcBorders>
+            <w:tcMar>
+              <w:top w:type="dxa" w:w="50"/>
+              <w:left w:type="dxa" w:w="90"/>
+              <w:bottom w:type="dxa" w:w="50"/>
+              <w:right w:type="dxa" w:w="90"/>
+            </w:tcMar>
+          </w:tcPr>
+          <w:p>
+            <w:pPr>
+              <w:spacing w:after="0" w:before="0"/>
+            </w:pPr>
+            <w:r>
+              <w:rPr>
+                <w:sz w:val="18"/>
+                <w:szCs w:val="18"/>
+              </w:rPr>
+              <w:t xml:space="preserve">Un resumen de la prueba, sin los comandos ni la salida completa</w:t>
             </w:r>
           </w:p>
         </w:tc>
@@ -12269,6 +13083,22 @@
                 <w:szCs w:val="17"/>
                 <w:shd w:fill="F0F0F0" w:color="auto" w:val="clear"/>
               </w:rPr>
+              <w:t xml:space="preserve">GET /​ventas</w:t>
+            </w:r>
+            <w:r>
+              <w:rPr>
+                <w:sz w:val="18"/>
+                <w:szCs w:val="18"/>
+              </w:rPr>
+              <w:t xml:space="preserve"> (las compras de quien pregunta), </w:t>
+            </w:r>
+            <w:r>
+              <w:rPr>
+                <w:rFonts w:ascii="Consolas" w:cs="Consolas" w:eastAsia="Consolas" w:hAnsi="Consolas"/>
+                <w:sz w:val="17"/>
+                <w:szCs w:val="17"/>
+                <w:shd w:fill="F0F0F0" w:color="auto" w:val="clear"/>
+              </w:rPr>
               <w:t xml:space="preserve">GET</w:t>
             </w:r>
             <w:r>
@@ -12606,7 +13436,7 @@
                 <w:szCs w:val="17"/>
                 <w:shd w:fill="F0F0F0" w:color="auto" w:val="clear"/>
               </w:rPr>
-              <w:t xml:space="preserve">V-​e9ee3ad1</w:t>
+              <w:t xml:space="preserve">V-​3c150ebb</w:t>
             </w:r>
           </w:p>
         </w:tc>
@@ -12741,8 +13571,8 @@
         <w:tblLayout w:type="fixed"/>
       </w:tblPr>
       <w:tblGrid>
-        <w:gridCol w:w="2613"/>
-        <w:gridCol w:w="6799"/>
+        <w:gridCol w:w="2439"/>
+        <w:gridCol w:w="6973"/>
       </w:tblGrid>
       <w:tr>
         <w:trPr>
@@ -12751,7 +13581,7 @@
         </w:trPr>
         <w:tc>
           <w:tcPr>
-            <w:tcW w:type="dxa" w:w="2613"/>
+            <w:tcW w:type="dxa" w:w="2439"/>
             <w:tcBorders>
               <w:top w:val="single" w:color="BFBFBF" w:sz="4"/>
               <w:left w:val="single" w:color="BFBFBF" w:sz="4"/>
@@ -12783,7 +13613,7 @@
         </w:tc>
         <w:tc>
           <w:tcPr>
-            <w:tcW w:type="dxa" w:w="6799"/>
+            <w:tcW w:type="dxa" w:w="6973"/>
             <w:tcBorders>
               <w:top w:val="single" w:color="BFBFBF" w:sz="4"/>
               <w:left w:val="single" w:color="BFBFBF" w:sz="4"/>
@@ -12820,7 +13650,7 @@
         </w:trPr>
         <w:tc>
           <w:tcPr>
-            <w:tcW w:type="dxa" w:w="2613"/>
+            <w:tcW w:type="dxa" w:w="2439"/>
             <w:tcBorders>
               <w:top w:val="single" w:color="BFBFBF" w:sz="4"/>
               <w:left w:val="single" w:color="BFBFBF" w:sz="4"/>
@@ -12865,7 +13695,7 @@
         </w:tc>
         <w:tc>
           <w:tcPr>
-            <w:tcW w:type="dxa" w:w="6799"/>
+            <w:tcW w:type="dxa" w:w="6973"/>
             <w:tcBorders>
               <w:top w:val="single" w:color="BFBFBF" w:sz="4"/>
               <w:left w:val="single" w:color="BFBFBF" w:sz="4"/>
@@ -12899,7 +13729,7 @@
         </w:trPr>
         <w:tc>
           <w:tcPr>
-            <w:tcW w:type="dxa" w:w="2613"/>
+            <w:tcW w:type="dxa" w:w="2439"/>
             <w:tcBorders>
               <w:top w:val="single" w:color="BFBFBF" w:sz="4"/>
               <w:left w:val="single" w:color="BFBFBF" w:sz="4"/>
@@ -12928,7 +13758,7 @@
         </w:tc>
         <w:tc>
           <w:tcPr>
-            <w:tcW w:type="dxa" w:w="6799"/>
+            <w:tcW w:type="dxa" w:w="6973"/>
             <w:tcBorders>
               <w:top w:val="single" w:color="BFBFBF" w:sz="4"/>
               <w:left w:val="single" w:color="BFBFBF" w:sz="4"/>
@@ -12962,7 +13792,7 @@
         </w:trPr>
         <w:tc>
           <w:tcPr>
-            <w:tcW w:type="dxa" w:w="2613"/>
+            <w:tcW w:type="dxa" w:w="2439"/>
             <w:tcBorders>
               <w:top w:val="single" w:color="BFBFBF" w:sz="4"/>
               <w:left w:val="single" w:color="BFBFBF" w:sz="4"/>
@@ -12991,7 +13821,7 @@
         </w:tc>
         <w:tc>
           <w:tcPr>
-            <w:tcW w:type="dxa" w:w="6799"/>
+            <w:tcW w:type="dxa" w:w="6973"/>
             <w:tcBorders>
               <w:top w:val="single" w:color="BFBFBF" w:sz="4"/>
               <w:left w:val="single" w:color="BFBFBF" w:sz="4"/>
@@ -13121,7 +13951,7 @@
         </w:trPr>
         <w:tc>
           <w:tcPr>
-            <w:tcW w:type="dxa" w:w="2613"/>
+            <w:tcW w:type="dxa" w:w="2439"/>
             <w:tcBorders>
               <w:top w:val="single" w:color="BFBFBF" w:sz="4"/>
               <w:left w:val="single" w:color="BFBFBF" w:sz="4"/>
@@ -13166,7 +13996,7 @@
         </w:tc>
         <w:tc>
           <w:tcPr>
-            <w:tcW w:type="dxa" w:w="6799"/>
+            <w:tcW w:type="dxa" w:w="6973"/>
             <w:tcBorders>
               <w:top w:val="single" w:color="BFBFBF" w:sz="4"/>
               <w:left w:val="single" w:color="BFBFBF" w:sz="4"/>
@@ -13232,7 +14062,7 @@
         </w:trPr>
         <w:tc>
           <w:tcPr>
-            <w:tcW w:type="dxa" w:w="2613"/>
+            <w:tcW w:type="dxa" w:w="2439"/>
             <w:tcBorders>
               <w:top w:val="single" w:color="BFBFBF" w:sz="4"/>
               <w:left w:val="single" w:color="BFBFBF" w:sz="4"/>
@@ -13263,7 +14093,7 @@
         </w:tc>
         <w:tc>
           <w:tcPr>
-            <w:tcW w:type="dxa" w:w="6799"/>
+            <w:tcW w:type="dxa" w:w="6973"/>
             <w:tcBorders>
               <w:top w:val="single" w:color="BFBFBF" w:sz="4"/>
               <w:left w:val="single" w:color="BFBFBF" w:sz="4"/>
@@ -13313,7 +14143,7 @@
         </w:trPr>
         <w:tc>
           <w:tcPr>
-            <w:tcW w:type="dxa" w:w="2613"/>
+            <w:tcW w:type="dxa" w:w="2439"/>
             <w:tcBorders>
               <w:top w:val="single" w:color="BFBFBF" w:sz="4"/>
               <w:left w:val="single" w:color="BFBFBF" w:sz="4"/>
@@ -13342,7 +14172,7 @@
         </w:tc>
         <w:tc>
           <w:tcPr>
-            <w:tcW w:type="dxa" w:w="6799"/>
+            <w:tcW w:type="dxa" w:w="6973"/>
             <w:tcBorders>
               <w:top w:val="single" w:color="BFBFBF" w:sz="4"/>
               <w:left w:val="single" w:color="BFBFBF" w:sz="4"/>
@@ -13376,7 +14206,7 @@
         </w:trPr>
         <w:tc>
           <w:tcPr>
-            <w:tcW w:type="dxa" w:w="2613"/>
+            <w:tcW w:type="dxa" w:w="2439"/>
             <w:tcBorders>
               <w:top w:val="single" w:color="BFBFBF" w:sz="4"/>
               <w:left w:val="single" w:color="BFBFBF" w:sz="4"/>
@@ -13405,7 +14235,7 @@
         </w:tc>
         <w:tc>
           <w:tcPr>
-            <w:tcW w:type="dxa" w:w="6799"/>
+            <w:tcW w:type="dxa" w:w="6973"/>
             <w:tcBorders>
               <w:top w:val="single" w:color="BFBFBF" w:sz="4"/>
               <w:left w:val="single" w:color="BFBFBF" w:sz="4"/>
@@ -13439,7 +14269,7 @@
         </w:trPr>
         <w:tc>
           <w:tcPr>
-            <w:tcW w:type="dxa" w:w="2613"/>
+            <w:tcW w:type="dxa" w:w="2439"/>
             <w:tcBorders>
               <w:top w:val="single" w:color="BFBFBF" w:sz="4"/>
               <w:left w:val="single" w:color="BFBFBF" w:sz="4"/>
@@ -13468,7 +14298,7 @@
         </w:tc>
         <w:tc>
           <w:tcPr>
-            <w:tcW w:type="dxa" w:w="6799"/>
+            <w:tcW w:type="dxa" w:w="6973"/>
             <w:tcBorders>
               <w:top w:val="single" w:color="BFBFBF" w:sz="4"/>
               <w:left w:val="single" w:color="BFBFBF" w:sz="4"/>
@@ -13502,7 +14332,7 @@
         </w:trPr>
         <w:tc>
           <w:tcPr>
-            <w:tcW w:type="dxa" w:w="2613"/>
+            <w:tcW w:type="dxa" w:w="2439"/>
             <w:tcBorders>
               <w:top w:val="single" w:color="BFBFBF" w:sz="4"/>
               <w:left w:val="single" w:color="BFBFBF" w:sz="4"/>
@@ -13531,7 +14361,7 @@
         </w:tc>
         <w:tc>
           <w:tcPr>
-            <w:tcW w:type="dxa" w:w="6799"/>
+            <w:tcW w:type="dxa" w:w="6973"/>
             <w:tcBorders>
               <w:top w:val="single" w:color="BFBFBF" w:sz="4"/>
               <w:left w:val="single" w:color="BFBFBF" w:sz="4"/>
@@ -13586,7 +14416,7 @@
                 <w:sz w:val="18"/>
                 <w:szCs w:val="18"/>
               </w:rPr>
-              <w:t xml:space="preserve">). Las llamadas de la compra a Ventas (</w:t>
+              <w:t xml:space="preserve">). En el código, la compra (reserva, pago, emisión y cancelación) llama a Ventas (</w:t>
             </w:r>
             <w:r>
               <w:rPr>
@@ -13602,7 +14432,7 @@
                 <w:sz w:val="18"/>
                 <w:szCs w:val="18"/>
               </w:rPr>
-              <w:t xml:space="preserve">) se escribieron el 13/10 y esa conexión está en curso. Para este documento no probamos el frontend en el navegador: toda la evidencia se tomó contra la API</w:t>
+              <w:t xml:space="preserve">). La reventa, la puerta y las estadísticas del organizador siguen con datos locales. Para este documento no probamos el frontend en el navegador: toda la evidencia se tomó contra la API</w:t>
             </w:r>
           </w:p>
         </w:tc>
@@ -13636,8 +14466,8 @@
         <w:tblLayout w:type="fixed"/>
       </w:tblPr>
       <w:tblGrid>
-        <w:gridCol w:w="4224"/>
-        <w:gridCol w:w="5188"/>
+        <w:gridCol w:w="3054"/>
+        <w:gridCol w:w="6358"/>
       </w:tblGrid>
       <w:tr>
         <w:trPr>
@@ -13646,7 +14476,7 @@
         </w:trPr>
         <w:tc>
           <w:tcPr>
-            <w:tcW w:type="dxa" w:w="4224"/>
+            <w:tcW w:type="dxa" w:w="3054"/>
             <w:tcBorders>
               <w:top w:val="single" w:color="BFBFBF" w:sz="4"/>
               <w:left w:val="single" w:color="BFBFBF" w:sz="4"/>
@@ -13678,7 +14508,7 @@
         </w:tc>
         <w:tc>
           <w:tcPr>
-            <w:tcW w:type="dxa" w:w="5188"/>
+            <w:tcW w:type="dxa" w:w="6358"/>
             <w:tcBorders>
               <w:top w:val="single" w:color="BFBFBF" w:sz="4"/>
               <w:left w:val="single" w:color="BFBFBF" w:sz="4"/>
@@ -13715,7 +14545,7 @@
         </w:trPr>
         <w:tc>
           <w:tcPr>
-            <w:tcW w:type="dxa" w:w="4224"/>
+            <w:tcW w:type="dxa" w:w="3054"/>
             <w:tcBorders>
               <w:top w:val="single" w:color="BFBFBF" w:sz="4"/>
               <w:left w:val="single" w:color="BFBFBF" w:sz="4"/>
@@ -13744,7 +14574,7 @@
         </w:tc>
         <w:tc>
           <w:tcPr>
-            <w:tcW w:type="dxa" w:w="5188"/>
+            <w:tcW w:type="dxa" w:w="6358"/>
             <w:tcBorders>
               <w:top w:val="single" w:color="BFBFBF" w:sz="4"/>
               <w:left w:val="single" w:color="BFBFBF" w:sz="4"/>
@@ -13778,7 +14608,7 @@
         </w:trPr>
         <w:tc>
           <w:tcPr>
-            <w:tcW w:type="dxa" w:w="4224"/>
+            <w:tcW w:type="dxa" w:w="3054"/>
             <w:tcBorders>
               <w:top w:val="single" w:color="BFBFBF" w:sz="4"/>
               <w:left w:val="single" w:color="BFBFBF" w:sz="4"/>
@@ -13807,7 +14637,7 @@
         </w:tc>
         <w:tc>
           <w:tcPr>
-            <w:tcW w:type="dxa" w:w="5188"/>
+            <w:tcW w:type="dxa" w:w="6358"/>
             <w:tcBorders>
               <w:top w:val="single" w:color="BFBFBF" w:sz="4"/>
               <w:left w:val="single" w:color="BFBFBF" w:sz="4"/>
@@ -13857,7 +14687,7 @@
         </w:trPr>
         <w:tc>
           <w:tcPr>
-            <w:tcW w:type="dxa" w:w="4224"/>
+            <w:tcW w:type="dxa" w:w="3054"/>
             <w:tcBorders>
               <w:top w:val="single" w:color="BFBFBF" w:sz="4"/>
               <w:left w:val="single" w:color="BFBFBF" w:sz="4"/>
@@ -13886,30 +14716,30 @@
         </w:tc>
         <w:tc>
           <w:tcPr>
-            <w:tcW w:type="dxa" w:w="5188"/>
-            <w:tcBorders>
-              <w:top w:val="single" w:color="BFBFBF" w:sz="4"/>
-              <w:left w:val="single" w:color="BFBFBF" w:sz="4"/>
-              <w:bottom w:val="single" w:color="BFBFBF" w:sz="4"/>
-              <w:right w:val="single" w:color="BFBFBF" w:sz="4"/>
-            </w:tcBorders>
-            <w:tcMar>
-              <w:top w:type="dxa" w:w="50"/>
-              <w:left w:type="dxa" w:w="90"/>
-              <w:bottom w:type="dxa" w:w="50"/>
-              <w:right w:type="dxa" w:w="90"/>
-            </w:tcMar>
-          </w:tcPr>
-          <w:p>
-            <w:pPr>
-              <w:spacing w:after="0" w:before="0"/>
-            </w:pPr>
-            <w:r>
-              <w:rPr>
-                <w:sz w:val="18"/>
-                <w:szCs w:val="18"/>
-              </w:rPr>
-              <w:t xml:space="preserve">La API propia funciona (I1). Mercado Pago, pendiente (I2)</w:t>
+            <w:tcW w:type="dxa" w:w="6358"/>
+            <w:tcBorders>
+              <w:top w:val="single" w:color="BFBFBF" w:sz="4"/>
+              <w:left w:val="single" w:color="BFBFBF" w:sz="4"/>
+              <w:bottom w:val="single" w:color="BFBFBF" w:sz="4"/>
+              <w:right w:val="single" w:color="BFBFBF" w:sz="4"/>
+            </w:tcBorders>
+            <w:tcMar>
+              <w:top w:type="dxa" w:w="50"/>
+              <w:left w:type="dxa" w:w="90"/>
+              <w:bottom w:type="dxa" w:w="50"/>
+              <w:right w:type="dxa" w:w="90"/>
+            </w:tcMar>
+          </w:tcPr>
+          <w:p>
+            <w:pPr>
+              <w:spacing w:after="0" w:before="0"/>
+            </w:pPr>
+            <w:r>
+              <w:rPr>
+                <w:sz w:val="18"/>
+                <w:szCs w:val="18"/>
+              </w:rPr>
+              <w:t xml:space="preserve">La API propia funciona (I1), pero todavía no tiene un consumidor externo y el contrato OpenAPI no está al día. Mercado Pago, pendiente (I2)</w:t>
             </w:r>
           </w:p>
         </w:tc>
@@ -13920,7 +14750,7 @@
         </w:trPr>
         <w:tc>
           <w:tcPr>
-            <w:tcW w:type="dxa" w:w="4224"/>
+            <w:tcW w:type="dxa" w:w="3054"/>
             <w:tcBorders>
               <w:top w:val="single" w:color="BFBFBF" w:sz="4"/>
               <w:left w:val="single" w:color="BFBFBF" w:sz="4"/>
@@ -13949,7 +14779,7 @@
         </w:tc>
         <w:tc>
           <w:tcPr>
-            <w:tcW w:type="dxa" w:w="5188"/>
+            <w:tcW w:type="dxa" w:w="6358"/>
             <w:tcBorders>
               <w:top w:val="single" w:color="BFBFBF" w:sz="4"/>
               <w:left w:val="single" w:color="BFBFBF" w:sz="4"/>
@@ -13988,7 +14818,7 @@
                 <w:sz w:val="18"/>
                 <w:szCs w:val="18"/>
               </w:rPr>
-              <w:t xml:space="preserve"> (sección 4.6). Falta probar la caída entre los dos commits</w:t>
+              <w:t xml:space="preserve"> (sección 4.6). Falta una prueba en vivo y reproducible de una falla dentro de la transacción después del cobro, la compensación del pago aprobado si falla la confirmación y la caída entre los dos commits. También, cerrar los dos límites de la compra que siguen a esta tabla</w:t>
             </w:r>
           </w:p>
         </w:tc>
@@ -13999,7 +14829,7 @@
         </w:trPr>
         <w:tc>
           <w:tcPr>
-            <w:tcW w:type="dxa" w:w="4224"/>
+            <w:tcW w:type="dxa" w:w="3054"/>
             <w:tcBorders>
               <w:top w:val="single" w:color="BFBFBF" w:sz="4"/>
               <w:left w:val="single" w:color="BFBFBF" w:sz="4"/>
@@ -14028,7 +14858,7 @@
         </w:tc>
         <w:tc>
           <w:tcPr>
-            <w:tcW w:type="dxa" w:w="5188"/>
+            <w:tcW w:type="dxa" w:w="6358"/>
             <w:tcBorders>
               <w:top w:val="single" w:color="BFBFBF" w:sz="4"/>
               <w:left w:val="single" w:color="BFBFBF" w:sz="4"/>
@@ -14060,6 +14890,228 @@
     <w:p>
       <w:pPr>
         <w:spacing w:after="120" w:before="0"/>
+      </w:pPr>
+    </w:p>
+    <w:p>
+      <w:pPr>
+        <w:keepNext/>
+        <w:spacing w:after="120" w:before="0"/>
+      </w:pPr>
+      <w:r>
+        <w:t xml:space="preserve">Dos límites conocidos de la compra, que se cierran con la tarea C3 del plan (conciliación y transacciones), prevista para presentarse el 13/11:</w:t>
+      </w:r>
+    </w:p>
+    <w:p>
+      <w:pPr>
+        <w:pStyle w:val="ListParagraph"/>
+        <w:numPr>
+          <w:ilvl w:val="0"/>
+          <w:numId w:val="9"/>
+        </w:numPr>
+        <w:spacing w:after="60" w:before="0"/>
+      </w:pPr>
+      <w:r>
+        <w:rPr>
+          <w:b/>
+          <w:bCs/>
+        </w:rPr>
+        <w:t xml:space="preserve">Un cobro sin resultado cuya compra ya no tiene instancia queda retenido.</w:t>
+      </w:r>
+      <w:r>
+        <w:t xml:space="preserve"> Si Pagos no contesta (504 </w:t>
+      </w:r>
+      <w:r>
+        <w:rPr>
+          <w:rFonts w:ascii="Consolas" w:cs="Consolas" w:eastAsia="Consolas" w:hAnsi="Consolas"/>
+          <w:sz w:val="20"/>
+          <w:szCs w:val="20"/>
+          <w:shd w:fill="F0F0F0" w:color="auto" w:val="clear"/>
+        </w:rPr>
+        <w:t xml:space="preserve">sin-respuesta</w:t>
+      </w:r>
+      <w:r>
+        <w:t xml:space="preserve">) o la confirmación falla de forma inesperada, la venta queda </w:t>
+      </w:r>
+      <w:r>
+        <w:rPr>
+          <w:rFonts w:ascii="Consolas" w:cs="Consolas" w:eastAsia="Consolas" w:hAnsi="Consolas"/>
+          <w:sz w:val="20"/>
+          <w:szCs w:val="20"/>
+          <w:shd w:fill="F0F0F0" w:color="auto" w:val="clear"/>
+        </w:rPr>
+        <w:t xml:space="preserve">EN_CHECKOUT</w:t>
+      </w:r>
+      <w:r>
+        <w:t xml:space="preserve"> con la clave del intento anotada en </w:t>
+      </w:r>
+      <w:r>
+        <w:rPr>
+          <w:rFonts w:ascii="Consolas" w:cs="Consolas" w:eastAsia="Consolas" w:hAnsi="Consolas"/>
+          <w:sz w:val="20"/>
+          <w:szCs w:val="20"/>
+          <w:shd w:fill="F0F0F0" w:color="auto" w:val="clear"/>
+        </w:rPr>
+        <w:t xml:space="preserve">clave_pago</w:t>
+      </w:r>
+      <w:r>
+        <w:t xml:space="preserve">. Mientras viva la instancia stateful de la compra, el reintento con la misma clave funciona y Pagos devuelve el pago que ya hubiera guardado, sin cobrar dos veces. Pero la instancia muere a los 10 minutos sin llamadas (</w:t>
+      </w:r>
+      <w:r>
+        <w:rPr>
+          <w:rFonts w:ascii="Consolas" w:cs="Consolas" w:eastAsia="Consolas" w:hAnsi="Consolas"/>
+          <w:sz w:val="20"/>
+          <w:szCs w:val="20"/>
+          <w:shd w:fill="F0F0F0" w:color="auto" w:val="clear"/>
+        </w:rPr>
+        <w:t xml:space="preserve">@StatefulTimeout</w:t>
+      </w:r>
+      <w:r>
+        <w:t xml:space="preserve">) o al redesplegar Ventas, y con ella los titulares de las entradas: desde ahí el reintento responde 409 </w:t>
+      </w:r>
+      <w:r>
+        <w:rPr>
+          <w:rFonts w:ascii="Consolas" w:cs="Consolas" w:eastAsia="Consolas" w:hAnsi="Consolas"/>
+          <w:sz w:val="20"/>
+          <w:szCs w:val="20"/>
+          <w:shd w:fill="F0F0F0" w:color="auto" w:val="clear"/>
+        </w:rPr>
+        <w:t xml:space="preserve">operacion-en-curso</w:t>
+      </w:r>
+      <w:r>
+        <w:t xml:space="preserve"> con el aviso de no volver a pagar, cancelar también responde 409 y el barrido la saltea (solo vence ventas sin </w:t>
+      </w:r>
+      <w:r>
+        <w:rPr>
+          <w:rFonts w:ascii="Consolas" w:cs="Consolas" w:eastAsia="Consolas" w:hAnsi="Consolas"/>
+          <w:sz w:val="20"/>
+          <w:szCs w:val="20"/>
+          <w:shd w:fill="F0F0F0" w:color="auto" w:val="clear"/>
+        </w:rPr>
+        <w:t xml:space="preserve">clave_pago</w:t>
+      </w:r>
+      <w:r>
+        <w:t xml:space="preserve">). La venta queda </w:t>
+      </w:r>
+      <w:r>
+        <w:rPr>
+          <w:rFonts w:ascii="Consolas" w:cs="Consolas" w:eastAsia="Consolas" w:hAnsi="Consolas"/>
+          <w:sz w:val="20"/>
+          <w:szCs w:val="20"/>
+          <w:shd w:fill="F0F0F0" w:color="auto" w:val="clear"/>
+        </w:rPr>
+        <w:t xml:space="preserve">EN_CHECKOUT</w:t>
+      </w:r>
+      <w:r>
+        <w:t xml:space="preserve"> y su cupo, tomado. Se diseñó así a propósito: Ventas no sabe si Pagos llegó a cobrar, y vencerla podría liberar el lugar de una compra cobrada y venderlo dos veces. Pagos no tiene una consulta por clave ni por venta (</w:t>
+      </w:r>
+      <w:r>
+        <w:rPr>
+          <w:rFonts w:ascii="Consolas" w:cs="Consolas" w:eastAsia="Consolas" w:hAnsi="Consolas"/>
+          <w:sz w:val="20"/>
+          <w:szCs w:val="20"/>
+          <w:shd w:fill="F0F0F0" w:color="auto" w:val="clear"/>
+        </w:rPr>
+        <w:t xml:space="preserve">GET /api/v1/pagos/{pagoId}</w:t>
+      </w:r>
+      <w:r>
+        <w:t xml:space="preserve"> pide el id del pago), así que hoy se resuelve a mano: se busca en la tabla de Pagos un pago de esa venta y, si no hay ninguno aprobado, se pasa la venta a </w:t>
+      </w:r>
+      <w:r>
+        <w:rPr>
+          <w:rFonts w:ascii="Consolas" w:cs="Consolas" w:eastAsia="Consolas" w:hAnsi="Consolas"/>
+          <w:sz w:val="20"/>
+          <w:szCs w:val="20"/>
+          <w:shd w:fill="F0F0F0" w:color="auto" w:val="clear"/>
+        </w:rPr>
+        <w:t xml:space="preserve">VENCIDA</w:t>
+      </w:r>
+      <w:r>
+        <w:t xml:space="preserve"> con un </w:t>
+      </w:r>
+      <w:r>
+        <w:rPr>
+          <w:rFonts w:ascii="Consolas" w:cs="Consolas" w:eastAsia="Consolas" w:hAnsi="Consolas"/>
+          <w:sz w:val="20"/>
+          <w:szCs w:val="20"/>
+          <w:shd w:fill="F0F0F0" w:color="auto" w:val="clear"/>
+        </w:rPr>
+        <w:t xml:space="preserve">UPDATE</w:t>
+      </w:r>
+      <w:r>
+        <w:t xml:space="preserve"> condicional y se devuelve el cupo a Eventos con el token de servicio. Si hay un pago aprobado, la venta no se toca: confirmarla exige crear las entradas y publicar el mensaje, que no se hace a mano. El procedimiento, con las consultas, está en </w:t>
+      </w:r>
+      <w:r>
+        <w:rPr>
+          <w:rFonts w:ascii="Consolas" w:cs="Consolas" w:eastAsia="Consolas" w:hAnsi="Consolas"/>
+          <w:sz w:val="20"/>
+          <w:szCs w:val="20"/>
+          <w:shd w:fill="F0F0F0" w:color="auto" w:val="clear"/>
+        </w:rPr>
+        <w:t xml:space="preserve">docs/notas/ventas-core.md</w:t>
+      </w:r>
+      <w:r>
+        <w:t xml:space="preserve">. En desarrollo la base es H2 en memoria dentro de WildFly y no acepta conexiones de afuera, así que ahí esas sentencias no se pueden correr. C3 lo reemplaza por una conciliación con Pagos que confirma la venta o libera su cupo.</w:t>
+      </w:r>
+    </w:p>
+    <w:p>
+      <w:pPr>
+        <w:pStyle w:val="ListParagraph"/>
+        <w:numPr>
+          <w:ilvl w:val="0"/>
+          <w:numId w:val="9"/>
+        </w:numPr>
+        <w:spacing w:after="60" w:before="0"/>
+      </w:pPr>
+      <w:r>
+        <w:rPr>
+          <w:b/>
+          <w:bCs/>
+        </w:rPr>
+        <w:t xml:space="preserve">La devolución de cupo no se reintenta.</w:t>
+      </w:r>
+      <w:r>
+        <w:t xml:space="preserve"> Al cancelar o vencer una venta, Ventas le devuelve el cupo a Eventos una sola vez, después de que el cambio de estado quedó confirmado en su base. Si Eventos no responde, queda un </w:t>
+      </w:r>
+      <w:r>
+        <w:rPr>
+          <w:rFonts w:ascii="Consolas" w:cs="Consolas" w:eastAsia="Consolas" w:hAnsi="Consolas"/>
+          <w:sz w:val="20"/>
+          <w:szCs w:val="20"/>
+          <w:shd w:fill="F0F0F0" w:color="auto" w:val="clear"/>
+        </w:rPr>
+        <w:t xml:space="preserve">WARNING</w:t>
+      </w:r>
+      <w:r>
+        <w:t xml:space="preserve"> en el log con la venta, el evento, el sector y la cantidad, y esos lugares siguen contados como vendidos: la venta ya está </w:t>
+      </w:r>
+      <w:r>
+        <w:rPr>
+          <w:rFonts w:ascii="Consolas" w:cs="Consolas" w:eastAsia="Consolas" w:hAnsi="Consolas"/>
+          <w:sz w:val="20"/>
+          <w:szCs w:val="20"/>
+          <w:shd w:fill="F0F0F0" w:color="auto" w:val="clear"/>
+        </w:rPr>
+        <w:t xml:space="preserve">CANCELADA</w:t>
+      </w:r>
+      <w:r>
+        <w:t xml:space="preserve"> o </w:t>
+      </w:r>
+      <w:r>
+        <w:rPr>
+          <w:rFonts w:ascii="Consolas" w:cs="Consolas" w:eastAsia="Consolas" w:hAnsi="Consolas"/>
+          <w:sz w:val="20"/>
+          <w:szCs w:val="20"/>
+          <w:shd w:fill="F0F0F0" w:color="auto" w:val="clear"/>
+        </w:rPr>
+        <w:t xml:space="preserve">VENCIDA</w:t>
+      </w:r>
+      <w:r>
+        <w:t xml:space="preserve"> y nada en la base recuerda que falta devolver. Lo aceptamos para esta entrega porque es el lado seguro (un lugar queda sin vender, ninguno se vende dos veces) y porque el log trae los datos para devolverlo a mano. Lo resolvería una marca de devolución pendiente en la venta, que se pone cuando la devolución falla y que el barrido revisa en cada corrida hasta que Eventos la acepte.</w:t>
+      </w:r>
+    </w:p>
+    <w:p>
+      <w:pPr>
+        <w:spacing w:after="60" w:before="0"/>
       </w:pPr>
     </w:p>
     <w:p>
@@ -14404,6 +15456,12 @@
     </w:lvlOverride>
   </w:num>
   <w:num w:numId="8">
+    <w:abstractNumId w:val="2"/>
+    <w:lvlOverride w:ilvl="0">
+      <w:startOverride w:val="1"/>
+    </w:lvlOverride>
+  </w:num>
+  <w:num w:numId="9">
     <w:abstractNumId w:val="2"/>
     <w:lvlOverride w:ilvl="0">
       <w:startOverride w:val="1"/>

</xml_diff>

<commit_message>
docs: evidencia de la Entrega Parcial N.º 2 tomada del tag
</commit_message>
<xml_diff>
--- a/docs/entrega3/Entrega_Parcial_2_Integracion.docx
+++ b/docs/entrega3/Entrega_Parcial_2_Integracion.docx
@@ -38,8 +38,8 @@
         <w:tblLayout w:type="fixed"/>
       </w:tblPr>
       <w:tblGrid>
-        <w:gridCol w:w="2069"/>
-        <w:gridCol w:w="7343"/>
+        <w:gridCol w:w="2297"/>
+        <w:gridCol w:w="7115"/>
       </w:tblGrid>
       <w:tr>
         <w:trPr>
@@ -47,7 +47,7 @@
         </w:trPr>
         <w:tc>
           <w:tcPr>
-            <w:tcW w:type="dxa" w:w="2069"/>
+            <w:tcW w:type="dxa" w:w="2297"/>
             <w:tcBorders>
               <w:top w:val="single" w:color="BFBFBF" w:sz="4"/>
               <w:left w:val="single" w:color="BFBFBF" w:sz="4"/>
@@ -78,7 +78,7 @@
         </w:tc>
         <w:tc>
           <w:tcPr>
-            <w:tcW w:type="dxa" w:w="7343"/>
+            <w:tcW w:type="dxa" w:w="7115"/>
             <w:tcBorders>
               <w:top w:val="single" w:color="BFBFBF" w:sz="4"/>
               <w:left w:val="single" w:color="BFBFBF" w:sz="4"/>
@@ -112,7 +112,7 @@
         </w:trPr>
         <w:tc>
           <w:tcPr>
-            <w:tcW w:type="dxa" w:w="2069"/>
+            <w:tcW w:type="dxa" w:w="2297"/>
             <w:tcBorders>
               <w:top w:val="single" w:color="BFBFBF" w:sz="4"/>
               <w:left w:val="single" w:color="BFBFBF" w:sz="4"/>
@@ -143,7 +143,7 @@
         </w:tc>
         <w:tc>
           <w:tcPr>
-            <w:tcW w:type="dxa" w:w="7343"/>
+            <w:tcW w:type="dxa" w:w="7115"/>
             <w:tcBorders>
               <w:top w:val="single" w:color="BFBFBF" w:sz="4"/>
               <w:left w:val="single" w:color="BFBFBF" w:sz="4"/>
@@ -177,7 +177,7 @@
         </w:trPr>
         <w:tc>
           <w:tcPr>
-            <w:tcW w:type="dxa" w:w="2069"/>
+            <w:tcW w:type="dxa" w:w="2297"/>
             <w:tcBorders>
               <w:top w:val="single" w:color="BFBFBF" w:sz="4"/>
               <w:left w:val="single" w:color="BFBFBF" w:sz="4"/>
@@ -208,7 +208,7 @@
         </w:tc>
         <w:tc>
           <w:tcPr>
-            <w:tcW w:type="dxa" w:w="7343"/>
+            <w:tcW w:type="dxa" w:w="7115"/>
             <w:tcBorders>
               <w:top w:val="single" w:color="BFBFBF" w:sz="4"/>
               <w:left w:val="single" w:color="BFBFBF" w:sz="4"/>
@@ -242,7 +242,7 @@
         </w:trPr>
         <w:tc>
           <w:tcPr>
-            <w:tcW w:type="dxa" w:w="2069"/>
+            <w:tcW w:type="dxa" w:w="2297"/>
             <w:tcBorders>
               <w:top w:val="single" w:color="BFBFBF" w:sz="4"/>
               <w:left w:val="single" w:color="BFBFBF" w:sz="4"/>
@@ -273,25 +273,25 @@
         </w:tc>
         <w:tc>
           <w:tcPr>
-            <w:tcW w:type="dxa" w:w="7343"/>
-            <w:tcBorders>
-              <w:top w:val="single" w:color="BFBFBF" w:sz="4"/>
-              <w:left w:val="single" w:color="BFBFBF" w:sz="4"/>
-              <w:bottom w:val="single" w:color="BFBFBF" w:sz="4"/>
-              <w:right w:val="single" w:color="BFBFBF" w:sz="4"/>
-            </w:tcBorders>
-            <w:tcMar>
-              <w:top w:type="dxa" w:w="50"/>
-              <w:left w:type="dxa" w:w="90"/>
-              <w:bottom w:type="dxa" w:w="50"/>
-              <w:right w:type="dxa" w:w="90"/>
-            </w:tcMar>
-          </w:tcPr>
-          <w:p>
-            <w:pPr>
-              <w:spacing w:after="0" w:before="0"/>
-            </w:pPr>
-            <w:hyperlink w:history="1" r:id="rIdmwudvunsqcaecbs06wspv">
+            <w:tcW w:type="dxa" w:w="7115"/>
+            <w:tcBorders>
+              <w:top w:val="single" w:color="BFBFBF" w:sz="4"/>
+              <w:left w:val="single" w:color="BFBFBF" w:sz="4"/>
+              <w:bottom w:val="single" w:color="BFBFBF" w:sz="4"/>
+              <w:right w:val="single" w:color="BFBFBF" w:sz="4"/>
+            </w:tcBorders>
+            <w:tcMar>
+              <w:top w:type="dxa" w:w="50"/>
+              <w:left w:type="dxa" w:w="90"/>
+              <w:bottom w:type="dxa" w:w="50"/>
+              <w:right w:type="dxa" w:w="90"/>
+            </w:tcMar>
+          </w:tcPr>
+          <w:p>
+            <w:pPr>
+              <w:spacing w:after="0" w:before="0"/>
+            </w:pPr>
+            <w:hyperlink w:history="1" r:id="rId6bk6zqsuopypp_rougd3a">
               <w:r>
                 <w:rPr>
                   <w:color w:val="0563C1"/>
@@ -311,7 +311,7 @@
         </w:trPr>
         <w:tc>
           <w:tcPr>
-            <w:tcW w:type="dxa" w:w="2069"/>
+            <w:tcW w:type="dxa" w:w="2297"/>
             <w:tcBorders>
               <w:top w:val="single" w:color="BFBFBF" w:sz="4"/>
               <w:left w:val="single" w:color="BFBFBF" w:sz="4"/>
@@ -342,7 +342,7 @@
         </w:tc>
         <w:tc>
           <w:tcPr>
-            <w:tcW w:type="dxa" w:w="7343"/>
+            <w:tcW w:type="dxa" w:w="7115"/>
             <w:tcBorders>
               <w:top w:val="single" w:color="BFBFBF" w:sz="4"/>
               <w:left w:val="single" w:color="BFBFBF" w:sz="4"/>
@@ -381,23 +381,16 @@
                 <w:sz w:val="18"/>
                 <w:szCs w:val="18"/>
               </w:rPr>
-              <w:t xml:space="preserve">. </w:t>
-            </w:r>
-            <w:r>
-              <w:rPr>
-                <w:b/>
-                <w:bCs/>
-                <w:sz w:val="18"/>
-                <w:szCs w:val="18"/>
-              </w:rPr>
-              <w:t xml:space="preserve">Pendiente:</w:t>
-            </w:r>
-            <w:r>
-              <w:rPr>
-                <w:sz w:val="18"/>
-                <w:szCs w:val="18"/>
-              </w:rPr>
-              <w:t xml:space="preserve"> el 13/10 esa etiqueta todavía no existe</w:t>
+              <w:t xml:space="preserve">, en el commit </w:t>
+            </w:r>
+            <w:r>
+              <w:rPr>
+                <w:rFonts w:ascii="Consolas" w:cs="Consolas" w:eastAsia="Consolas" w:hAnsi="Consolas"/>
+                <w:sz w:val="17"/>
+                <w:szCs w:val="17"/>
+                <w:shd w:fill="F0F0F0" w:color="auto" w:val="clear"/>
+              </w:rPr>
+              <w:t xml:space="preserve">580dd05</w:t>
             </w:r>
           </w:p>
         </w:tc>
@@ -408,7 +401,7 @@
         </w:trPr>
         <w:tc>
           <w:tcPr>
-            <w:tcW w:type="dxa" w:w="2069"/>
+            <w:tcW w:type="dxa" w:w="2297"/>
             <w:tcBorders>
               <w:top w:val="single" w:color="BFBFBF" w:sz="4"/>
               <w:left w:val="single" w:color="BFBFBF" w:sz="4"/>
@@ -439,62 +432,62 @@
         </w:tc>
         <w:tc>
           <w:tcPr>
-            <w:tcW w:type="dxa" w:w="7343"/>
-            <w:tcBorders>
-              <w:top w:val="single" w:color="BFBFBF" w:sz="4"/>
-              <w:left w:val="single" w:color="BFBFBF" w:sz="4"/>
-              <w:bottom w:val="single" w:color="BFBFBF" w:sz="4"/>
-              <w:right w:val="single" w:color="BFBFBF" w:sz="4"/>
-            </w:tcBorders>
-            <w:tcMar>
-              <w:top w:type="dxa" w:w="50"/>
-              <w:left w:type="dxa" w:w="90"/>
-              <w:bottom w:type="dxa" w:w="50"/>
-              <w:right w:type="dxa" w:w="90"/>
-            </w:tcMar>
-          </w:tcPr>
-          <w:p>
-            <w:pPr>
-              <w:spacing w:after="0" w:before="0"/>
-            </w:pPr>
-            <w:r>
-              <w:rPr>
-                <w:sz w:val="18"/>
-                <w:szCs w:val="18"/>
-              </w:rPr>
-              <w:t xml:space="preserve">El del servidor de desarrollo el 13/10/2026 entre las 15:45 y las 15:54. Se armó desde cero ese día a las 15:17 (</w:t>
-            </w:r>
-            <w:r>
-              <w:rPr>
-                <w:rFonts w:ascii="Consolas" w:cs="Consolas" w:eastAsia="Consolas" w:hAnsi="Consolas"/>
-                <w:sz w:val="17"/>
-                <w:szCs w:val="17"/>
-                <w:shd w:fill="F0F0F0" w:color="auto" w:val="clear"/>
-              </w:rPr>
-              <w:t xml:space="preserve">mvn clean install</w:t>
-            </w:r>
-            <w:r>
-              <w:rPr>
-                <w:sz w:val="18"/>
-                <w:szCs w:val="18"/>
-              </w:rPr>
-              <w:t xml:space="preserve">) con el código de trabajo: el commit </w:t>
-            </w:r>
-            <w:r>
-              <w:rPr>
-                <w:rFonts w:ascii="Consolas" w:cs="Consolas" w:eastAsia="Consolas" w:hAnsi="Consolas"/>
-                <w:sz w:val="17"/>
-                <w:szCs w:val="17"/>
-                <w:shd w:fill="F0F0F0" w:color="auto" w:val="clear"/>
-              </w:rPr>
-              <w:t xml:space="preserve">f267c3b</w:t>
-            </w:r>
-            <w:r>
-              <w:rPr>
-                <w:sz w:val="18"/>
-                <w:szCs w:val="18"/>
-              </w:rPr>
-              <w:t xml:space="preserve"> más cambios que en ese momento no tenían commit, entre ellos la verificación de identidad en Usuarios</w:t>
+            <w:tcW w:type="dxa" w:w="7115"/>
+            <w:tcBorders>
+              <w:top w:val="single" w:color="BFBFBF" w:sz="4"/>
+              <w:left w:val="single" w:color="BFBFBF" w:sz="4"/>
+              <w:bottom w:val="single" w:color="BFBFBF" w:sz="4"/>
+              <w:right w:val="single" w:color="BFBFBF" w:sz="4"/>
+            </w:tcBorders>
+            <w:tcMar>
+              <w:top w:type="dxa" w:w="50"/>
+              <w:left w:type="dxa" w:w="90"/>
+              <w:bottom w:type="dxa" w:w="50"/>
+              <w:right w:type="dxa" w:w="90"/>
+            </w:tcMar>
+          </w:tcPr>
+          <w:p>
+            <w:pPr>
+              <w:spacing w:after="0" w:before="0"/>
+            </w:pPr>
+            <w:r>
+              <w:rPr>
+                <w:sz w:val="18"/>
+                <w:szCs w:val="18"/>
+              </w:rPr>
+              <w:t xml:space="preserve">El del servidor de desarrollo el 14/10/2026 entre las 17:56 y las 18:00. Se armó desde cero ese día desde el commit </w:t>
+            </w:r>
+            <w:r>
+              <w:rPr>
+                <w:rFonts w:ascii="Consolas" w:cs="Consolas" w:eastAsia="Consolas" w:hAnsi="Consolas"/>
+                <w:sz w:val="17"/>
+                <w:szCs w:val="17"/>
+                <w:shd w:fill="F0F0F0" w:color="auto" w:val="clear"/>
+              </w:rPr>
+              <w:t xml:space="preserve">580dd05</w:t>
+            </w:r>
+            <w:r>
+              <w:rPr>
+                <w:sz w:val="18"/>
+                <w:szCs w:val="18"/>
+              </w:rPr>
+              <w:t xml:space="preserve">, el del tag </w:t>
+            </w:r>
+            <w:r>
+              <w:rPr>
+                <w:rFonts w:ascii="Consolas" w:cs="Consolas" w:eastAsia="Consolas" w:hAnsi="Consolas"/>
+                <w:sz w:val="17"/>
+                <w:szCs w:val="17"/>
+                <w:shd w:fill="F0F0F0" w:color="auto" w:val="clear"/>
+              </w:rPr>
+              <w:t xml:space="preserve">entrega-​parcial-​2</w:t>
+            </w:r>
+            <w:r>
+              <w:rPr>
+                <w:sz w:val="18"/>
+                <w:szCs w:val="18"/>
+              </w:rPr>
+              <w:t xml:space="preserve">, y a las 17:55 estaba en marcha con los 8 WAR desplegados</w:t>
             </w:r>
           </w:p>
         </w:tc>
@@ -538,7 +531,7 @@
         <w:t xml:space="preserve">Implementado:</w:t>
       </w:r>
       <w:r>
-        <w:t xml:space="preserve"> hay código que lo hace y lo comprobamos el 13/10/2026 contra el servidor en marcha. La afirmación cita el archivo de </w:t>
+        <w:t xml:space="preserve"> hay código que lo hace y lo comprobamos el 14/10/2026 contra el servidor en marcha. La afirmación cita el archivo de </w:t>
       </w:r>
       <w:r>
         <w:rPr>
@@ -574,7 +567,19 @@
         <w:t xml:space="preserve">scripts/pruebas/escenarios.mjs</w:t>
       </w:r>
       <w:r>
-        <w:t xml:space="preserve">, pero la salida guardada es de una versión anterior, que todavía incluía la verificación de identidad que Usuarios ya no pide: donde se la cita, se dice.</w:t>
+        <w:t xml:space="preserve">, que está en el repositorio y se repite con </w:t>
+      </w:r>
+      <w:r>
+        <w:rPr>
+          <w:rFonts w:ascii="Consolas" w:cs="Consolas" w:eastAsia="Consolas" w:hAnsi="Consolas"/>
+          <w:sz w:val="20"/>
+          <w:szCs w:val="20"/>
+          <w:shd w:fill="F0F0F0" w:color="auto" w:val="clear"/>
+        </w:rPr>
+        <w:t xml:space="preserve">node scripts/pruebas/escenarios.mjs</w:t>
+      </w:r>
+      <w:r>
+        <w:t xml:space="preserve">.</w:t>
       </w:r>
     </w:p>
     <w:p>
@@ -1246,7 +1251,7 @@
         <w:spacing w:after="120" w:before="0"/>
       </w:pPr>
       <w:r>
-        <w:t xml:space="preserve">El backend son ocho servicios sobre Jakarta EE. Cada uno es un archivo desplegable propio (WAR) dentro del mismo servidor de aplicaciones, WildFly 41. Los cinco implementados exponen una interfaz de negocio y una API REST; los otros tres solo tienen su control de estado. El 13/10 los ocho responden ese control: </w:t>
+        <w:t xml:space="preserve">El backend son ocho servicios sobre Jakarta EE. Cada uno es un archivo desplegable propio (WAR) dentro del mismo servidor de aplicaciones, WildFly 41. Los cinco implementados exponen una interfaz de negocio y una API REST; los otros tres solo tienen su control de estado. El 14/10 los ocho responden ese control: </w:t>
       </w:r>
       <w:r>
         <w:rPr>
@@ -3133,7 +3138,7 @@
         <w:spacing w:after="120" w:before="0"/>
       </w:pPr>
       <w:r>
-        <w:t xml:space="preserve">Comprobado el 13/10 (</w:t>
+        <w:t xml:space="preserve">Comprobado el 14/10 (</w:t>
       </w:r>
       <w:r>
         <w:rPr>
@@ -5396,7 +5401,7 @@
                 <w:sz w:val="18"/>
                 <w:szCs w:val="18"/>
               </w:rPr>
-              <w:t xml:space="preserve">, pasos 1 a 4, muestra una compra que pasa por esa consulta. El escenario 5 de </w:t>
+              <w:t xml:space="preserve">, pasos 1 a 4, muestra una compra que pasa por esa consulta. En el escenario 5 de </w:t>
             </w:r>
             <w:r>
               <w:rPr>
@@ -5412,23 +5417,23 @@
                 <w:sz w:val="18"/>
                 <w:szCs w:val="18"/>
               </w:rPr>
-              <w:t xml:space="preserve"> muestra un rechazo 403 </w:t>
-            </w:r>
-            <w:r>
-              <w:rPr>
-                <w:rFonts w:ascii="Consolas" w:cs="Consolas" w:eastAsia="Consolas" w:hAnsi="Consolas"/>
-                <w:sz w:val="17"/>
-                <w:szCs w:val="17"/>
-                <w:shd w:fill="F0F0F0" w:color="auto" w:val="clear"/>
-              </w:rPr>
-              <w:t xml:space="preserve">identidad-​no-​verificada</w:t>
-            </w:r>
-            <w:r>
-              <w:rPr>
-                <w:sz w:val="18"/>
-                <w:szCs w:val="18"/>
-              </w:rPr>
-              <w:t xml:space="preserve"> que ya no existe: esa salida es de una versión anterior de Usuarios</w:t>
+              <w:t xml:space="preserve">, una cuenta recién registrada consulta </w:t>
+            </w:r>
+            <w:r>
+              <w:rPr>
+                <w:rFonts w:ascii="Consolas" w:cs="Consolas" w:eastAsia="Consolas" w:hAnsi="Consolas"/>
+                <w:sz w:val="17"/>
+                <w:szCs w:val="17"/>
+                <w:shd w:fill="F0F0F0" w:color="auto" w:val="clear"/>
+              </w:rPr>
+              <w:t xml:space="preserve">GET /​api/​usuarios/​yo</w:t>
+            </w:r>
+            <w:r>
+              <w:rPr>
+                <w:sz w:val="18"/>
+                <w:szCs w:val="18"/>
+              </w:rPr>
+              <w:t xml:space="preserve"> con su token y abre una compra sin ningún paso más</w:t>
             </w:r>
           </w:p>
         </w:tc>
@@ -5615,7 +5620,7 @@
                 <w:sz w:val="18"/>
                 <w:szCs w:val="18"/>
               </w:rPr>
-              <w:t xml:space="preserve"> dice "Pago P-6d48cf81 de la venta V-3c150ebb: APROBADO (pasarela fake)" y Ventas confirma la compra con ese pago. La llamada la hace </w:t>
+              <w:t xml:space="preserve"> dice "Pago P-cb9578d8 de la venta V-e022b63c: APROBADO (pasarela fake)" y Ventas confirma la compra con ese pago. La llamada la hace </w:t>
             </w:r>
             <w:r>
               <w:rPr>
@@ -7813,10 +7818,10 @@
           <w:szCs w:val="20"/>
           <w:shd w:fill="F0F0F0" w:color="auto" w:val="clear"/>
         </w:rPr>
-        <w:t xml:space="preserve">V-3c150ebb</w:t>
-      </w:r>
-      <w:r>
-        <w:t xml:space="preserve">, del 13/10/2026 (</w:t>
+        <w:t xml:space="preserve">V-e022b63c</w:t>
+      </w:r>
+      <w:r>
+        <w:t xml:space="preserve">, del 14/10/2026 (</w:t>
       </w:r>
       <w:r>
         <w:rPr>
@@ -7845,7 +7850,7 @@
           <w:b/>
           <w:bCs/>
         </w:rPr>
-        <w:t xml:space="preserve">15:46:20,548.</w:t>
+        <w:t xml:space="preserve">17:57:05,415.</w:t>
       </w:r>
       <w:r>
         <w:t xml:space="preserve"> El comprador abre la compra con </w:t>
@@ -7889,7 +7894,7 @@
           <w:b/>
           <w:bCs/>
         </w:rPr>
-        <w:t xml:space="preserve">15:46:21,519.</w:t>
+        <w:t xml:space="preserve">17:57:06,093.</w:t>
       </w:r>
       <w:r>
         <w:t xml:space="preserve"> El comprador paga con </w:t>
@@ -7901,7 +7906,7 @@
           <w:szCs w:val="20"/>
           <w:shd w:fill="F0F0F0" w:color="auto" w:val="clear"/>
         </w:rPr>
-        <w:t xml:space="preserve">POST /api/v1/ventas/V-3c150ebb/pagos</w:t>
+        <w:t xml:space="preserve">POST /api/v1/ventas/V-e022b63c/pagos</w:t>
       </w:r>
       <w:r>
         <w:t xml:space="preserve">. Ventas llama a </w:t>
@@ -7925,7 +7930,7 @@
           <w:szCs w:val="20"/>
           <w:shd w:fill="F0F0F0" w:color="auto" w:val="clear"/>
         </w:rPr>
-        <w:t xml:space="preserve">P-6d48cf81</w:t>
+        <w:t xml:space="preserve">P-cb9578d8</w:t>
       </w:r>
       <w:r>
         <w:t xml:space="preserve">.</w:t>
@@ -7945,7 +7950,7 @@
           <w:b/>
           <w:bCs/>
         </w:rPr>
-        <w:t xml:space="preserve">15:46:21,559.</w:t>
+        <w:t xml:space="preserve">17:57:06,107.</w:t>
       </w:r>
       <w:r>
         <w:t xml:space="preserve"> Ventas pasa la venta a </w:t>
@@ -7984,7 +7989,7 @@
         <w:t xml:space="preserve">PAGO_CONFIRMADO</w:t>
       </w:r>
       <w:r>
-        <w:t xml:space="preserve">. El log dice: "Compra V-3c150ebb confirmada con el pago P-6d48cf81. Entradas creadas: 2. PAGO_CONFIRMADO publicado en la misma transacción". Responde 201 al comprador con las entradas todavía sin emitir.</w:t>
+        <w:t xml:space="preserve">. El log dice: "Compra V-e022b63c confirmada con el pago P-cb9578d8. Entradas creadas: 2. PAGO_CONFIRMADO publicado en la misma transacción". Responde 201 al comprador con las entradas todavía sin emitir.</w:t>
       </w:r>
     </w:p>
     <w:p>
@@ -8001,10 +8006,22 @@
           <w:b/>
           <w:bCs/>
         </w:rPr>
-        <w:t xml:space="preserve">15:46:21,594 y 15:46:21,607.</w:t>
+        <w:t xml:space="preserve">17:57:06,246 y 17:57:06,253.</w:t>
       </w:r>
       <w:r>
         <w:t xml:space="preserve"> </w:t>
+      </w:r>
+      <w:r>
+        <w:rPr>
+          <w:rFonts w:ascii="Consolas" w:cs="Consolas" w:eastAsia="Consolas" w:hAnsi="Consolas"/>
+          <w:sz w:val="20"/>
+          <w:szCs w:val="20"/>
+          <w:shd w:fill="F0F0F0" w:color="auto" w:val="clear"/>
+        </w:rPr>
+        <w:t xml:space="preserve">AuditoriaDeComprasMDB</w:t>
+      </w:r>
+      <w:r>
+        <w:t xml:space="preserve"> y </w:t>
       </w:r>
       <w:r>
         <w:rPr>
@@ -8016,19 +8033,7 @@
         <w:t xml:space="preserve">AvisoDeCompraMDB</w:t>
       </w:r>
       <w:r>
-        <w:t xml:space="preserve"> y </w:t>
-      </w:r>
-      <w:r>
-        <w:rPr>
-          <w:rFonts w:ascii="Consolas" w:cs="Consolas" w:eastAsia="Consolas" w:hAnsi="Consolas"/>
-          <w:sz w:val="20"/>
-          <w:szCs w:val="20"/>
-          <w:shd w:fill="F0F0F0" w:color="auto" w:val="clear"/>
-        </w:rPr>
-        <w:t xml:space="preserve">AuditoriaDeComprasMDB</w:t>
-      </w:r>
-      <w:r>
-        <w:t xml:space="preserve"> procesan su copia del tópico. El aviso se escribe en el log del servidor y no se envía, aunque la línea guardada en la evidencia dice "aviso enviado".</w:t>
+        <w:t xml:space="preserve"> procesan su copia del tópico. El aviso se escribe en el log del servidor y no se envía: su línea dice "registrado en el log; no se envía: no hay proveedor de correo".</w:t>
       </w:r>
     </w:p>
     <w:p>
@@ -8045,7 +8050,7 @@
           <w:b/>
           <w:bCs/>
         </w:rPr>
-        <w:t xml:space="preserve">15:46:21,624.</w:t>
+        <w:t xml:space="preserve">17:57:06,265.</w:t>
       </w:r>
       <w:r>
         <w:t xml:space="preserve"> </w:t>
@@ -8060,7 +8065,7 @@
         <w:t xml:space="preserve">EmisionDeEntradasMDB</w:t>
       </w:r>
       <w:r>
-        <w:t xml:space="preserve"> procesa el mensaje de la cola: "Entradas emitidas: 2. La venta pasó a EMITIDA". Son 65 milisegundos después de la confirmación.</w:t>
+        <w:t xml:space="preserve"> procesa el mensaje de la cola: "Entradas emitidas: 2. La venta pasó a EMITIDA". Son 158 milisegundos después de la confirmación.</w:t>
       </w:r>
     </w:p>
     <w:p>
@@ -8082,7 +8087,7 @@
           <w:szCs w:val="20"/>
           <w:shd w:fill="F0F0F0" w:color="auto" w:val="clear"/>
         </w:rPr>
-        <w:t xml:space="preserve">GET /api/v1/ventas/V-3c150ebb</w:t>
+        <w:t xml:space="preserve">GET /api/v1/ventas/V-e022b63c</w:t>
       </w:r>
       <w:r>
         <w:t xml:space="preserve"> devuelve </w:t>
@@ -8106,7 +8111,7 @@
           <w:szCs w:val="20"/>
           <w:shd w:fill="F0F0F0" w:color="auto" w:val="clear"/>
         </w:rPr>
-        <w:t xml:space="preserve">GET /api/v1/entradas/T-364f302b</w:t>
+        <w:t xml:space="preserve">GET /api/v1/entradas/T-58f48393</w:t>
       </w:r>
       <w:r>
         <w:t xml:space="preserve"> devuelve </w:t>
@@ -8191,7 +8196,7 @@
         <w:t xml:space="preserve">Thread-0</w:t>
       </w:r>
       <w:r>
-        <w:t xml:space="preserve"> y </w:t>
+        <w:t xml:space="preserve">, </w:t>
       </w:r>
       <w:r>
         <w:rPr>
@@ -8200,7 +8205,19 @@
           <w:szCs w:val="20"/>
           <w:shd w:fill="F0F0F0" w:color="auto" w:val="clear"/>
         </w:rPr>
-        <w:t xml:space="preserve">Thread-1 (activemq-client-global)</w:t>
+        <w:t xml:space="preserve">Thread-1</w:t>
+      </w:r>
+      <w:r>
+        <w:t xml:space="preserve"> y </w:t>
+      </w:r>
+      <w:r>
+        <w:rPr>
+          <w:rFonts w:ascii="Consolas" w:cs="Consolas" w:eastAsia="Consolas" w:hAnsi="Consolas"/>
+          <w:sz w:val="20"/>
+          <w:szCs w:val="20"/>
+          <w:shd w:fill="F0F0F0" w:color="auto" w:val="clear"/>
+        </w:rPr>
+        <w:t xml:space="preserve">Thread-2 (activemq-client-global)</w:t>
       </w:r>
       <w:r>
         <w:t xml:space="preserve">). El cobro corre en otro hilo de pedidos HTTP (</w:t>
@@ -8288,7 +8305,7 @@
           <w:szCs w:val="20"/>
           <w:shd w:fill="F0F0F0" w:color="auto" w:val="clear"/>
         </w:rPr>
-        <w:t xml:space="preserve">ID:623e08e5-c736-11f1-9d59-0a0027000009</w:t>
+        <w:t xml:space="preserve">ID:d05ed137-c811-11f1-b9dc-0a0027000009</w:t>
       </w:r>
       <w:r>
         <w:t xml:space="preserve">).</w:t>
@@ -8304,7 +8321,7 @@
         <w:spacing w:after="120" w:before="0"/>
       </w:pPr>
       <w:r>
-        <w:t xml:space="preserve">Un minuto antes, la primera compra del servidor recién reiniciado muestra el mismo recorrido, paso por paso y con el comando de cada uno: venta </w:t>
+        <w:t xml:space="preserve">Unos segundos antes, la primera compra del servidor recién armado muestra el mismo recorrido, paso por paso y con el comando de cada uno: venta </w:t>
       </w:r>
       <w:r>
         <w:rPr>
@@ -8313,7 +8330,7 @@
           <w:szCs w:val="20"/>
           <w:shd w:fill="F0F0F0" w:color="auto" w:val="clear"/>
         </w:rPr>
-        <w:t xml:space="preserve">V-91934f4a</w:t>
+        <w:t xml:space="preserve">V-25d98b55</w:t>
       </w:r>
       <w:r>
         <w:t xml:space="preserve">, pago </w:t>
@@ -8325,7 +8342,7 @@
           <w:szCs w:val="20"/>
           <w:shd w:fill="F0F0F0" w:color="auto" w:val="clear"/>
         </w:rPr>
-        <w:t xml:space="preserve">P-8c25143c</w:t>
+        <w:t xml:space="preserve">P-dbe21ef4</w:t>
       </w:r>
       <w:r>
         <w:t xml:space="preserve"> y entradas </w:t>
@@ -8337,7 +8354,7 @@
           <w:szCs w:val="20"/>
           <w:shd w:fill="F0F0F0" w:color="auto" w:val="clear"/>
         </w:rPr>
-        <w:t xml:space="preserve">T-3b438461</w:t>
+        <w:t xml:space="preserve">T-126c2e33</w:t>
       </w:r>
       <w:r>
         <w:t xml:space="preserve"> y </w:t>
@@ -8349,7 +8366,7 @@
           <w:szCs w:val="20"/>
           <w:shd w:fill="F0F0F0" w:color="auto" w:val="clear"/>
         </w:rPr>
-        <w:t xml:space="preserve">T-50e62a72</w:t>
+        <w:t xml:space="preserve">T-72d36133</w:t>
       </w:r>
       <w:r>
         <w:t xml:space="preserve"> (</w:t>
@@ -8589,9 +8606,9 @@
         <w:tblLayout w:type="fixed"/>
       </w:tblPr>
       <w:tblGrid>
-        <w:gridCol w:w="1434"/>
-        <w:gridCol w:w="3826"/>
-        <w:gridCol w:w="4152"/>
+        <w:gridCol w:w="1415"/>
+        <w:gridCol w:w="3777"/>
+        <w:gridCol w:w="4220"/>
       </w:tblGrid>
       <w:tr>
         <w:trPr>
@@ -8600,7 +8617,7 @@
         </w:trPr>
         <w:tc>
           <w:tcPr>
-            <w:tcW w:type="dxa" w:w="1434"/>
+            <w:tcW w:type="dxa" w:w="1415"/>
             <w:tcBorders>
               <w:top w:val="single" w:color="BFBFBF" w:sz="4"/>
               <w:left w:val="single" w:color="BFBFBF" w:sz="4"/>
@@ -8632,7 +8649,7 @@
         </w:tc>
         <w:tc>
           <w:tcPr>
-            <w:tcW w:type="dxa" w:w="3826"/>
+            <w:tcW w:type="dxa" w:w="3777"/>
             <w:tcBorders>
               <w:top w:val="single" w:color="BFBFBF" w:sz="4"/>
               <w:left w:val="single" w:color="BFBFBF" w:sz="4"/>
@@ -8664,7 +8681,7 @@
         </w:tc>
         <w:tc>
           <w:tcPr>
-            <w:tcW w:type="dxa" w:w="4152"/>
+            <w:tcW w:type="dxa" w:w="4220"/>
             <w:tcBorders>
               <w:top w:val="single" w:color="BFBFBF" w:sz="4"/>
               <w:left w:val="single" w:color="BFBFBF" w:sz="4"/>
@@ -8701,7 +8718,7 @@
         </w:trPr>
         <w:tc>
           <w:tcPr>
-            <w:tcW w:type="dxa" w:w="1434"/>
+            <w:tcW w:type="dxa" w:w="1415"/>
             <w:tcBorders>
               <w:top w:val="single" w:color="BFBFBF" w:sz="4"/>
               <w:left w:val="single" w:color="BFBFBF" w:sz="4"/>
@@ -8730,7 +8747,7 @@
         </w:tc>
         <w:tc>
           <w:tcPr>
-            <w:tcW w:type="dxa" w:w="3826"/>
+            <w:tcW w:type="dxa" w:w="3777"/>
             <w:tcBorders>
               <w:top w:val="single" w:color="BFBFBF" w:sz="4"/>
               <w:left w:val="single" w:color="BFBFBF" w:sz="4"/>
@@ -8759,7 +8776,7 @@
         </w:tc>
         <w:tc>
           <w:tcPr>
-            <w:tcW w:type="dxa" w:w="4152"/>
+            <w:tcW w:type="dxa" w:w="4220"/>
             <w:tcBorders>
               <w:top w:val="single" w:color="BFBFBF" w:sz="4"/>
               <w:left w:val="single" w:color="BFBFBF" w:sz="4"/>
@@ -8834,7 +8851,7 @@
         </w:trPr>
         <w:tc>
           <w:tcPr>
-            <w:tcW w:type="dxa" w:w="1434"/>
+            <w:tcW w:type="dxa" w:w="1415"/>
             <w:tcBorders>
               <w:top w:val="single" w:color="BFBFBF" w:sz="4"/>
               <w:left w:val="single" w:color="BFBFBF" w:sz="4"/>
@@ -8863,7 +8880,7 @@
         </w:tc>
         <w:tc>
           <w:tcPr>
-            <w:tcW w:type="dxa" w:w="3826"/>
+            <w:tcW w:type="dxa" w:w="3777"/>
             <w:tcBorders>
               <w:top w:val="single" w:color="BFBFBF" w:sz="4"/>
               <w:left w:val="single" w:color="BFBFBF" w:sz="4"/>
@@ -8892,7 +8909,7 @@
         </w:tc>
         <w:tc>
           <w:tcPr>
-            <w:tcW w:type="dxa" w:w="4152"/>
+            <w:tcW w:type="dxa" w:w="4220"/>
             <w:tcBorders>
               <w:top w:val="single" w:color="BFBFBF" w:sz="4"/>
               <w:left w:val="single" w:color="BFBFBF" w:sz="4"/>
@@ -8924,7 +8941,7 @@
                 <w:sz w:val="18"/>
                 <w:szCs w:val="18"/>
               </w:rPr>
-              <w:t xml:space="preserve">. Había 64 mensajes pendientes y ningún consumidor; al desplegarlo quedaron 0, con 39 ventas emitidas y 25 mensajes de prueba descartados. Con el servidor de la tarde, el escenario 10 de </w:t>
+              <w:t xml:space="preserve">. Había 64 mensajes pendientes y ningún consumidor; al desplegarlo quedaron 0, con 39 ventas emitidas y 25 mensajes de prueba descartados. Con el servidor del 14/10, el escenario 10 de </w:t>
             </w:r>
             <w:r>
               <w:rPr>
@@ -8960,7 +8977,7 @@
         </w:trPr>
         <w:tc>
           <w:tcPr>
-            <w:tcW w:type="dxa" w:w="1434"/>
+            <w:tcW w:type="dxa" w:w="1415"/>
             <w:tcBorders>
               <w:top w:val="single" w:color="BFBFBF" w:sz="4"/>
               <w:left w:val="single" w:color="BFBFBF" w:sz="4"/>
@@ -8989,7 +9006,7 @@
         </w:tc>
         <w:tc>
           <w:tcPr>
-            <w:tcW w:type="dxa" w:w="3826"/>
+            <w:tcW w:type="dxa" w:w="3777"/>
             <w:tcBorders>
               <w:top w:val="single" w:color="BFBFBF" w:sz="4"/>
               <w:left w:val="single" w:color="BFBFBF" w:sz="4"/>
@@ -9050,7 +9067,7 @@
         </w:tc>
         <w:tc>
           <w:tcPr>
-            <w:tcW w:type="dxa" w:w="4152"/>
+            <w:tcW w:type="dxa" w:w="4220"/>
             <w:tcBorders>
               <w:top w:val="single" w:color="BFBFBF" w:sz="4"/>
               <w:left w:val="single" w:color="BFBFBF" w:sz="4"/>
@@ -9157,7 +9174,7 @@
         </w:trPr>
         <w:tc>
           <w:tcPr>
-            <w:tcW w:type="dxa" w:w="1434"/>
+            <w:tcW w:type="dxa" w:w="1415"/>
             <w:tcBorders>
               <w:top w:val="single" w:color="BFBFBF" w:sz="4"/>
               <w:left w:val="single" w:color="BFBFBF" w:sz="4"/>
@@ -9186,7 +9203,7 @@
         </w:tc>
         <w:tc>
           <w:tcPr>
-            <w:tcW w:type="dxa" w:w="3826"/>
+            <w:tcW w:type="dxa" w:w="3777"/>
             <w:tcBorders>
               <w:top w:val="single" w:color="BFBFBF" w:sz="4"/>
               <w:left w:val="single" w:color="BFBFBF" w:sz="4"/>
@@ -9327,7 +9344,7 @@
         </w:tc>
         <w:tc>
           <w:tcPr>
-            <w:tcW w:type="dxa" w:w="4152"/>
+            <w:tcW w:type="dxa" w:w="4220"/>
             <w:tcBorders>
               <w:top w:val="single" w:color="BFBFBF" w:sz="4"/>
               <w:left w:val="single" w:color="BFBFBF" w:sz="4"/>
@@ -9434,7 +9451,7 @@
         </w:trPr>
         <w:tc>
           <w:tcPr>
-            <w:tcW w:type="dxa" w:w="1434"/>
+            <w:tcW w:type="dxa" w:w="1415"/>
             <w:tcBorders>
               <w:top w:val="single" w:color="BFBFBF" w:sz="4"/>
               <w:left w:val="single" w:color="BFBFBF" w:sz="4"/>
@@ -9472,7 +9489,7 @@
         </w:tc>
         <w:tc>
           <w:tcPr>
-            <w:tcW w:type="dxa" w:w="3826"/>
+            <w:tcW w:type="dxa" w:w="3777"/>
             <w:tcBorders>
               <w:top w:val="single" w:color="BFBFBF" w:sz="4"/>
               <w:left w:val="single" w:color="BFBFBF" w:sz="4"/>
@@ -9517,7 +9534,7 @@
         </w:tc>
         <w:tc>
           <w:tcPr>
-            <w:tcW w:type="dxa" w:w="4152"/>
+            <w:tcW w:type="dxa" w:w="4220"/>
             <w:tcBorders>
               <w:top w:val="single" w:color="BFBFBF" w:sz="4"/>
               <w:left w:val="single" w:color="BFBFBF" w:sz="4"/>
@@ -9551,7 +9568,7 @@
         </w:trPr>
         <w:tc>
           <w:tcPr>
-            <w:tcW w:type="dxa" w:w="1434"/>
+            <w:tcW w:type="dxa" w:w="1415"/>
             <w:tcBorders>
               <w:top w:val="single" w:color="BFBFBF" w:sz="4"/>
               <w:left w:val="single" w:color="BFBFBF" w:sz="4"/>
@@ -9580,7 +9597,7 @@
         </w:tc>
         <w:tc>
           <w:tcPr>
-            <w:tcW w:type="dxa" w:w="3826"/>
+            <w:tcW w:type="dxa" w:w="3777"/>
             <w:tcBorders>
               <w:top w:val="single" w:color="BFBFBF" w:sz="4"/>
               <w:left w:val="single" w:color="BFBFBF" w:sz="4"/>
@@ -9618,7 +9635,7 @@
         </w:tc>
         <w:tc>
           <w:tcPr>
-            <w:tcW w:type="dxa" w:w="4152"/>
+            <w:tcW w:type="dxa" w:w="4220"/>
             <w:tcBorders>
               <w:top w:val="single" w:color="BFBFBF" w:sz="4"/>
               <w:left w:val="single" w:color="BFBFBF" w:sz="4"/>
@@ -9654,7 +9671,7 @@
         </w:trPr>
         <w:tc>
           <w:tcPr>
-            <w:tcW w:type="dxa" w:w="1434"/>
+            <w:tcW w:type="dxa" w:w="1415"/>
             <w:tcBorders>
               <w:top w:val="single" w:color="BFBFBF" w:sz="4"/>
               <w:left w:val="single" w:color="BFBFBF" w:sz="4"/>
@@ -9683,7 +9700,7 @@
         </w:tc>
         <w:tc>
           <w:tcPr>
-            <w:tcW w:type="dxa" w:w="3826"/>
+            <w:tcW w:type="dxa" w:w="3777"/>
             <w:tcBorders>
               <w:top w:val="single" w:color="BFBFBF" w:sz="4"/>
               <w:left w:val="single" w:color="BFBFBF" w:sz="4"/>
@@ -9712,7 +9729,7 @@
         </w:tc>
         <w:tc>
           <w:tcPr>
-            <w:tcW w:type="dxa" w:w="4152"/>
+            <w:tcW w:type="dxa" w:w="4220"/>
             <w:tcBorders>
               <w:top w:val="single" w:color="BFBFBF" w:sz="4"/>
               <w:left w:val="single" w:color="BFBFBF" w:sz="4"/>
@@ -9785,14 +9802,30 @@
                 <w:szCs w:val="17"/>
                 <w:shd w:fill="F0F0F0" w:color="auto" w:val="clear"/>
               </w:rPr>
-              <w:t xml:space="preserve">V-​95a3a988</w:t>
-            </w:r>
-            <w:r>
-              <w:rPr>
-                <w:sz w:val="18"/>
-                <w:szCs w:val="18"/>
-              </w:rPr>
-              <w:t xml:space="preserve">) y un mensaje de prueba: la suscripción durable guardó 2 mensajes pendientes y no hubo filas de auditoría, mientras el aviso recibió sus dos copias y las escribió en el log del servidor (la línea dice "aviso enviado", pero no se envía nada) y la venta quedó </w:t>
+              <w:t xml:space="preserve">V-​2f682d6d</w:t>
+            </w:r>
+            <w:r>
+              <w:rPr>
+                <w:sz w:val="18"/>
+                <w:szCs w:val="18"/>
+              </w:rPr>
+              <w:t xml:space="preserve">) y un mensaje de prueba (</w:t>
+            </w:r>
+            <w:r>
+              <w:rPr>
+                <w:rFonts w:ascii="Consolas" w:cs="Consolas" w:eastAsia="Consolas" w:hAnsi="Consolas"/>
+                <w:sz w:val="17"/>
+                <w:szCs w:val="17"/>
+                <w:shd w:fill="F0F0F0" w:color="auto" w:val="clear"/>
+              </w:rPr>
+              <w:t xml:space="preserve">prueba-​377393d9</w:t>
+            </w:r>
+            <w:r>
+              <w:rPr>
+                <w:sz w:val="18"/>
+                <w:szCs w:val="18"/>
+              </w:rPr>
+              <w:t xml:space="preserve">): la suscripción durable guardó 2 mensajes pendientes y no hubo filas de auditoría, mientras el aviso recibió sus dos copias y las escribió en el log del servidor (la línea dice que el aviso quedó registrado en el log y no se envía) y la venta quedó </w:t>
             </w:r>
             <w:r>
               <w:rPr>
@@ -9835,7 +9868,7 @@
         </w:trPr>
         <w:tc>
           <w:tcPr>
-            <w:tcW w:type="dxa" w:w="1434"/>
+            <w:tcW w:type="dxa" w:w="1415"/>
             <w:tcBorders>
               <w:top w:val="single" w:color="BFBFBF" w:sz="4"/>
               <w:left w:val="single" w:color="BFBFBF" w:sz="4"/>
@@ -9864,7 +9897,7 @@
         </w:tc>
         <w:tc>
           <w:tcPr>
-            <w:tcW w:type="dxa" w:w="3826"/>
+            <w:tcW w:type="dxa" w:w="3777"/>
             <w:tcBorders>
               <w:top w:val="single" w:color="BFBFBF" w:sz="4"/>
               <w:left w:val="single" w:color="BFBFBF" w:sz="4"/>
@@ -9925,7 +9958,7 @@
         </w:tc>
         <w:tc>
           <w:tcPr>
-            <w:tcW w:type="dxa" w:w="4152"/>
+            <w:tcW w:type="dxa" w:w="4220"/>
             <w:tcBorders>
               <w:top w:val="single" w:color="BFBFBF" w:sz="4"/>
               <w:left w:val="single" w:color="BFBFBF" w:sz="4"/>
@@ -10072,7 +10105,7 @@
         <w:t xml:space="preserve">node</w:t>
       </w:r>
       <w:r>
-        <w:t xml:space="preserve"> y un JDK. No detiene servicios ni vacía colas. Su salida del 13/10 a las 15:46 está en </w:t>
+        <w:t xml:space="preserve"> y un JDK. No detiene servicios ni vacía colas. Su salida del 14/10 a las 17:56 está en </w:t>
       </w:r>
       <w:r>
         <w:rPr>
@@ -10163,9 +10196,9 @@
         <w:tblLayout w:type="fixed"/>
       </w:tblPr>
       <w:tblGrid>
-        <w:gridCol w:w="2548"/>
-        <w:gridCol w:w="3659"/>
-        <w:gridCol w:w="3205"/>
+        <w:gridCol w:w="2746"/>
+        <w:gridCol w:w="3944"/>
+        <w:gridCol w:w="2722"/>
       </w:tblGrid>
       <w:tr>
         <w:trPr>
@@ -10174,7 +10207,7 @@
         </w:trPr>
         <w:tc>
           <w:tcPr>
-            <w:tcW w:type="dxa" w:w="2548"/>
+            <w:tcW w:type="dxa" w:w="2746"/>
             <w:tcBorders>
               <w:top w:val="single" w:color="BFBFBF" w:sz="4"/>
               <w:left w:val="single" w:color="BFBFBF" w:sz="4"/>
@@ -10206,7 +10239,7 @@
         </w:tc>
         <w:tc>
           <w:tcPr>
-            <w:tcW w:type="dxa" w:w="3659"/>
+            <w:tcW w:type="dxa" w:w="3944"/>
             <w:tcBorders>
               <w:top w:val="single" w:color="BFBFBF" w:sz="4"/>
               <w:left w:val="single" w:color="BFBFBF" w:sz="4"/>
@@ -10238,7 +10271,7 @@
         </w:tc>
         <w:tc>
           <w:tcPr>
-            <w:tcW w:type="dxa" w:w="3205"/>
+            <w:tcW w:type="dxa" w:w="2722"/>
             <w:tcBorders>
               <w:top w:val="single" w:color="BFBFBF" w:sz="4"/>
               <w:left w:val="single" w:color="BFBFBF" w:sz="4"/>
@@ -10275,7 +10308,7 @@
         </w:trPr>
         <w:tc>
           <w:tcPr>
-            <w:tcW w:type="dxa" w:w="2548"/>
+            <w:tcW w:type="dxa" w:w="2746"/>
             <w:tcBorders>
               <w:top w:val="single" w:color="BFBFBF" w:sz="4"/>
               <w:left w:val="single" w:color="BFBFBF" w:sz="4"/>
@@ -10322,7 +10355,7 @@
         </w:tc>
         <w:tc>
           <w:tcPr>
-            <w:tcW w:type="dxa" w:w="3659"/>
+            <w:tcW w:type="dxa" w:w="3944"/>
             <w:tcBorders>
               <w:top w:val="single" w:color="BFBFBF" w:sz="4"/>
               <w:left w:val="single" w:color="BFBFBF" w:sz="4"/>
@@ -10351,7 +10384,7 @@
         </w:tc>
         <w:tc>
           <w:tcPr>
-            <w:tcW w:type="dxa" w:w="3205"/>
+            <w:tcW w:type="dxa" w:w="2722"/>
             <w:tcBorders>
               <w:top w:val="single" w:color="BFBFBF" w:sz="4"/>
               <w:left w:val="single" w:color="BFBFBF" w:sz="4"/>
@@ -10385,7 +10418,7 @@
         </w:trPr>
         <w:tc>
           <w:tcPr>
-            <w:tcW w:type="dxa" w:w="2548"/>
+            <w:tcW w:type="dxa" w:w="2746"/>
             <w:tcBorders>
               <w:top w:val="single" w:color="BFBFBF" w:sz="4"/>
               <w:left w:val="single" w:color="BFBFBF" w:sz="4"/>
@@ -10512,7 +10545,7 @@
         </w:tc>
         <w:tc>
           <w:tcPr>
-            <w:tcW w:type="dxa" w:w="3659"/>
+            <w:tcW w:type="dxa" w:w="3944"/>
             <w:tcBorders>
               <w:top w:val="single" w:color="BFBFBF" w:sz="4"/>
               <w:left w:val="single" w:color="BFBFBF" w:sz="4"/>
@@ -10566,7 +10599,7 @@
         </w:tc>
         <w:tc>
           <w:tcPr>
-            <w:tcW w:type="dxa" w:w="3205"/>
+            <w:tcW w:type="dxa" w:w="2722"/>
             <w:tcBorders>
               <w:top w:val="single" w:color="BFBFBF" w:sz="4"/>
               <w:left w:val="single" w:color="BFBFBF" w:sz="4"/>
@@ -10600,7 +10633,7 @@
         </w:trPr>
         <w:tc>
           <w:tcPr>
-            <w:tcW w:type="dxa" w:w="2548"/>
+            <w:tcW w:type="dxa" w:w="2746"/>
             <w:tcBorders>
               <w:top w:val="single" w:color="BFBFBF" w:sz="4"/>
               <w:left w:val="single" w:color="BFBFBF" w:sz="4"/>
@@ -10647,7 +10680,7 @@
         </w:tc>
         <w:tc>
           <w:tcPr>
-            <w:tcW w:type="dxa" w:w="3659"/>
+            <w:tcW w:type="dxa" w:w="3944"/>
             <w:tcBorders>
               <w:top w:val="single" w:color="BFBFBF" w:sz="4"/>
               <w:left w:val="single" w:color="BFBFBF" w:sz="4"/>
@@ -10676,7 +10709,7 @@
         </w:tc>
         <w:tc>
           <w:tcPr>
-            <w:tcW w:type="dxa" w:w="3205"/>
+            <w:tcW w:type="dxa" w:w="2722"/>
             <w:tcBorders>
               <w:top w:val="single" w:color="BFBFBF" w:sz="4"/>
               <w:left w:val="single" w:color="BFBFBF" w:sz="4"/>
@@ -10710,7 +10743,7 @@
         </w:trPr>
         <w:tc>
           <w:tcPr>
-            <w:tcW w:type="dxa" w:w="2548"/>
+            <w:tcW w:type="dxa" w:w="2746"/>
             <w:tcBorders>
               <w:top w:val="single" w:color="BFBFBF" w:sz="4"/>
               <w:left w:val="single" w:color="BFBFBF" w:sz="4"/>
@@ -10741,59 +10774,59 @@
         </w:tc>
         <w:tc>
           <w:tcPr>
-            <w:tcW w:type="dxa" w:w="3659"/>
-            <w:tcBorders>
-              <w:top w:val="single" w:color="BFBFBF" w:sz="4"/>
-              <w:left w:val="single" w:color="BFBFBF" w:sz="4"/>
-              <w:bottom w:val="single" w:color="BFBFBF" w:sz="4"/>
-              <w:right w:val="single" w:color="BFBFBF" w:sz="4"/>
-            </w:tcBorders>
-            <w:tcMar>
-              <w:top w:type="dxa" w:w="50"/>
-              <w:left w:type="dxa" w:w="90"/>
-              <w:bottom w:type="dxa" w:w="50"/>
-              <w:right w:type="dxa" w:w="90"/>
-            </w:tcMar>
-          </w:tcPr>
-          <w:p>
-            <w:pPr>
-              <w:spacing w:after="0" w:before="0"/>
-            </w:pPr>
-            <w:r>
-              <w:rPr>
-                <w:sz w:val="18"/>
-                <w:szCs w:val="18"/>
-              </w:rPr>
-              <w:t xml:space="preserve">La compra completa, la idempotencia, el pago rechazado, las reglas de negocio, la seguridad, la cancelación y la mensajería, en 13 escenarios con 181 comprobaciones</w:t>
-            </w:r>
-          </w:p>
-        </w:tc>
-        <w:tc>
-          <w:tcPr>
-            <w:tcW w:type="dxa" w:w="3205"/>
-            <w:tcBorders>
-              <w:top w:val="single" w:color="BFBFBF" w:sz="4"/>
-              <w:left w:val="single" w:color="BFBFBF" w:sz="4"/>
-              <w:bottom w:val="single" w:color="BFBFBF" w:sz="4"/>
-              <w:right w:val="single" w:color="BFBFBF" w:sz="4"/>
-            </w:tcBorders>
-            <w:tcMar>
-              <w:top w:type="dxa" w:w="50"/>
-              <w:left w:type="dxa" w:w="90"/>
-              <w:bottom w:type="dxa" w:w="50"/>
-              <w:right w:type="dxa" w:w="90"/>
-            </w:tcMar>
-          </w:tcPr>
-          <w:p>
-            <w:pPr>
-              <w:spacing w:after="0" w:before="0"/>
-            </w:pPr>
-            <w:r>
-              <w:rPr>
-                <w:sz w:val="18"/>
-                <w:szCs w:val="18"/>
-              </w:rPr>
-              <w:t xml:space="preserve">La salida completa de una versión anterior de </w:t>
+            <w:tcW w:type="dxa" w:w="3944"/>
+            <w:tcBorders>
+              <w:top w:val="single" w:color="BFBFBF" w:sz="4"/>
+              <w:left w:val="single" w:color="BFBFBF" w:sz="4"/>
+              <w:bottom w:val="single" w:color="BFBFBF" w:sz="4"/>
+              <w:right w:val="single" w:color="BFBFBF" w:sz="4"/>
+            </w:tcBorders>
+            <w:tcMar>
+              <w:top w:type="dxa" w:w="50"/>
+              <w:left w:type="dxa" w:w="90"/>
+              <w:bottom w:type="dxa" w:w="50"/>
+              <w:right w:type="dxa" w:w="90"/>
+            </w:tcMar>
+          </w:tcPr>
+          <w:p>
+            <w:pPr>
+              <w:spacing w:after="0" w:before="0"/>
+            </w:pPr>
+            <w:r>
+              <w:rPr>
+                <w:sz w:val="18"/>
+                <w:szCs w:val="18"/>
+              </w:rPr>
+              <w:t xml:space="preserve">La compra completa, la idempotencia, el pago rechazado, las reglas de negocio, la seguridad, la cancelación y la mensajería, en 13 escenarios con 177 comprobaciones</w:t>
+            </w:r>
+          </w:p>
+        </w:tc>
+        <w:tc>
+          <w:tcPr>
+            <w:tcW w:type="dxa" w:w="2722"/>
+            <w:tcBorders>
+              <w:top w:val="single" w:color="BFBFBF" w:sz="4"/>
+              <w:left w:val="single" w:color="BFBFBF" w:sz="4"/>
+              <w:bottom w:val="single" w:color="BFBFBF" w:sz="4"/>
+              <w:right w:val="single" w:color="BFBFBF" w:sz="4"/>
+            </w:tcBorders>
+            <w:tcMar>
+              <w:top w:type="dxa" w:w="50"/>
+              <w:left w:type="dxa" w:w="90"/>
+              <w:bottom w:type="dxa" w:w="50"/>
+              <w:right w:type="dxa" w:w="90"/>
+            </w:tcMar>
+          </w:tcPr>
+          <w:p>
+            <w:pPr>
+              <w:spacing w:after="0" w:before="0"/>
+            </w:pPr>
+            <w:r>
+              <w:rPr>
+                <w:sz w:val="18"/>
+                <w:szCs w:val="18"/>
+              </w:rPr>
+              <w:t xml:space="preserve">La salida completa de </w:t>
             </w:r>
             <w:r>
               <w:rPr>
@@ -10809,7 +10842,7 @@
                 <w:sz w:val="18"/>
                 <w:szCs w:val="18"/>
               </w:rPr>
-              <w:t xml:space="preserve">. El escenario 5 de esa salida todavía pasa por la verificación de identidad, que Usuarios ya no pide</w:t>
+              <w:t xml:space="preserve">, corrido contra el servidor armado desde el tag</w:t>
             </w:r>
           </w:p>
         </w:tc>
@@ -10820,7 +10853,7 @@
         </w:trPr>
         <w:tc>
           <w:tcPr>
-            <w:tcW w:type="dxa" w:w="2548"/>
+            <w:tcW w:type="dxa" w:w="2746"/>
             <w:tcBorders>
               <w:top w:val="single" w:color="BFBFBF" w:sz="4"/>
               <w:left w:val="single" w:color="BFBFBF" w:sz="4"/>
@@ -10867,7 +10900,7 @@
         </w:tc>
         <w:tc>
           <w:tcPr>
-            <w:tcW w:type="dxa" w:w="3659"/>
+            <w:tcW w:type="dxa" w:w="3944"/>
             <w:tcBorders>
               <w:top w:val="single" w:color="BFBFBF" w:sz="4"/>
               <w:left w:val="single" w:color="BFBFBF" w:sz="4"/>
@@ -10896,7 +10929,7 @@
         </w:tc>
         <w:tc>
           <w:tcPr>
-            <w:tcW w:type="dxa" w:w="3205"/>
+            <w:tcW w:type="dxa" w:w="2722"/>
             <w:tcBorders>
               <w:top w:val="single" w:color="BFBFBF" w:sz="4"/>
               <w:left w:val="single" w:color="BFBFBF" w:sz="4"/>
@@ -10930,7 +10963,7 @@
         </w:trPr>
         <w:tc>
           <w:tcPr>
-            <w:tcW w:type="dxa" w:w="2548"/>
+            <w:tcW w:type="dxa" w:w="2746"/>
             <w:tcBorders>
               <w:top w:val="single" w:color="BFBFBF" w:sz="4"/>
               <w:left w:val="single" w:color="BFBFBF" w:sz="4"/>
@@ -10961,7 +10994,7 @@
         </w:tc>
         <w:tc>
           <w:tcPr>
-            <w:tcW w:type="dxa" w:w="3659"/>
+            <w:tcW w:type="dxa" w:w="3944"/>
             <w:tcBorders>
               <w:top w:val="single" w:color="BFBFBF" w:sz="4"/>
               <w:left w:val="single" w:color="BFBFBF" w:sz="4"/>
@@ -10990,7 +11023,7 @@
         </w:tc>
         <w:tc>
           <w:tcPr>
-            <w:tcW w:type="dxa" w:w="3205"/>
+            <w:tcW w:type="dxa" w:w="2722"/>
             <w:tcBorders>
               <w:top w:val="single" w:color="BFBFBF" w:sz="4"/>
               <w:left w:val="single" w:color="BFBFBF" w:sz="4"/>
@@ -11024,7 +11057,7 @@
         </w:trPr>
         <w:tc>
           <w:tcPr>
-            <w:tcW w:type="dxa" w:w="2548"/>
+            <w:tcW w:type="dxa" w:w="2746"/>
             <w:tcBorders>
               <w:top w:val="single" w:color="BFBFBF" w:sz="4"/>
               <w:left w:val="single" w:color="BFBFBF" w:sz="4"/>
@@ -11055,7 +11088,7 @@
         </w:tc>
         <w:tc>
           <w:tcPr>
-            <w:tcW w:type="dxa" w:w="3659"/>
+            <w:tcW w:type="dxa" w:w="3944"/>
             <w:tcBorders>
               <w:top w:val="single" w:color="BFBFBF" w:sz="4"/>
               <w:left w:val="single" w:color="BFBFBF" w:sz="4"/>
@@ -11084,7 +11117,7 @@
         </w:tc>
         <w:tc>
           <w:tcPr>
-            <w:tcW w:type="dxa" w:w="3205"/>
+            <w:tcW w:type="dxa" w:w="2722"/>
             <w:tcBorders>
               <w:top w:val="single" w:color="BFBFBF" w:sz="4"/>
               <w:left w:val="single" w:color="BFBFBF" w:sz="4"/>
@@ -11118,7 +11151,7 @@
         </w:trPr>
         <w:tc>
           <w:tcPr>
-            <w:tcW w:type="dxa" w:w="2548"/>
+            <w:tcW w:type="dxa" w:w="2746"/>
             <w:tcBorders>
               <w:top w:val="single" w:color="BFBFBF" w:sz="4"/>
               <w:left w:val="single" w:color="BFBFBF" w:sz="4"/>
@@ -11149,7 +11182,7 @@
         </w:tc>
         <w:tc>
           <w:tcPr>
-            <w:tcW w:type="dxa" w:w="3659"/>
+            <w:tcW w:type="dxa" w:w="3944"/>
             <w:tcBorders>
               <w:top w:val="single" w:color="BFBFBF" w:sz="4"/>
               <w:left w:val="single" w:color="BFBFBF" w:sz="4"/>
@@ -11210,7 +11243,7 @@
         </w:tc>
         <w:tc>
           <w:tcPr>
-            <w:tcW w:type="dxa" w:w="3205"/>
+            <w:tcW w:type="dxa" w:w="2722"/>
             <w:tcBorders>
               <w:top w:val="single" w:color="BFBFBF" w:sz="4"/>
               <w:left w:val="single" w:color="BFBFBF" w:sz="4"/>
@@ -11244,7 +11277,7 @@
         </w:trPr>
         <w:tc>
           <w:tcPr>
-            <w:tcW w:type="dxa" w:w="2548"/>
+            <w:tcW w:type="dxa" w:w="2746"/>
             <w:tcBorders>
               <w:top w:val="single" w:color="BFBFBF" w:sz="4"/>
               <w:left w:val="single" w:color="BFBFBF" w:sz="4"/>
@@ -11275,7 +11308,7 @@
         </w:tc>
         <w:tc>
           <w:tcPr>
-            <w:tcW w:type="dxa" w:w="3659"/>
+            <w:tcW w:type="dxa" w:w="3944"/>
             <w:tcBorders>
               <w:top w:val="single" w:color="BFBFBF" w:sz="4"/>
               <w:left w:val="single" w:color="BFBFBF" w:sz="4"/>
@@ -11304,7 +11337,7 @@
         </w:tc>
         <w:tc>
           <w:tcPr>
-            <w:tcW w:type="dxa" w:w="3205"/>
+            <w:tcW w:type="dxa" w:w="2722"/>
             <w:tcBorders>
               <w:top w:val="single" w:color="BFBFBF" w:sz="4"/>
               <w:left w:val="single" w:color="BFBFBF" w:sz="4"/>
@@ -13436,7 +13469,7 @@
                 <w:szCs w:val="17"/>
                 <w:shd w:fill="F0F0F0" w:color="auto" w:val="clear"/>
               </w:rPr>
-              <w:t xml:space="preserve">V-​3c150ebb</w:t>
+              <w:t xml:space="preserve">V-​e022b63c</w:t>
             </w:r>
           </w:p>
         </w:tc>

</xml_diff>

<commit_message>
docs: saca planes y notas de trabajo y mueve el contrato de mensajería a docs/api
</commit_message>
<xml_diff>
--- a/docs/entrega3/Entrega_Parcial_2_Integracion.docx
+++ b/docs/entrega3/Entrega_Parcial_2_Integracion.docx
@@ -291,7 +291,7 @@
             <w:pPr>
               <w:spacing w:after="0" w:before="0"/>
             </w:pPr>
-            <w:hyperlink w:history="1" r:id="rId6bk6zqsuopypp_rougd3a">
+            <w:hyperlink w:history="1" r:id="rIdpymvu8pevgw-xs_btknsi">
               <w:r>
                 <w:rPr>
                   <w:color w:val="0563C1"/>
@@ -8606,9 +8606,9 @@
         <w:tblLayout w:type="fixed"/>
       </w:tblPr>
       <w:tblGrid>
-        <w:gridCol w:w="1415"/>
-        <w:gridCol w:w="3777"/>
-        <w:gridCol w:w="4220"/>
+        <w:gridCol w:w="1443"/>
+        <w:gridCol w:w="3667"/>
+        <w:gridCol w:w="4302"/>
       </w:tblGrid>
       <w:tr>
         <w:trPr>
@@ -8617,7 +8617,7 @@
         </w:trPr>
         <w:tc>
           <w:tcPr>
-            <w:tcW w:type="dxa" w:w="1415"/>
+            <w:tcW w:type="dxa" w:w="1443"/>
             <w:tcBorders>
               <w:top w:val="single" w:color="BFBFBF" w:sz="4"/>
               <w:left w:val="single" w:color="BFBFBF" w:sz="4"/>
@@ -8649,7 +8649,7 @@
         </w:tc>
         <w:tc>
           <w:tcPr>
-            <w:tcW w:type="dxa" w:w="3777"/>
+            <w:tcW w:type="dxa" w:w="3667"/>
             <w:tcBorders>
               <w:top w:val="single" w:color="BFBFBF" w:sz="4"/>
               <w:left w:val="single" w:color="BFBFBF" w:sz="4"/>
@@ -8681,7 +8681,7 @@
         </w:tc>
         <w:tc>
           <w:tcPr>
-            <w:tcW w:type="dxa" w:w="4220"/>
+            <w:tcW w:type="dxa" w:w="4302"/>
             <w:tcBorders>
               <w:top w:val="single" w:color="BFBFBF" w:sz="4"/>
               <w:left w:val="single" w:color="BFBFBF" w:sz="4"/>
@@ -8718,7 +8718,7 @@
         </w:trPr>
         <w:tc>
           <w:tcPr>
-            <w:tcW w:type="dxa" w:w="1415"/>
+            <w:tcW w:type="dxa" w:w="1443"/>
             <w:tcBorders>
               <w:top w:val="single" w:color="BFBFBF" w:sz="4"/>
               <w:left w:val="single" w:color="BFBFBF" w:sz="4"/>
@@ -8747,7 +8747,7 @@
         </w:tc>
         <w:tc>
           <w:tcPr>
-            <w:tcW w:type="dxa" w:w="3777"/>
+            <w:tcW w:type="dxa" w:w="3667"/>
             <w:tcBorders>
               <w:top w:val="single" w:color="BFBFBF" w:sz="4"/>
               <w:left w:val="single" w:color="BFBFBF" w:sz="4"/>
@@ -8776,7 +8776,7 @@
         </w:tc>
         <w:tc>
           <w:tcPr>
-            <w:tcW w:type="dxa" w:w="4220"/>
+            <w:tcW w:type="dxa" w:w="4302"/>
             <w:tcBorders>
               <w:top w:val="single" w:color="BFBFBF" w:sz="4"/>
               <w:left w:val="single" w:color="BFBFBF" w:sz="4"/>
@@ -8851,7 +8851,7 @@
         </w:trPr>
         <w:tc>
           <w:tcPr>
-            <w:tcW w:type="dxa" w:w="1415"/>
+            <w:tcW w:type="dxa" w:w="1443"/>
             <w:tcBorders>
               <w:top w:val="single" w:color="BFBFBF" w:sz="4"/>
               <w:left w:val="single" w:color="BFBFBF" w:sz="4"/>
@@ -8880,7 +8880,7 @@
         </w:tc>
         <w:tc>
           <w:tcPr>
-            <w:tcW w:type="dxa" w:w="3777"/>
+            <w:tcW w:type="dxa" w:w="3667"/>
             <w:tcBorders>
               <w:top w:val="single" w:color="BFBFBF" w:sz="4"/>
               <w:left w:val="single" w:color="BFBFBF" w:sz="4"/>
@@ -8909,7 +8909,7 @@
         </w:tc>
         <w:tc>
           <w:tcPr>
-            <w:tcW w:type="dxa" w:w="4220"/>
+            <w:tcW w:type="dxa" w:w="4302"/>
             <w:tcBorders>
               <w:top w:val="single" w:color="BFBFBF" w:sz="4"/>
               <w:left w:val="single" w:color="BFBFBF" w:sz="4"/>
@@ -8977,7 +8977,7 @@
         </w:trPr>
         <w:tc>
           <w:tcPr>
-            <w:tcW w:type="dxa" w:w="1415"/>
+            <w:tcW w:type="dxa" w:w="1443"/>
             <w:tcBorders>
               <w:top w:val="single" w:color="BFBFBF" w:sz="4"/>
               <w:left w:val="single" w:color="BFBFBF" w:sz="4"/>
@@ -9006,7 +9006,7 @@
         </w:tc>
         <w:tc>
           <w:tcPr>
-            <w:tcW w:type="dxa" w:w="3777"/>
+            <w:tcW w:type="dxa" w:w="3667"/>
             <w:tcBorders>
               <w:top w:val="single" w:color="BFBFBF" w:sz="4"/>
               <w:left w:val="single" w:color="BFBFBF" w:sz="4"/>
@@ -9067,7 +9067,7 @@
         </w:tc>
         <w:tc>
           <w:tcPr>
-            <w:tcW w:type="dxa" w:w="4220"/>
+            <w:tcW w:type="dxa" w:w="4302"/>
             <w:tcBorders>
               <w:top w:val="single" w:color="BFBFBF" w:sz="4"/>
               <w:left w:val="single" w:color="BFBFBF" w:sz="4"/>
@@ -9174,7 +9174,7 @@
         </w:trPr>
         <w:tc>
           <w:tcPr>
-            <w:tcW w:type="dxa" w:w="1415"/>
+            <w:tcW w:type="dxa" w:w="1443"/>
             <w:tcBorders>
               <w:top w:val="single" w:color="BFBFBF" w:sz="4"/>
               <w:left w:val="single" w:color="BFBFBF" w:sz="4"/>
@@ -9203,7 +9203,7 @@
         </w:tc>
         <w:tc>
           <w:tcPr>
-            <w:tcW w:type="dxa" w:w="3777"/>
+            <w:tcW w:type="dxa" w:w="3667"/>
             <w:tcBorders>
               <w:top w:val="single" w:color="BFBFBF" w:sz="4"/>
               <w:left w:val="single" w:color="BFBFBF" w:sz="4"/>
@@ -9322,29 +9322,13 @@
                 <w:sz w:val="18"/>
                 <w:szCs w:val="18"/>
               </w:rPr>
-              <w:t xml:space="preserve">, filtrando por la cola de origen; es seguro porque la emisión es idempotente (procedimiento en </w:t>
-            </w:r>
-            <w:r>
-              <w:rPr>
-                <w:rFonts w:ascii="Consolas" w:cs="Consolas" w:eastAsia="Consolas" w:hAnsi="Consolas"/>
-                <w:sz w:val="17"/>
-                <w:szCs w:val="17"/>
-                <w:shd w:fill="F0F0F0" w:color="auto" w:val="clear"/>
-              </w:rPr>
-              <w:t xml:space="preserve">docs/​notas/​mensajeria.​md</w:t>
-            </w:r>
-            <w:r>
-              <w:rPr>
-                <w:sz w:val="18"/>
-                <w:szCs w:val="18"/>
-              </w:rPr>
-              <w:t xml:space="preserve">)</w:t>
-            </w:r>
-          </w:p>
-        </w:tc>
-        <w:tc>
-          <w:tcPr>
-            <w:tcW w:type="dxa" w:w="4220"/>
+              <w:t xml:space="preserve">, filtrando por la cola de origen; es seguro porque la emisión es idempotente</w:t>
+            </w:r>
+          </w:p>
+        </w:tc>
+        <w:tc>
+          <w:tcPr>
+            <w:tcW w:type="dxa" w:w="4302"/>
             <w:tcBorders>
               <w:top w:val="single" w:color="BFBFBF" w:sz="4"/>
               <w:left w:val="single" w:color="BFBFBF" w:sz="4"/>
@@ -9451,7 +9435,7 @@
         </w:trPr>
         <w:tc>
           <w:tcPr>
-            <w:tcW w:type="dxa" w:w="1415"/>
+            <w:tcW w:type="dxa" w:w="1443"/>
             <w:tcBorders>
               <w:top w:val="single" w:color="BFBFBF" w:sz="4"/>
               <w:left w:val="single" w:color="BFBFBF" w:sz="4"/>
@@ -9489,7 +9473,7 @@
         </w:tc>
         <w:tc>
           <w:tcPr>
-            <w:tcW w:type="dxa" w:w="3777"/>
+            <w:tcW w:type="dxa" w:w="3667"/>
             <w:tcBorders>
               <w:top w:val="single" w:color="BFBFBF" w:sz="4"/>
               <w:left w:val="single" w:color="BFBFBF" w:sz="4"/>
@@ -9534,7 +9518,7 @@
         </w:tc>
         <w:tc>
           <w:tcPr>
-            <w:tcW w:type="dxa" w:w="4220"/>
+            <w:tcW w:type="dxa" w:w="4302"/>
             <w:tcBorders>
               <w:top w:val="single" w:color="BFBFBF" w:sz="4"/>
               <w:left w:val="single" w:color="BFBFBF" w:sz="4"/>
@@ -9568,7 +9552,7 @@
         </w:trPr>
         <w:tc>
           <w:tcPr>
-            <w:tcW w:type="dxa" w:w="1415"/>
+            <w:tcW w:type="dxa" w:w="1443"/>
             <w:tcBorders>
               <w:top w:val="single" w:color="BFBFBF" w:sz="4"/>
               <w:left w:val="single" w:color="BFBFBF" w:sz="4"/>
@@ -9597,7 +9581,7 @@
         </w:tc>
         <w:tc>
           <w:tcPr>
-            <w:tcW w:type="dxa" w:w="3777"/>
+            <w:tcW w:type="dxa" w:w="3667"/>
             <w:tcBorders>
               <w:top w:val="single" w:color="BFBFBF" w:sz="4"/>
               <w:left w:val="single" w:color="BFBFBF" w:sz="4"/>
@@ -9635,7 +9619,7 @@
         </w:tc>
         <w:tc>
           <w:tcPr>
-            <w:tcW w:type="dxa" w:w="4220"/>
+            <w:tcW w:type="dxa" w:w="4302"/>
             <w:tcBorders>
               <w:top w:val="single" w:color="BFBFBF" w:sz="4"/>
               <w:left w:val="single" w:color="BFBFBF" w:sz="4"/>
@@ -9671,7 +9655,7 @@
         </w:trPr>
         <w:tc>
           <w:tcPr>
-            <w:tcW w:type="dxa" w:w="1415"/>
+            <w:tcW w:type="dxa" w:w="1443"/>
             <w:tcBorders>
               <w:top w:val="single" w:color="BFBFBF" w:sz="4"/>
               <w:left w:val="single" w:color="BFBFBF" w:sz="4"/>
@@ -9700,7 +9684,7 @@
         </w:tc>
         <w:tc>
           <w:tcPr>
-            <w:tcW w:type="dxa" w:w="3777"/>
+            <w:tcW w:type="dxa" w:w="3667"/>
             <w:tcBorders>
               <w:top w:val="single" w:color="BFBFBF" w:sz="4"/>
               <w:left w:val="single" w:color="BFBFBF" w:sz="4"/>
@@ -9729,7 +9713,7 @@
         </w:tc>
         <w:tc>
           <w:tcPr>
-            <w:tcW w:type="dxa" w:w="4220"/>
+            <w:tcW w:type="dxa" w:w="4302"/>
             <w:tcBorders>
               <w:top w:val="single" w:color="BFBFBF" w:sz="4"/>
               <w:left w:val="single" w:color="BFBFBF" w:sz="4"/>
@@ -9868,7 +9852,7 @@
         </w:trPr>
         <w:tc>
           <w:tcPr>
-            <w:tcW w:type="dxa" w:w="1415"/>
+            <w:tcW w:type="dxa" w:w="1443"/>
             <w:tcBorders>
               <w:top w:val="single" w:color="BFBFBF" w:sz="4"/>
               <w:left w:val="single" w:color="BFBFBF" w:sz="4"/>
@@ -9897,7 +9881,7 @@
         </w:tc>
         <w:tc>
           <w:tcPr>
-            <w:tcW w:type="dxa" w:w="3777"/>
+            <w:tcW w:type="dxa" w:w="3667"/>
             <w:tcBorders>
               <w:top w:val="single" w:color="BFBFBF" w:sz="4"/>
               <w:left w:val="single" w:color="BFBFBF" w:sz="4"/>
@@ -9958,7 +9942,7 @@
         </w:tc>
         <w:tc>
           <w:tcPr>
-            <w:tcW w:type="dxa" w:w="4220"/>
+            <w:tcW w:type="dxa" w:w="4302"/>
             <w:tcBorders>
               <w:top w:val="single" w:color="BFBFBF" w:sz="4"/>
               <w:left w:val="single" w:color="BFBFBF" w:sz="4"/>
@@ -14931,7 +14915,7 @@
         <w:spacing w:after="120" w:before="0"/>
       </w:pPr>
       <w:r>
-        <w:t xml:space="preserve">Dos límites conocidos de la compra, que se cierran con la tarea C3 del plan (conciliación y transacciones), prevista para presentarse el 13/11:</w:t>
+        <w:t xml:space="preserve">Dos límites conocidos de la compra, que se cierran con el trabajo de conciliación de pagos y transacciones, previsto para presentarse el 13/11:</w:t>
       </w:r>
     </w:p>
     <w:p>
@@ -15071,19 +15055,7 @@
         <w:t xml:space="preserve">UPDATE</w:t>
       </w:r>
       <w:r>
-        <w:t xml:space="preserve"> condicional y se devuelve el cupo a Eventos con el token de servicio. Si hay un pago aprobado, la venta no se toca: confirmarla exige crear las entradas y publicar el mensaje, que no se hace a mano. El procedimiento, con las consultas, está en </w:t>
-      </w:r>
-      <w:r>
-        <w:rPr>
-          <w:rFonts w:ascii="Consolas" w:cs="Consolas" w:eastAsia="Consolas" w:hAnsi="Consolas"/>
-          <w:sz w:val="20"/>
-          <w:szCs w:val="20"/>
-          <w:shd w:fill="F0F0F0" w:color="auto" w:val="clear"/>
-        </w:rPr>
-        <w:t xml:space="preserve">docs/notas/ventas-core.md</w:t>
-      </w:r>
-      <w:r>
-        <w:t xml:space="preserve">. En desarrollo la base es H2 en memoria dentro de WildFly y no acepta conexiones de afuera, así que ahí esas sentencias no se pueden correr. C3 lo reemplaza por una conciliación con Pagos que confirma la venta o libera su cupo.</w:t>
+        <w:t xml:space="preserve"> condicional y se devuelve el cupo a Eventos con el token de servicio. Si hay un pago aprobado, la venta no se toca: confirmarla exige crear las entradas y publicar el mensaje, que no se hace a mano. En desarrollo la base es H2 en memoria dentro de WildFly y no acepta conexiones de afuera, así que ahí esas sentencias no se pueden correr. Ese trabajo lo reemplaza por una conciliación con Pagos que confirma la venta o libera su cupo.</w:t>
       </w:r>
     </w:p>
     <w:p>

</xml_diff>